<commit_message>
upd: verbetervoorstel voor sprint 4
</commit_message>
<xml_diff>
--- a/Templates/ingevulde documentatie/J2P3_CrashNDash_Verbetervoorstel01.docx
+++ b/Templates/ingevulde documentatie/J2P3_CrashNDash_Verbetervoorstel01.docx
@@ -355,7 +355,7 @@
       <w:sdtContent>
         <w:p>
           <w:pPr>
-            <w:pStyle w:val="TOCHeading"/>
+            <w:pStyle w:val="Kopvaninhoudsopgave"/>
           </w:pPr>
           <w:r>
             <w:t>Inhoud</w:t>
@@ -363,7 +363,7 @@
         </w:p>
         <w:p>
           <w:pPr>
-            <w:pStyle w:val="TOC1"/>
+            <w:pStyle w:val="Inhopg1"/>
             <w:rPr>
               <w:rFonts w:eastAsiaTheme="minorEastAsia"/>
               <w:noProof/>
@@ -443,7 +443,7 @@
         </w:p>
         <w:p>
           <w:pPr>
-            <w:pStyle w:val="TOC1"/>
+            <w:pStyle w:val="Inhopg1"/>
             <w:rPr>
               <w:rFonts w:eastAsiaTheme="minorEastAsia"/>
               <w:noProof/>
@@ -514,7 +514,7 @@
         </w:p>
         <w:p>
           <w:pPr>
-            <w:pStyle w:val="TOC2"/>
+            <w:pStyle w:val="Inhopg2"/>
             <w:tabs>
               <w:tab w:val="right" w:leader="dot" w:pos="9062"/>
             </w:tabs>
@@ -588,7 +588,7 @@
         </w:p>
         <w:p>
           <w:pPr>
-            <w:pStyle w:val="TOC2"/>
+            <w:pStyle w:val="Inhopg2"/>
             <w:tabs>
               <w:tab w:val="right" w:leader="dot" w:pos="9062"/>
             </w:tabs>
@@ -662,7 +662,7 @@
         </w:p>
         <w:p>
           <w:pPr>
-            <w:pStyle w:val="TOC2"/>
+            <w:pStyle w:val="Inhopg2"/>
             <w:tabs>
               <w:tab w:val="right" w:leader="dot" w:pos="9062"/>
             </w:tabs>
@@ -736,7 +736,7 @@
         </w:p>
         <w:p>
           <w:pPr>
-            <w:pStyle w:val="TOC2"/>
+            <w:pStyle w:val="Inhopg2"/>
             <w:tabs>
               <w:tab w:val="right" w:leader="dot" w:pos="9062"/>
             </w:tabs>
@@ -810,7 +810,7 @@
         </w:p>
         <w:p>
           <w:pPr>
-            <w:pStyle w:val="TOC2"/>
+            <w:pStyle w:val="Inhopg2"/>
             <w:tabs>
               <w:tab w:val="right" w:leader="dot" w:pos="9062"/>
             </w:tabs>
@@ -884,7 +884,7 @@
         </w:p>
         <w:p>
           <w:pPr>
-            <w:pStyle w:val="TOC2"/>
+            <w:pStyle w:val="Inhopg2"/>
             <w:tabs>
               <w:tab w:val="right" w:leader="dot" w:pos="9062"/>
             </w:tabs>
@@ -958,7 +958,7 @@
         </w:p>
         <w:p>
           <w:pPr>
-            <w:pStyle w:val="TOC1"/>
+            <w:pStyle w:val="Inhopg1"/>
             <w:rPr>
               <w:rFonts w:eastAsiaTheme="minorEastAsia"/>
               <w:noProof/>
@@ -1029,7 +1029,7 @@
         </w:p>
         <w:p>
           <w:pPr>
-            <w:pStyle w:val="TOC2"/>
+            <w:pStyle w:val="Inhopg2"/>
             <w:tabs>
               <w:tab w:val="right" w:leader="dot" w:pos="9062"/>
             </w:tabs>
@@ -1103,7 +1103,7 @@
         </w:p>
         <w:p>
           <w:pPr>
-            <w:pStyle w:val="TOC2"/>
+            <w:pStyle w:val="Inhopg2"/>
             <w:tabs>
               <w:tab w:val="right" w:leader="dot" w:pos="9062"/>
             </w:tabs>
@@ -1177,7 +1177,7 @@
         </w:p>
         <w:p>
           <w:pPr>
-            <w:pStyle w:val="TOC2"/>
+            <w:pStyle w:val="Inhopg2"/>
             <w:tabs>
               <w:tab w:val="right" w:leader="dot" w:pos="9062"/>
             </w:tabs>
@@ -1251,7 +1251,7 @@
         </w:p>
         <w:p>
           <w:pPr>
-            <w:pStyle w:val="TOC2"/>
+            <w:pStyle w:val="Inhopg2"/>
             <w:tabs>
               <w:tab w:val="right" w:leader="dot" w:pos="9062"/>
             </w:tabs>
@@ -1325,7 +1325,7 @@
         </w:p>
         <w:p>
           <w:pPr>
-            <w:pStyle w:val="TOC2"/>
+            <w:pStyle w:val="Inhopg2"/>
             <w:tabs>
               <w:tab w:val="right" w:leader="dot" w:pos="9062"/>
             </w:tabs>
@@ -1399,7 +1399,7 @@
         </w:p>
         <w:p>
           <w:pPr>
-            <w:pStyle w:val="TOC2"/>
+            <w:pStyle w:val="Inhopg2"/>
             <w:tabs>
               <w:tab w:val="right" w:leader="dot" w:pos="9062"/>
             </w:tabs>
@@ -1473,7 +1473,7 @@
         </w:p>
         <w:p>
           <w:pPr>
-            <w:pStyle w:val="TOC1"/>
+            <w:pStyle w:val="Inhopg1"/>
             <w:rPr>
               <w:rFonts w:eastAsiaTheme="minorEastAsia"/>
               <w:noProof/>
@@ -1544,7 +1544,7 @@
         </w:p>
         <w:p>
           <w:pPr>
-            <w:pStyle w:val="TOC2"/>
+            <w:pStyle w:val="Inhopg2"/>
             <w:tabs>
               <w:tab w:val="right" w:leader="dot" w:pos="9062"/>
             </w:tabs>
@@ -1618,7 +1618,7 @@
         </w:p>
         <w:p>
           <w:pPr>
-            <w:pStyle w:val="TOC2"/>
+            <w:pStyle w:val="Inhopg2"/>
             <w:tabs>
               <w:tab w:val="right" w:leader="dot" w:pos="9062"/>
             </w:tabs>
@@ -1692,7 +1692,7 @@
         </w:p>
         <w:p>
           <w:pPr>
-            <w:pStyle w:val="TOC2"/>
+            <w:pStyle w:val="Inhopg2"/>
             <w:tabs>
               <w:tab w:val="right" w:leader="dot" w:pos="9062"/>
             </w:tabs>
@@ -1766,7 +1766,7 @@
         </w:p>
         <w:p>
           <w:pPr>
-            <w:pStyle w:val="TOC2"/>
+            <w:pStyle w:val="Inhopg2"/>
             <w:tabs>
               <w:tab w:val="right" w:leader="dot" w:pos="9062"/>
             </w:tabs>
@@ -1840,7 +1840,7 @@
         </w:p>
         <w:p>
           <w:pPr>
-            <w:pStyle w:val="TOC2"/>
+            <w:pStyle w:val="Inhopg2"/>
             <w:tabs>
               <w:tab w:val="right" w:leader="dot" w:pos="9062"/>
             </w:tabs>
@@ -1914,7 +1914,7 @@
         </w:p>
         <w:p>
           <w:pPr>
-            <w:pStyle w:val="TOC2"/>
+            <w:pStyle w:val="Inhopg2"/>
             <w:tabs>
               <w:tab w:val="right" w:leader="dot" w:pos="9062"/>
             </w:tabs>
@@ -1988,7 +1988,7 @@
         </w:p>
         <w:p>
           <w:pPr>
-            <w:pStyle w:val="TOC1"/>
+            <w:pStyle w:val="Inhopg1"/>
             <w:rPr>
               <w:rFonts w:eastAsiaTheme="minorEastAsia"/>
               <w:noProof/>
@@ -2059,7 +2059,7 @@
         </w:p>
         <w:p>
           <w:pPr>
-            <w:pStyle w:val="TOC2"/>
+            <w:pStyle w:val="Inhopg2"/>
             <w:tabs>
               <w:tab w:val="right" w:leader="dot" w:pos="9062"/>
             </w:tabs>
@@ -2133,7 +2133,7 @@
         </w:p>
         <w:p>
           <w:pPr>
-            <w:pStyle w:val="TOC2"/>
+            <w:pStyle w:val="Inhopg2"/>
             <w:tabs>
               <w:tab w:val="right" w:leader="dot" w:pos="9062"/>
             </w:tabs>
@@ -2207,7 +2207,7 @@
         </w:p>
         <w:p>
           <w:pPr>
-            <w:pStyle w:val="TOC2"/>
+            <w:pStyle w:val="Inhopg2"/>
             <w:tabs>
               <w:tab w:val="right" w:leader="dot" w:pos="9062"/>
             </w:tabs>
@@ -2281,7 +2281,7 @@
         </w:p>
         <w:p>
           <w:pPr>
-            <w:pStyle w:val="TOC2"/>
+            <w:pStyle w:val="Inhopg2"/>
             <w:tabs>
               <w:tab w:val="right" w:leader="dot" w:pos="9062"/>
             </w:tabs>
@@ -2355,7 +2355,7 @@
         </w:p>
         <w:p>
           <w:pPr>
-            <w:pStyle w:val="TOC2"/>
+            <w:pStyle w:val="Inhopg2"/>
             <w:tabs>
               <w:tab w:val="right" w:leader="dot" w:pos="9062"/>
             </w:tabs>
@@ -2429,7 +2429,7 @@
         </w:p>
         <w:p>
           <w:pPr>
-            <w:pStyle w:val="TOC2"/>
+            <w:pStyle w:val="Inhopg2"/>
             <w:tabs>
               <w:tab w:val="right" w:leader="dot" w:pos="9062"/>
             </w:tabs>
@@ -2527,7 +2527,7 @@
     </w:p>
     <w:p>
       <w:pPr>
-        <w:pStyle w:val="Heading1"/>
+        <w:pStyle w:val="Kop1"/>
         <w:jc w:val="left"/>
       </w:pPr>
       <w:bookmarkStart w:id="0" w:name="_Toc183594785"/>
@@ -2685,7 +2685,7 @@
     </w:p>
     <w:p>
       <w:pPr>
-        <w:pStyle w:val="ListParagraph"/>
+        <w:pStyle w:val="Lijstalinea"/>
         <w:numPr>
           <w:ilvl w:val="0"/>
           <w:numId w:val="29"/>
@@ -2713,7 +2713,7 @@
     </w:p>
     <w:p>
       <w:pPr>
-        <w:pStyle w:val="ListParagraph"/>
+        <w:pStyle w:val="Lijstalinea"/>
         <w:numPr>
           <w:ilvl w:val="0"/>
           <w:numId w:val="29"/>
@@ -2748,7 +2748,7 @@
     </w:p>
     <w:p>
       <w:pPr>
-        <w:pStyle w:val="ListParagraph"/>
+        <w:pStyle w:val="Lijstalinea"/>
         <w:numPr>
           <w:ilvl w:val="0"/>
           <w:numId w:val="29"/>
@@ -2776,7 +2776,7 @@
     </w:p>
     <w:p>
       <w:pPr>
-        <w:pStyle w:val="ListParagraph"/>
+        <w:pStyle w:val="Lijstalinea"/>
         <w:numPr>
           <w:ilvl w:val="0"/>
           <w:numId w:val="29"/>
@@ -2804,7 +2804,7 @@
     </w:p>
     <w:p>
       <w:pPr>
-        <w:pStyle w:val="ListParagraph"/>
+        <w:pStyle w:val="Lijstalinea"/>
         <w:numPr>
           <w:ilvl w:val="0"/>
           <w:numId w:val="29"/>
@@ -2839,7 +2839,7 @@
     </w:p>
     <w:p>
       <w:pPr>
-        <w:pStyle w:val="ListParagraph"/>
+        <w:pStyle w:val="Lijstalinea"/>
         <w:numPr>
           <w:ilvl w:val="0"/>
           <w:numId w:val="29"/>
@@ -2867,7 +2867,7 @@
     </w:p>
     <w:p>
       <w:pPr>
-        <w:pStyle w:val="ListParagraph"/>
+        <w:pStyle w:val="Lijstalinea"/>
         <w:numPr>
           <w:ilvl w:val="1"/>
           <w:numId w:val="29"/>
@@ -2895,7 +2895,7 @@
     </w:p>
     <w:p>
       <w:pPr>
-        <w:pStyle w:val="ListParagraph"/>
+        <w:pStyle w:val="Lijstalinea"/>
         <w:numPr>
           <w:ilvl w:val="1"/>
           <w:numId w:val="29"/>
@@ -2944,7 +2944,7 @@
     </w:p>
     <w:p>
       <w:pPr>
-        <w:pStyle w:val="ListParagraph"/>
+        <w:pStyle w:val="Lijstalinea"/>
         <w:numPr>
           <w:ilvl w:val="1"/>
           <w:numId w:val="29"/>
@@ -3005,7 +3005,7 @@
     </w:p>
     <w:p>
       <w:pPr>
-        <w:pStyle w:val="Heading1"/>
+        <w:pStyle w:val="Kop1"/>
         <w:jc w:val="left"/>
       </w:pPr>
       <w:bookmarkStart w:id="1" w:name="_Toc183594786"/>
@@ -3017,7 +3017,7 @@
     </w:p>
     <w:p>
       <w:pPr>
-        <w:pStyle w:val="Heading2"/>
+        <w:pStyle w:val="Kop2"/>
         <w:rPr>
           <w:i/>
           <w:iCs/>
@@ -3059,7 +3059,7 @@
     </w:p>
     <w:p>
       <w:pPr>
-        <w:pStyle w:val="Heading2"/>
+        <w:pStyle w:val="Kop2"/>
       </w:pPr>
       <w:bookmarkStart w:id="3" w:name="_Toc183594788"/>
       <w:r>
@@ -3083,7 +3083,7 @@
     </w:p>
     <w:p>
       <w:pPr>
-        <w:pStyle w:val="Heading2"/>
+        <w:pStyle w:val="Kop2"/>
       </w:pPr>
       <w:bookmarkStart w:id="4" w:name="_Toc183594789"/>
       <w:r>
@@ -3107,7 +3107,7 @@
     </w:p>
     <w:p>
       <w:pPr>
-        <w:pStyle w:val="Heading2"/>
+        <w:pStyle w:val="Kop2"/>
       </w:pPr>
       <w:bookmarkStart w:id="5" w:name="_Toc183594790"/>
       <w:r>
@@ -3131,7 +3131,7 @@
     </w:p>
     <w:p>
       <w:pPr>
-        <w:pStyle w:val="Heading2"/>
+        <w:pStyle w:val="Kop2"/>
       </w:pPr>
       <w:bookmarkStart w:id="6" w:name="_Toc183594791"/>
       <w:r>
@@ -3156,7 +3156,7 @@
     <w:p/>
     <w:p>
       <w:pPr>
-        <w:pStyle w:val="Heading2"/>
+        <w:pStyle w:val="Kop2"/>
       </w:pPr>
       <w:bookmarkStart w:id="7" w:name="_Toc183594792"/>
       <w:r>
@@ -3605,7 +3605,7 @@
           </w:tcPr>
           <w:p>
             <w:pPr>
-              <w:pStyle w:val="ListParagraph"/>
+              <w:pStyle w:val="Lijstalinea"/>
               <w:numPr>
                 <w:ilvl w:val="0"/>
                 <w:numId w:val="31"/>
@@ -3626,7 +3626,7 @@
           </w:p>
           <w:p>
             <w:pPr>
-              <w:pStyle w:val="ListParagraph"/>
+              <w:pStyle w:val="Lijstalinea"/>
               <w:numPr>
                 <w:ilvl w:val="0"/>
                 <w:numId w:val="31"/>
@@ -3647,7 +3647,7 @@
           </w:p>
           <w:p>
             <w:pPr>
-              <w:pStyle w:val="ListParagraph"/>
+              <w:pStyle w:val="Lijstalinea"/>
               <w:numPr>
                 <w:ilvl w:val="0"/>
                 <w:numId w:val="31"/>
@@ -3668,7 +3668,7 @@
           </w:p>
           <w:p>
             <w:pPr>
-              <w:pStyle w:val="ListParagraph"/>
+              <w:pStyle w:val="Lijstalinea"/>
               <w:numPr>
                 <w:ilvl w:val="0"/>
                 <w:numId w:val="31"/>
@@ -4127,7 +4127,7 @@
           </w:tcPr>
           <w:p>
             <w:pPr>
-              <w:pStyle w:val="ListParagraph"/>
+              <w:pStyle w:val="Lijstalinea"/>
               <w:numPr>
                 <w:ilvl w:val="0"/>
                 <w:numId w:val="31"/>
@@ -4148,7 +4148,7 @@
           </w:p>
           <w:p>
             <w:pPr>
-              <w:pStyle w:val="ListParagraph"/>
+              <w:pStyle w:val="Lijstalinea"/>
               <w:numPr>
                 <w:ilvl w:val="0"/>
                 <w:numId w:val="31"/>
@@ -4169,7 +4169,7 @@
           </w:p>
           <w:p>
             <w:pPr>
-              <w:pStyle w:val="ListParagraph"/>
+              <w:pStyle w:val="Lijstalinea"/>
               <w:numPr>
                 <w:ilvl w:val="0"/>
                 <w:numId w:val="31"/>
@@ -4190,7 +4190,7 @@
           </w:p>
           <w:p>
             <w:pPr>
-              <w:pStyle w:val="ListParagraph"/>
+              <w:pStyle w:val="Lijstalinea"/>
               <w:numPr>
                 <w:ilvl w:val="0"/>
                 <w:numId w:val="31"/>
@@ -4220,7 +4220,7 @@
     </w:p>
     <w:p>
       <w:pPr>
-        <w:pStyle w:val="Heading1"/>
+        <w:pStyle w:val="Kop1"/>
         <w:jc w:val="left"/>
       </w:pPr>
       <w:bookmarkStart w:id="8" w:name="_Toc183594793"/>
@@ -4232,7 +4232,7 @@
     </w:p>
     <w:p>
       <w:pPr>
-        <w:pStyle w:val="Heading2"/>
+        <w:pStyle w:val="Kop2"/>
         <w:rPr>
           <w:i/>
           <w:iCs/>
@@ -4271,7 +4271,7 @@
     </w:p>
     <w:p>
       <w:pPr>
-        <w:pStyle w:val="Heading2"/>
+        <w:pStyle w:val="Kop2"/>
       </w:pPr>
       <w:bookmarkStart w:id="10" w:name="_Toc183594795"/>
       <w:r>
@@ -4369,7 +4369,7 @@
     </w:p>
     <w:p>
       <w:pPr>
-        <w:pStyle w:val="Heading2"/>
+        <w:pStyle w:val="Kop2"/>
       </w:pPr>
       <w:bookmarkStart w:id="11" w:name="_Toc183594796"/>
       <w:r>
@@ -4398,7 +4398,7 @@
     </w:p>
     <w:p>
       <w:pPr>
-        <w:pStyle w:val="Heading2"/>
+        <w:pStyle w:val="Kop2"/>
       </w:pPr>
       <w:bookmarkStart w:id="12" w:name="_Toc183594797"/>
       <w:r>
@@ -4416,7 +4416,7 @@
     </w:p>
     <w:p>
       <w:pPr>
-        <w:pStyle w:val="ListParagraph"/>
+        <w:pStyle w:val="Lijstalinea"/>
         <w:rPr>
           <w:rFonts w:cstheme="minorHAnsi"/>
         </w:rPr>
@@ -4474,7 +4474,7 @@
     </w:p>
     <w:p>
       <w:pPr>
-        <w:pStyle w:val="NoSpacing"/>
+        <w:pStyle w:val="Geenafstand"/>
         <w:spacing w:before="120" w:after="120"/>
         <w:ind w:firstLine="708"/>
         <w:rPr>
@@ -4501,7 +4501,7 @@
     </w:p>
     <w:p>
       <w:pPr>
-        <w:pStyle w:val="NoSpacing"/>
+        <w:pStyle w:val="Geenafstand"/>
         <w:spacing w:before="120" w:after="120"/>
         <w:ind w:firstLine="708"/>
         <w:rPr>
@@ -4529,7 +4529,7 @@
     </w:p>
     <w:p>
       <w:pPr>
-        <w:pStyle w:val="Heading2"/>
+        <w:pStyle w:val="Kop2"/>
       </w:pPr>
       <w:bookmarkStart w:id="13" w:name="_Toc183594798"/>
       <w:r>
@@ -5075,7 +5075,7 @@
           </w:tcPr>
           <w:p>
             <w:pPr>
-              <w:pStyle w:val="ListParagraph"/>
+              <w:pStyle w:val="Lijstalinea"/>
               <w:numPr>
                 <w:ilvl w:val="0"/>
                 <w:numId w:val="31"/>
@@ -5096,7 +5096,7 @@
           </w:p>
           <w:p>
             <w:pPr>
-              <w:pStyle w:val="ListParagraph"/>
+              <w:pStyle w:val="Lijstalinea"/>
               <w:spacing w:before="240" w:line="240" w:lineRule="auto"/>
               <w:rPr>
                 <w:rFonts w:ascii="Calibri" w:eastAsia="Times New Roman" w:hAnsi="Calibri" w:cs="Calibri"/>
@@ -5557,7 +5557,7 @@
           </w:tcPr>
           <w:p>
             <w:pPr>
-              <w:pStyle w:val="ListParagraph"/>
+              <w:pStyle w:val="Lijstalinea"/>
               <w:numPr>
                 <w:ilvl w:val="0"/>
                 <w:numId w:val="31"/>
@@ -5578,7 +5578,7 @@
           </w:p>
           <w:p>
             <w:pPr>
-              <w:pStyle w:val="ListParagraph"/>
+              <w:pStyle w:val="Lijstalinea"/>
               <w:numPr>
                 <w:ilvl w:val="0"/>
                 <w:numId w:val="31"/>
@@ -5599,7 +5599,7 @@
           </w:p>
           <w:p>
             <w:pPr>
-              <w:pStyle w:val="ListParagraph"/>
+              <w:pStyle w:val="Lijstalinea"/>
               <w:numPr>
                 <w:ilvl w:val="0"/>
                 <w:numId w:val="31"/>
@@ -5620,7 +5620,7 @@
           </w:p>
           <w:p>
             <w:pPr>
-              <w:pStyle w:val="ListParagraph"/>
+              <w:pStyle w:val="Lijstalinea"/>
               <w:numPr>
                 <w:ilvl w:val="0"/>
                 <w:numId w:val="31"/>
@@ -5641,7 +5641,7 @@
           </w:p>
           <w:p>
             <w:pPr>
-              <w:pStyle w:val="ListParagraph"/>
+              <w:pStyle w:val="Lijstalinea"/>
               <w:numPr>
                 <w:ilvl w:val="0"/>
                 <w:numId w:val="31"/>
@@ -6167,7 +6167,7 @@
           </w:tcPr>
           <w:p>
             <w:pPr>
-              <w:pStyle w:val="ListParagraph"/>
+              <w:pStyle w:val="Lijstalinea"/>
               <w:numPr>
                 <w:ilvl w:val="0"/>
                 <w:numId w:val="31"/>
@@ -6188,7 +6188,7 @@
           </w:p>
           <w:p>
             <w:pPr>
-              <w:pStyle w:val="ListParagraph"/>
+              <w:pStyle w:val="Lijstalinea"/>
               <w:numPr>
                 <w:ilvl w:val="0"/>
                 <w:numId w:val="31"/>
@@ -6233,7 +6233,7 @@
     </w:p>
     <w:p>
       <w:pPr>
-        <w:pStyle w:val="Heading1"/>
+        <w:pStyle w:val="Kop1"/>
         <w:jc w:val="left"/>
       </w:pPr>
       <w:bookmarkStart w:id="17" w:name="_Toc183594800"/>
@@ -6245,7 +6245,7 @@
     </w:p>
     <w:p>
       <w:pPr>
-        <w:pStyle w:val="Heading2"/>
+        <w:pStyle w:val="Kop2"/>
         <w:rPr>
           <w:i/>
           <w:iCs/>
@@ -6284,7 +6284,7 @@
     </w:p>
     <w:p>
       <w:pPr>
-        <w:pStyle w:val="Heading2"/>
+        <w:pStyle w:val="Kop2"/>
       </w:pPr>
       <w:bookmarkStart w:id="19" w:name="_Toc183594802"/>
       <w:r>
@@ -6475,7 +6475,7 @@
     <w:p/>
     <w:p>
       <w:pPr>
-        <w:pStyle w:val="Heading2"/>
+        <w:pStyle w:val="Kop2"/>
       </w:pPr>
       <w:bookmarkStart w:id="20" w:name="_Toc183594803"/>
       <w:r>
@@ -6494,7 +6494,7 @@
     </w:p>
     <w:p>
       <w:pPr>
-        <w:pStyle w:val="Heading2"/>
+        <w:pStyle w:val="Kop2"/>
       </w:pPr>
       <w:bookmarkStart w:id="21" w:name="_Toc183594804"/>
       <w:r>
@@ -6539,7 +6539,7 @@
     </w:p>
     <w:p>
       <w:pPr>
-        <w:pStyle w:val="Heading2"/>
+        <w:pStyle w:val="Kop2"/>
       </w:pPr>
       <w:bookmarkStart w:id="22" w:name="_Toc183594805"/>
       <w:r>
@@ -6675,7 +6675,7 @@
     <w:p/>
     <w:p>
       <w:pPr>
-        <w:pStyle w:val="Heading2"/>
+        <w:pStyle w:val="Kop2"/>
       </w:pPr>
       <w:bookmarkStart w:id="23" w:name="_Toc183594806"/>
       <w:r>
@@ -7161,7 +7161,7 @@
           </w:tcPr>
           <w:p>
             <w:pPr>
-              <w:pStyle w:val="ListParagraph"/>
+              <w:pStyle w:val="Lijstalinea"/>
               <w:numPr>
                 <w:ilvl w:val="0"/>
                 <w:numId w:val="31"/>
@@ -7203,7 +7203,7 @@
           </w:p>
           <w:p>
             <w:pPr>
-              <w:pStyle w:val="ListParagraph"/>
+              <w:pStyle w:val="Lijstalinea"/>
               <w:numPr>
                 <w:ilvl w:val="0"/>
                 <w:numId w:val="31"/>
@@ -7697,7 +7697,7 @@
           </w:tcPr>
           <w:p>
             <w:pPr>
-              <w:pStyle w:val="ListParagraph"/>
+              <w:pStyle w:val="Lijstalinea"/>
               <w:numPr>
                 <w:ilvl w:val="0"/>
                 <w:numId w:val="31"/>
@@ -7718,7 +7718,7 @@
           </w:p>
           <w:p>
             <w:pPr>
-              <w:pStyle w:val="ListParagraph"/>
+              <w:pStyle w:val="Lijstalinea"/>
               <w:numPr>
                 <w:ilvl w:val="0"/>
                 <w:numId w:val="31"/>
@@ -8195,7 +8195,7 @@
           </w:tcPr>
           <w:p>
             <w:pPr>
-              <w:pStyle w:val="ListParagraph"/>
+              <w:pStyle w:val="Lijstalinea"/>
               <w:numPr>
                 <w:ilvl w:val="0"/>
                 <w:numId w:val="31"/>
@@ -8232,7 +8232,7 @@
     <w:p/>
     <w:p>
       <w:pPr>
-        <w:pStyle w:val="Heading1"/>
+        <w:pStyle w:val="Kop1"/>
         <w:jc w:val="left"/>
       </w:pPr>
       <w:bookmarkStart w:id="24" w:name="_Toc183594807"/>
@@ -8243,7 +8243,7 @@
     </w:p>
     <w:p>
       <w:pPr>
-        <w:pStyle w:val="Heading2"/>
+        <w:pStyle w:val="Kop2"/>
         <w:rPr>
           <w:i/>
           <w:iCs/>
@@ -8265,11 +8265,29 @@
       </w:pPr>
       <w:r>
         <w:rPr>
-          <w:i/>
-          <w:iCs/>
           <w:color w:val="000000" w:themeColor="text1"/>
         </w:rPr>
-        <w:t>…</w:t>
+        <w:t>De eerste helft van sprint 4 ging heel goed alleen het draad oppakken na de vakantie was moeilijk.</w:t>
+      </w:r>
+      <w:r>
+        <w:rPr>
+          <w:color w:val="000000" w:themeColor="text1"/>
+        </w:rPr>
+        <w:br/>
+        <w:t>hierdoor waren we niet productief bezig de 2</w:t>
+      </w:r>
+      <w:r>
+        <w:rPr>
+          <w:color w:val="000000" w:themeColor="text1"/>
+          <w:vertAlign w:val="superscript"/>
+        </w:rPr>
+        <w:t>de</w:t>
+      </w:r>
+      <w:r>
+        <w:rPr>
+          <w:color w:val="000000" w:themeColor="text1"/>
+        </w:rPr>
+        <w:t xml:space="preserve"> helft waardoor tijdens het testen veel dingen uit elkaar vielen en we het moesten opschuiven. Ook waren sommige dingen niet goed getest wat wel beter hadden gekund.</w:t>
       </w:r>
       <w:r>
         <w:rPr>
@@ -8282,7 +8300,7 @@
     </w:p>
     <w:p>
       <w:pPr>
-        <w:pStyle w:val="Heading2"/>
+        <w:pStyle w:val="Kop2"/>
       </w:pPr>
       <w:bookmarkStart w:id="26" w:name="_Toc183594809"/>
       <w:r>
@@ -8291,26 +8309,72 @@
       <w:bookmarkEnd w:id="26"/>
     </w:p>
     <w:p>
-      <w:r>
-        <w:t>…</w:t>
+      <w:pPr>
+        <w:pStyle w:val="Kop2"/>
+      </w:pPr>
+      <w:r>
+        <w:drawing>
+          <wp:inline distT="0" distB="0" distL="0" distR="0" wp14:anchorId="0E9B5529" wp14:editId="4F71A8EF">
+            <wp:extent cx="5760720" cy="4948555"/>
+            <wp:effectExtent l="0" t="0" r="0" b="4445"/>
+            <wp:docPr id="294330144" name="Afbeelding 1" descr="Afbeelding met schermopname, tekst, software, Multimediasoftware&#10;&#10;Door AI gegenereerde inhoud is mogelijk onjuist."/>
+            <wp:cNvGraphicFramePr>
+              <a:graphicFrameLocks xmlns:a="http://schemas.openxmlformats.org/drawingml/2006/main" noChangeAspect="1"/>
+            </wp:cNvGraphicFramePr>
+            <a:graphic xmlns:a="http://schemas.openxmlformats.org/drawingml/2006/main">
+              <a:graphicData uri="http://schemas.openxmlformats.org/drawingml/2006/picture">
+                <pic:pic xmlns:pic="http://schemas.openxmlformats.org/drawingml/2006/picture">
+                  <pic:nvPicPr>
+                    <pic:cNvPr id="294330144" name="Afbeelding 1" descr="Afbeelding met schermopname, tekst, software, Multimediasoftware&#10;&#10;Door AI gegenereerde inhoud is mogelijk onjuist."/>
+                    <pic:cNvPicPr/>
+                  </pic:nvPicPr>
+                  <pic:blipFill>
+                    <a:blip r:embed="rId18">
+                      <a:extLst>
+                        <a:ext uri="{28A0092B-C50C-407E-A947-70E740481C1C}">
+                          <a14:useLocalDpi xmlns:a14="http://schemas.microsoft.com/office/drawing/2010/main" val="0"/>
+                        </a:ext>
+                      </a:extLst>
+                    </a:blip>
+                    <a:stretch>
+                      <a:fillRect/>
+                    </a:stretch>
+                  </pic:blipFill>
+                  <pic:spPr>
+                    <a:xfrm>
+                      <a:off x="0" y="0"/>
+                      <a:ext cx="5760720" cy="4948555"/>
+                    </a:xfrm>
+                    <a:prstGeom prst="rect">
+                      <a:avLst/>
+                    </a:prstGeom>
+                  </pic:spPr>
+                </pic:pic>
+              </a:graphicData>
+            </a:graphic>
+          </wp:inline>
+        </w:drawing>
       </w:r>
       <w:r>
         <w:br/>
       </w:r>
     </w:p>
+    <w:p/>
+    <w:p/>
     <w:p>
       <w:pPr>
-        <w:pStyle w:val="Heading2"/>
+        <w:pStyle w:val="Kop2"/>
       </w:pPr>
       <w:bookmarkStart w:id="27" w:name="_Toc183594810"/>
       <w:r>
+        <w:lastRenderedPageBreak/>
         <w:t>3. Organiseren en uitvoeren van de test(en)</w:t>
       </w:r>
       <w:bookmarkEnd w:id="27"/>
     </w:p>
     <w:p>
       <w:r>
-        <w:t>…</w:t>
+        <w:t>Het uitvoeren van de testen zoals net gezegd ging niet zoals verwacht en moest daardoor opgeschoven worden naar een andere dag. Hierdoor was de planning omgegooid en door andere omstandigheden missen we eigenlijk een week waar we bezig konden gaan met andere taken in ons project.</w:t>
       </w:r>
       <w:r>
         <w:br/>
@@ -8318,7 +8382,7 @@
     </w:p>
     <w:p>
       <w:pPr>
-        <w:pStyle w:val="Heading2"/>
+        <w:pStyle w:val="Kop2"/>
       </w:pPr>
       <w:bookmarkStart w:id="28" w:name="_Toc183594811"/>
       <w:r>
@@ -8328,7 +8392,11 @@
     </w:p>
     <w:p>
       <w:r>
-        <w:t>…</w:t>
+        <w:t>De testers waren gemiddeld tevreden over het spel.</w:t>
+      </w:r>
+      <w:r>
+        <w:br/>
+        <w:t xml:space="preserve">Er was wel feedback over de mine auto’s die te groot waren waardoor ze te moeilijk waren om te ontwijken. Ook was er vraag naar een health bar zodat spelers konden zien hoeveel health ze op dat moment hadden. De testers waren ook nog achter een bug gekomen waar een onzichtbare collider op de map stond. Wij gaan onderzoeken hoe deze bug voorkomt en wat we eraan kunnen doen om het te fixen. </w:t>
       </w:r>
       <w:r>
         <w:br/>
@@ -8336,7 +8404,7 @@
     </w:p>
     <w:p>
       <w:pPr>
-        <w:pStyle w:val="Heading2"/>
+        <w:pStyle w:val="Kop2"/>
       </w:pPr>
       <w:bookmarkStart w:id="29" w:name="_Toc183594812"/>
       <w:r>
@@ -8346,17 +8414,130 @@
     </w:p>
     <w:p>
       <w:r>
-        <w:t>…</w:t>
+        <w:rPr>
+          <w:b/>
+          <w:bCs/>
+        </w:rPr>
+        <w:t>Jorick</w:t>
+      </w:r>
+      <w:r>
+        <w:t>:</w:t>
+      </w:r>
+      <w:r>
+        <w:br/>
+        <w:t xml:space="preserve">Deze sprint heb ik veel zelf bezig geweest met mijn eigen functie (debuffs) dus heb niet al teveel samengewerkt met het groepje. Voor de delen die we samen hadden gedaan vond ik dat het wel redelijk goed ging. Ik had bijvoorbeeld na de ramp van het eerste keer testen samen met Jeroen even gekeken naar wat er mis ging en ook toen samen een van de bugs weggewerkt. </w:t>
+      </w:r>
+    </w:p>
+    <w:p>
+      <w:pPr>
+        <w:rPr>
+          <w:b/>
+          <w:bCs/>
+        </w:rPr>
+      </w:pPr>
+      <w:r>
+        <w:rPr>
+          <w:b/>
+          <w:bCs/>
+        </w:rPr>
+        <w:t>Jeroen:</w:t>
+      </w:r>
+    </w:p>
+    <w:p>
+      <w:r>
+        <w:t>Ik vond dat ik teveel werd afgeleid omdat ik geen duidelijke planning meer voor mezelf had door een tekort aan taken.</w:t>
+      </w:r>
+    </w:p>
+    <w:p>
+      <w:r>
+        <w:rPr>
+          <w:b/>
+          <w:bCs/>
+        </w:rPr>
+        <w:t>Thom:</w:t>
+      </w:r>
+    </w:p>
+    <w:p>
+      <w:r>
+        <w:t xml:space="preserve">Deze sprint was wat onoverzichtelijker voor mij, dit kwam doordat de sprint </w:t>
+      </w:r>
+      <w:r>
+        <w:t>halverwege</w:t>
+      </w:r>
+      <w:r>
+        <w:t xml:space="preserve"> werd onderbroken door vakantie.</w:t>
+      </w:r>
+      <w:r>
+        <w:br/>
+        <w:t>daarnaast was het oppakken de werkzaamheden niet al te makkelijk doordat er steeds uren uitvielen waar wij op hadden gerekend dat die doorgingen. hierdoor kon ik mij niet helemaal goed focussen op de prioriteiten en was het overzicht een beetje kwijt.</w:t>
+      </w:r>
+      <w:r>
+        <w:br/>
+        <w:t xml:space="preserve">los van dit ben ik deze sprint verder gegaan met de </w:t>
+      </w:r>
+      <w:r>
+        <w:t>obstakels</w:t>
+      </w:r>
+      <w:r>
+        <w:t xml:space="preserve"> en bugfixes daarvan, ook heb ik een begin gemaakt aan de map selection screen, maar deze moet anders worden opgebouwd worden.</w:t>
+      </w:r>
+    </w:p>
+    <w:p>
+      <w:pPr>
+        <w:rPr>
+          <w:b/>
+          <w:bCs/>
+        </w:rPr>
+      </w:pPr>
+      <w:r>
+        <w:rPr>
+          <w:b/>
+          <w:bCs/>
+        </w:rPr>
+        <w:t>Gido:</w:t>
+      </w:r>
+    </w:p>
+    <w:p>
+      <w:r>
+        <w:t xml:space="preserve">ik ben wel tevreden met de vooruitgang dat we deze sprint hebben gemaakt, met de movement rework, obstakels, debuffs en leaderboard. ookal hadden we meer af kunnen krijgen deze sprint als we eerder het draad op hadden gepakt na de </w:t>
+      </w:r>
+      <w:r>
+        <w:t>vakantie</w:t>
+      </w:r>
+      <w:r>
+        <w:t xml:space="preserve">. ik </w:t>
+      </w:r>
+      <w:r>
+        <w:t>vond</w:t>
+      </w:r>
+      <w:r>
+        <w:t xml:space="preserve"> dat ik harder had kunnen doorwerken aan de presentatie zodat ik die ook optijd kon ge</w:t>
+      </w:r>
+      <w:r>
+        <w:t>v</w:t>
+      </w:r>
+      <w:r>
+        <w:t>en aan het einde van de sprint</w:t>
+      </w:r>
+      <w:r>
+        <w:t>.</w:t>
       </w:r>
     </w:p>
     <w:p/>
     <w:p>
       <w:pPr>
-        <w:pStyle w:val="Heading2"/>
+        <w:pStyle w:val="Kop2"/>
       </w:pPr>
       <w:bookmarkStart w:id="30" w:name="_Toc183594813"/>
       <w:r>
-        <w:t>6. Nieuwe user stories op basis van het verbetervoorstel</w:t>
+        <w:lastRenderedPageBreak/>
+        <w:t xml:space="preserve">6. Nieuwe user </w:t>
+      </w:r>
+      <w:r>
+        <w:t>story’s</w:t>
+      </w:r>
+      <w:r>
+        <w:t xml:space="preserve"> op basis van het verbetervoorstel</w:t>
       </w:r>
       <w:bookmarkEnd w:id="30"/>
     </w:p>
@@ -8430,6 +8611,13 @@
                 <w:color w:val="000000"/>
               </w:rPr>
             </w:pPr>
+            <w:r>
+              <w:rPr>
+                <w:rFonts w:ascii="Calibri" w:eastAsia="Times New Roman" w:hAnsi="Calibri" w:cs="Calibri"/>
+                <w:color w:val="000000"/>
+              </w:rPr>
+              <w:t>Thom Hermelink</w:t>
+            </w:r>
           </w:p>
         </w:tc>
       </w:tr>
@@ -8503,7 +8691,7 @@
                 <w:rFonts w:ascii="Calibri" w:eastAsia="Times New Roman" w:hAnsi="Calibri" w:cs="Calibri"/>
                 <w:color w:val="000000"/>
               </w:rPr>
-              <w:t>…</w:t>
+              <w:t>28. Onzichtbare collider bug</w:t>
             </w:r>
           </w:p>
         </w:tc>
@@ -8586,7 +8774,56 @@
                 <w:rFonts w:ascii="Calibri" w:eastAsia="Times New Roman" w:hAnsi="Calibri" w:cs="Calibri"/>
                 <w:color w:val="000000"/>
               </w:rPr>
-              <w:t>Als … wil ik … zodat …</w:t>
+              <w:t xml:space="preserve">Als </w:t>
+            </w:r>
+            <w:r>
+              <w:rPr>
+                <w:rFonts w:ascii="Calibri" w:eastAsia="Times New Roman" w:hAnsi="Calibri" w:cs="Calibri"/>
+                <w:color w:val="000000"/>
+              </w:rPr>
+              <w:t>speler</w:t>
+            </w:r>
+            <w:r>
+              <w:rPr>
+                <w:rFonts w:ascii="Calibri" w:eastAsia="Times New Roman" w:hAnsi="Calibri" w:cs="Calibri"/>
+                <w:color w:val="000000"/>
+              </w:rPr>
+              <w:t xml:space="preserve"> wil ik </w:t>
+            </w:r>
+            <w:r>
+              <w:rPr>
+                <w:rFonts w:ascii="Calibri" w:eastAsia="Times New Roman" w:hAnsi="Calibri" w:cs="Calibri"/>
+                <w:color w:val="000000"/>
+              </w:rPr>
+              <w:t>geen onzichtbare colliders op de map</w:t>
+            </w:r>
+            <w:r>
+              <w:rPr>
+                <w:rFonts w:ascii="Calibri" w:eastAsia="Times New Roman" w:hAnsi="Calibri" w:cs="Calibri"/>
+                <w:color w:val="000000"/>
+              </w:rPr>
+              <w:t xml:space="preserve"> zodat</w:t>
+            </w:r>
+            <w:r>
+              <w:rPr>
+                <w:rFonts w:ascii="Calibri" w:eastAsia="Times New Roman" w:hAnsi="Calibri" w:cs="Calibri"/>
+                <w:color w:val="000000"/>
+              </w:rPr>
+              <w:t xml:space="preserve"> ik</w:t>
+            </w:r>
+            <w:r>
+              <w:rPr>
+                <w:rFonts w:ascii="Calibri" w:eastAsia="Times New Roman" w:hAnsi="Calibri" w:cs="Calibri"/>
+                <w:color w:val="000000"/>
+              </w:rPr>
+              <w:t xml:space="preserve"> </w:t>
+            </w:r>
+            <w:r>
+              <w:rPr>
+                <w:rFonts w:ascii="Calibri" w:eastAsia="Times New Roman" w:hAnsi="Calibri" w:cs="Calibri"/>
+                <w:color w:val="000000"/>
+              </w:rPr>
+              <w:t xml:space="preserve">zonder onbedoelde obstakels door de map heen kan rijden. </w:t>
             </w:r>
           </w:p>
         </w:tc>
@@ -8657,7 +8894,7 @@
                 <w:rFonts w:ascii="Calibri" w:eastAsia="Times New Roman" w:hAnsi="Calibri" w:cs="Calibri"/>
                 <w:color w:val="000000"/>
               </w:rPr>
-              <w:t>1-5</w:t>
+              <w:t>5</w:t>
             </w:r>
           </w:p>
         </w:tc>
@@ -8723,7 +8960,7 @@
                 <w:rFonts w:ascii="Calibri" w:eastAsia="Times New Roman" w:hAnsi="Calibri" w:cs="Calibri"/>
                 <w:color w:val="000000"/>
               </w:rPr>
-              <w:t>0,0.5,1,2,3,5,8,13,20</w:t>
+              <w:t>3</w:t>
             </w:r>
           </w:p>
         </w:tc>
@@ -8795,7 +9032,7 @@
           </w:tcPr>
           <w:p>
             <w:pPr>
-              <w:pStyle w:val="ListParagraph"/>
+              <w:pStyle w:val="Lijstalinea"/>
               <w:numPr>
                 <w:ilvl w:val="0"/>
                 <w:numId w:val="31"/>
@@ -8811,71 +9048,18 @@
                 <w:rFonts w:ascii="Calibri" w:eastAsia="Times New Roman" w:hAnsi="Calibri" w:cs="Calibri"/>
                 <w:color w:val="000000"/>
               </w:rPr>
-              <w:t>Criteria 1…</w:t>
-            </w:r>
-          </w:p>
-          <w:p>
-            <w:pPr>
-              <w:pStyle w:val="ListParagraph"/>
-              <w:numPr>
-                <w:ilvl w:val="0"/>
-                <w:numId w:val="31"/>
-              </w:numPr>
+              <w:t>Er komen geen onzichtbare colliders op de map tevoorschijn</w:t>
+            </w:r>
+          </w:p>
+          <w:p>
+            <w:pPr>
+              <w:pStyle w:val="Lijstalinea"/>
               <w:spacing w:before="240" w:line="240" w:lineRule="auto"/>
               <w:rPr>
                 <w:rFonts w:ascii="Calibri" w:eastAsia="Times New Roman" w:hAnsi="Calibri" w:cs="Calibri"/>
                 <w:color w:val="000000"/>
               </w:rPr>
             </w:pPr>
-            <w:r>
-              <w:rPr>
-                <w:rFonts w:ascii="Calibri" w:eastAsia="Times New Roman" w:hAnsi="Calibri" w:cs="Calibri"/>
-                <w:color w:val="000000"/>
-              </w:rPr>
-              <w:t>Criteria 2…</w:t>
-            </w:r>
-          </w:p>
-          <w:p>
-            <w:pPr>
-              <w:pStyle w:val="ListParagraph"/>
-              <w:numPr>
-                <w:ilvl w:val="0"/>
-                <w:numId w:val="31"/>
-              </w:numPr>
-              <w:spacing w:before="240" w:line="240" w:lineRule="auto"/>
-              <w:rPr>
-                <w:rFonts w:ascii="Calibri" w:eastAsia="Times New Roman" w:hAnsi="Calibri" w:cs="Calibri"/>
-                <w:color w:val="000000"/>
-              </w:rPr>
-            </w:pPr>
-            <w:r>
-              <w:rPr>
-                <w:rFonts w:ascii="Calibri" w:eastAsia="Times New Roman" w:hAnsi="Calibri" w:cs="Calibri"/>
-                <w:color w:val="000000"/>
-              </w:rPr>
-              <w:t>Criteria 3…</w:t>
-            </w:r>
-          </w:p>
-          <w:p>
-            <w:pPr>
-              <w:pStyle w:val="ListParagraph"/>
-              <w:numPr>
-                <w:ilvl w:val="0"/>
-                <w:numId w:val="31"/>
-              </w:numPr>
-              <w:spacing w:before="240" w:line="240" w:lineRule="auto"/>
-              <w:rPr>
-                <w:rFonts w:ascii="Calibri" w:eastAsia="Times New Roman" w:hAnsi="Calibri" w:cs="Calibri"/>
-                <w:color w:val="000000"/>
-              </w:rPr>
-            </w:pPr>
-            <w:r>
-              <w:rPr>
-                <w:rFonts w:ascii="Calibri" w:eastAsia="Times New Roman" w:hAnsi="Calibri" w:cs="Calibri"/>
-                <w:color w:val="000000"/>
-              </w:rPr>
-              <w:t>Etc.</w:t>
-            </w:r>
           </w:p>
         </w:tc>
       </w:tr>
@@ -8913,7 +9097,6 @@
                 <w:bCs/>
                 <w:color w:val="000000"/>
               </w:rPr>
-              <w:lastRenderedPageBreak/>
               <w:t>Naam student:</w:t>
             </w:r>
           </w:p>
@@ -8939,6 +9122,13 @@
                 <w:color w:val="000000"/>
               </w:rPr>
             </w:pPr>
+            <w:r>
+              <w:rPr>
+                <w:rFonts w:ascii="Calibri" w:eastAsia="Times New Roman" w:hAnsi="Calibri" w:cs="Calibri"/>
+                <w:color w:val="000000"/>
+              </w:rPr>
+              <w:t>Thom Hermelink</w:t>
+            </w:r>
           </w:p>
         </w:tc>
       </w:tr>
@@ -9012,7 +9202,7 @@
                 <w:rFonts w:ascii="Calibri" w:eastAsia="Times New Roman" w:hAnsi="Calibri" w:cs="Calibri"/>
                 <w:color w:val="000000"/>
               </w:rPr>
-              <w:t>…</w:t>
+              <w:t>29. Shotgun goede richting op schieten</w:t>
             </w:r>
           </w:p>
         </w:tc>
@@ -9095,7 +9285,42 @@
                 <w:rFonts w:ascii="Calibri" w:eastAsia="Times New Roman" w:hAnsi="Calibri" w:cs="Calibri"/>
                 <w:color w:val="000000"/>
               </w:rPr>
-              <w:t>Als … wil ik … zodat …</w:t>
+              <w:t xml:space="preserve">Als </w:t>
+            </w:r>
+            <w:r>
+              <w:rPr>
+                <w:rFonts w:ascii="Calibri" w:eastAsia="Times New Roman" w:hAnsi="Calibri" w:cs="Calibri"/>
+                <w:color w:val="000000"/>
+              </w:rPr>
+              <w:t>speler</w:t>
+            </w:r>
+            <w:r>
+              <w:rPr>
+                <w:rFonts w:ascii="Calibri" w:eastAsia="Times New Roman" w:hAnsi="Calibri" w:cs="Calibri"/>
+                <w:color w:val="000000"/>
+              </w:rPr>
+              <w:t xml:space="preserve"> wil ik </w:t>
+            </w:r>
+            <w:r>
+              <w:rPr>
+                <w:rFonts w:ascii="Calibri" w:eastAsia="Times New Roman" w:hAnsi="Calibri" w:cs="Calibri"/>
+                <w:color w:val="000000"/>
+              </w:rPr>
+              <w:t>dat de shotgun obstakel de goede kant op schiet</w:t>
+            </w:r>
+            <w:r>
+              <w:rPr>
+                <w:rFonts w:ascii="Calibri" w:eastAsia="Times New Roman" w:hAnsi="Calibri" w:cs="Calibri"/>
+                <w:color w:val="000000"/>
+              </w:rPr>
+              <w:t xml:space="preserve"> zodat </w:t>
+            </w:r>
+            <w:r>
+              <w:rPr>
+                <w:rFonts w:ascii="Calibri" w:eastAsia="Times New Roman" w:hAnsi="Calibri" w:cs="Calibri"/>
+                <w:color w:val="000000"/>
+              </w:rPr>
+              <w:t>ik niet geraakt word door kogels die niet daar horen te zitten.</w:t>
             </w:r>
           </w:p>
         </w:tc>
@@ -9166,7 +9391,7 @@
                 <w:rFonts w:ascii="Calibri" w:eastAsia="Times New Roman" w:hAnsi="Calibri" w:cs="Calibri"/>
                 <w:color w:val="000000"/>
               </w:rPr>
-              <w:t>1-5</w:t>
+              <w:t>3</w:t>
             </w:r>
           </w:p>
         </w:tc>
@@ -9232,7 +9457,7 @@
                 <w:rFonts w:ascii="Calibri" w:eastAsia="Times New Roman" w:hAnsi="Calibri" w:cs="Calibri"/>
                 <w:color w:val="000000"/>
               </w:rPr>
-              <w:t>0,0.5,1,2,3,5,8,13,20</w:t>
+              <w:t>3</w:t>
             </w:r>
           </w:p>
         </w:tc>
@@ -9304,7 +9529,7 @@
           </w:tcPr>
           <w:p>
             <w:pPr>
-              <w:pStyle w:val="ListParagraph"/>
+              <w:pStyle w:val="Lijstalinea"/>
               <w:numPr>
                 <w:ilvl w:val="0"/>
                 <w:numId w:val="31"/>
@@ -9320,12 +9545,477 @@
                 <w:rFonts w:ascii="Calibri" w:eastAsia="Times New Roman" w:hAnsi="Calibri" w:cs="Calibri"/>
                 <w:color w:val="000000"/>
               </w:rPr>
-              <w:t>Criteria 1…</w:t>
-            </w:r>
-          </w:p>
-          <w:p>
-            <w:pPr>
-              <w:pStyle w:val="ListParagraph"/>
+              <w:t>Alle shotgun pellets schieten dezelfde kant op (met spread)</w:t>
+            </w:r>
+          </w:p>
+          <w:p>
+            <w:pPr>
+              <w:pStyle w:val="Lijstalinea"/>
+              <w:spacing w:before="240" w:line="240" w:lineRule="auto"/>
+              <w:rPr>
+                <w:rFonts w:ascii="Calibri" w:eastAsia="Times New Roman" w:hAnsi="Calibri" w:cs="Calibri"/>
+                <w:color w:val="000000"/>
+              </w:rPr>
+            </w:pPr>
+          </w:p>
+        </w:tc>
+      </w:tr>
+    </w:tbl>
+    <w:p/>
+    <w:p/>
+    <w:tbl>
+      <w:tblPr>
+        <w:tblW w:w="9662" w:type="dxa"/>
+        <w:tblInd w:w="-113" w:type="dxa"/>
+        <w:tblLook w:val="04A0" w:firstRow="1" w:lastRow="0" w:firstColumn="1" w:lastColumn="0" w:noHBand="0" w:noVBand="1"/>
+      </w:tblPr>
+      <w:tblGrid>
+        <w:gridCol w:w="113"/>
+        <w:gridCol w:w="1980"/>
+        <w:gridCol w:w="2551"/>
+        <w:gridCol w:w="1985"/>
+        <w:gridCol w:w="524"/>
+        <w:gridCol w:w="1985"/>
+        <w:gridCol w:w="524"/>
+      </w:tblGrid>
+      <w:tr>
+        <w:trPr>
+          <w:gridBefore w:val="1"/>
+          <w:gridAfter w:val="1"/>
+          <w:wBefore w:w="113" w:type="dxa"/>
+          <w:wAfter w:w="524" w:type="dxa"/>
+          <w:trHeight w:val="567"/>
+        </w:trPr>
+        <w:tc>
+          <w:tcPr>
+            <w:tcW w:w="1980" w:type="dxa"/>
+            <w:tcBorders>
+              <w:top w:val="single" w:sz="4" w:space="0" w:color="auto"/>
+              <w:left w:val="single" w:sz="4" w:space="0" w:color="auto"/>
+              <w:bottom w:val="single" w:sz="4" w:space="0" w:color="auto"/>
+              <w:right w:val="single" w:sz="4" w:space="0" w:color="auto"/>
+            </w:tcBorders>
+            <w:shd w:val="clear" w:color="auto" w:fill="BFBFBF" w:themeFill="background1" w:themeFillShade="BF"/>
+            <w:noWrap/>
+            <w:vAlign w:val="center"/>
+          </w:tcPr>
+          <w:p>
+            <w:pPr>
+              <w:spacing w:after="0" w:line="240" w:lineRule="auto"/>
+              <w:rPr>
+                <w:rFonts w:ascii="Calibri" w:eastAsia="Times New Roman" w:hAnsi="Calibri" w:cs="Calibri"/>
+                <w:b/>
+                <w:bCs/>
+                <w:color w:val="000000"/>
+              </w:rPr>
+            </w:pPr>
+            <w:r>
+              <w:rPr>
+                <w:rFonts w:ascii="Calibri" w:eastAsia="Times New Roman" w:hAnsi="Calibri" w:cs="Calibri"/>
+                <w:b/>
+                <w:bCs/>
+                <w:color w:val="000000"/>
+              </w:rPr>
+              <w:t>Naam student:</w:t>
+            </w:r>
+          </w:p>
+        </w:tc>
+        <w:tc>
+          <w:tcPr>
+            <w:tcW w:w="7045" w:type="dxa"/>
+            <w:gridSpan w:val="4"/>
+            <w:tcBorders>
+              <w:top w:val="single" w:sz="4" w:space="0" w:color="auto"/>
+              <w:left w:val="single" w:sz="4" w:space="0" w:color="auto"/>
+              <w:bottom w:val="single" w:sz="4" w:space="0" w:color="auto"/>
+              <w:right w:val="single" w:sz="4" w:space="0" w:color="auto"/>
+            </w:tcBorders>
+            <w:shd w:val="clear" w:color="auto" w:fill="auto"/>
+            <w:vAlign w:val="center"/>
+          </w:tcPr>
+          <w:p>
+            <w:pPr>
+              <w:spacing w:after="0" w:line="240" w:lineRule="auto"/>
+              <w:rPr>
+                <w:rFonts w:ascii="Calibri" w:eastAsia="Times New Roman" w:hAnsi="Calibri" w:cs="Calibri"/>
+                <w:color w:val="000000"/>
+              </w:rPr>
+            </w:pPr>
+            <w:r>
+              <w:rPr>
+                <w:rFonts w:ascii="Calibri" w:eastAsia="Times New Roman" w:hAnsi="Calibri" w:cs="Calibri"/>
+                <w:color w:val="000000"/>
+              </w:rPr>
+              <w:t>Jeroen Verboom</w:t>
+            </w:r>
+          </w:p>
+        </w:tc>
+      </w:tr>
+      <w:tr>
+        <w:trPr>
+          <w:gridBefore w:val="1"/>
+          <w:gridAfter w:val="1"/>
+          <w:wBefore w:w="113" w:type="dxa"/>
+          <w:wAfter w:w="524" w:type="dxa"/>
+          <w:trHeight w:val="567"/>
+        </w:trPr>
+        <w:tc>
+          <w:tcPr>
+            <w:tcW w:w="1980" w:type="dxa"/>
+            <w:tcBorders>
+              <w:top w:val="single" w:sz="4" w:space="0" w:color="auto"/>
+              <w:left w:val="single" w:sz="4" w:space="0" w:color="auto"/>
+              <w:bottom w:val="single" w:sz="4" w:space="0" w:color="auto"/>
+              <w:right w:val="single" w:sz="4" w:space="0" w:color="auto"/>
+            </w:tcBorders>
+            <w:shd w:val="clear" w:color="auto" w:fill="BFBFBF" w:themeFill="background1" w:themeFillShade="BF"/>
+            <w:noWrap/>
+            <w:vAlign w:val="center"/>
+            <w:hideMark/>
+          </w:tcPr>
+          <w:p>
+            <w:pPr>
+              <w:spacing w:after="0" w:line="240" w:lineRule="auto"/>
+              <w:rPr>
+                <w:rFonts w:ascii="Calibri" w:eastAsia="Times New Roman" w:hAnsi="Calibri" w:cs="Calibri"/>
+                <w:color w:val="000000"/>
+              </w:rPr>
+            </w:pPr>
+            <w:r>
+              <w:rPr>
+                <w:rFonts w:ascii="Calibri" w:eastAsia="Times New Roman" w:hAnsi="Calibri" w:cs="Calibri"/>
+                <w:b/>
+                <w:bCs/>
+                <w:color w:val="000000"/>
+              </w:rPr>
+              <w:t>Nummer &amp; Titel</w:t>
+            </w:r>
+            <w:r>
+              <w:rPr>
+                <w:rFonts w:ascii="Calibri" w:eastAsia="Times New Roman" w:hAnsi="Calibri" w:cs="Calibri"/>
+                <w:color w:val="000000"/>
+              </w:rPr>
+              <w:t>:</w:t>
+            </w:r>
+          </w:p>
+        </w:tc>
+        <w:tc>
+          <w:tcPr>
+            <w:tcW w:w="7045" w:type="dxa"/>
+            <w:gridSpan w:val="4"/>
+            <w:tcBorders>
+              <w:top w:val="single" w:sz="4" w:space="0" w:color="auto"/>
+              <w:left w:val="single" w:sz="4" w:space="0" w:color="auto"/>
+              <w:bottom w:val="single" w:sz="4" w:space="0" w:color="auto"/>
+              <w:right w:val="single" w:sz="4" w:space="0" w:color="auto"/>
+            </w:tcBorders>
+            <w:shd w:val="clear" w:color="auto" w:fill="auto"/>
+            <w:vAlign w:val="center"/>
+          </w:tcPr>
+          <w:p>
+            <w:pPr>
+              <w:spacing w:after="0" w:line="240" w:lineRule="auto"/>
+              <w:rPr>
+                <w:rFonts w:ascii="Calibri" w:eastAsia="Times New Roman" w:hAnsi="Calibri" w:cs="Calibri"/>
+                <w:color w:val="000000"/>
+              </w:rPr>
+            </w:pPr>
+            <w:r>
+              <w:rPr>
+                <w:rFonts w:ascii="Calibri" w:eastAsia="Times New Roman" w:hAnsi="Calibri" w:cs="Calibri"/>
+                <w:color w:val="000000"/>
+              </w:rPr>
+              <w:t>30. Shield powerup bug</w:t>
+            </w:r>
+          </w:p>
+        </w:tc>
+      </w:tr>
+      <w:tr>
+        <w:trPr>
+          <w:gridBefore w:val="1"/>
+          <w:gridAfter w:val="1"/>
+          <w:wBefore w:w="113" w:type="dxa"/>
+          <w:wAfter w:w="524" w:type="dxa"/>
+          <w:trHeight w:val="567"/>
+        </w:trPr>
+        <w:tc>
+          <w:tcPr>
+            <w:tcW w:w="9025" w:type="dxa"/>
+            <w:gridSpan w:val="5"/>
+            <w:tcBorders>
+              <w:top w:val="single" w:sz="4" w:space="0" w:color="auto"/>
+              <w:left w:val="single" w:sz="4" w:space="0" w:color="auto"/>
+              <w:bottom w:val="single" w:sz="4" w:space="0" w:color="auto"/>
+              <w:right w:val="single" w:sz="4" w:space="0" w:color="auto"/>
+            </w:tcBorders>
+            <w:shd w:val="clear" w:color="auto" w:fill="BFBFBF" w:themeFill="background1" w:themeFillShade="BF"/>
+            <w:noWrap/>
+            <w:vAlign w:val="center"/>
+            <w:hideMark/>
+          </w:tcPr>
+          <w:p>
+            <w:pPr>
+              <w:spacing w:after="0" w:line="240" w:lineRule="auto"/>
+              <w:rPr>
+                <w:rFonts w:ascii="Calibri" w:eastAsia="Times New Roman" w:hAnsi="Calibri" w:cs="Calibri"/>
+                <w:color w:val="000000"/>
+              </w:rPr>
+            </w:pPr>
+            <w:r>
+              <w:rPr>
+                <w:rFonts w:ascii="Calibri" w:eastAsia="Times New Roman" w:hAnsi="Calibri" w:cs="Calibri"/>
+                <w:b/>
+                <w:bCs/>
+                <w:color w:val="000000"/>
+              </w:rPr>
+              <w:t>Omschrijving</w:t>
+            </w:r>
+            <w:r>
+              <w:rPr>
+                <w:rFonts w:ascii="Calibri" w:eastAsia="Times New Roman" w:hAnsi="Calibri" w:cs="Calibri"/>
+                <w:color w:val="000000"/>
+              </w:rPr>
+              <w:t>:</w:t>
+            </w:r>
+          </w:p>
+        </w:tc>
+      </w:tr>
+      <w:tr>
+        <w:trPr>
+          <w:gridBefore w:val="1"/>
+          <w:gridAfter w:val="1"/>
+          <w:wBefore w:w="113" w:type="dxa"/>
+          <w:wAfter w:w="524" w:type="dxa"/>
+          <w:trHeight w:val="567"/>
+        </w:trPr>
+        <w:tc>
+          <w:tcPr>
+            <w:tcW w:w="9025" w:type="dxa"/>
+            <w:gridSpan w:val="5"/>
+            <w:tcBorders>
+              <w:top w:val="single" w:sz="4" w:space="0" w:color="auto"/>
+              <w:left w:val="single" w:sz="4" w:space="0" w:color="auto"/>
+              <w:bottom w:val="single" w:sz="4" w:space="0" w:color="auto"/>
+              <w:right w:val="single" w:sz="4" w:space="0" w:color="auto"/>
+            </w:tcBorders>
+            <w:shd w:val="clear" w:color="auto" w:fill="auto"/>
+            <w:noWrap/>
+            <w:vAlign w:val="center"/>
+            <w:hideMark/>
+          </w:tcPr>
+          <w:p>
+            <w:pPr>
+              <w:spacing w:after="0" w:line="240" w:lineRule="auto"/>
+              <w:rPr>
+                <w:rFonts w:ascii="Calibri" w:eastAsia="Times New Roman" w:hAnsi="Calibri" w:cs="Calibri"/>
+                <w:color w:val="000000"/>
+              </w:rPr>
+            </w:pPr>
+            <w:r>
+              <w:rPr>
+                <w:rFonts w:ascii="Calibri" w:eastAsia="Times New Roman" w:hAnsi="Calibri" w:cs="Calibri"/>
+                <w:color w:val="000000"/>
+              </w:rPr>
+              <w:t>Als speler wil ik dat de shield powerup goed werkt zodat ik beschermt kan zijn tegen obstakels.</w:t>
+            </w:r>
+          </w:p>
+        </w:tc>
+      </w:tr>
+      <w:tr>
+        <w:trPr>
+          <w:gridBefore w:val="1"/>
+          <w:wBefore w:w="113" w:type="dxa"/>
+          <w:trHeight w:val="567"/>
+        </w:trPr>
+        <w:tc>
+          <w:tcPr>
+            <w:tcW w:w="1980" w:type="dxa"/>
+            <w:tcBorders>
+              <w:top w:val="single" w:sz="4" w:space="0" w:color="auto"/>
+              <w:left w:val="single" w:sz="4" w:space="0" w:color="auto"/>
+              <w:bottom w:val="single" w:sz="4" w:space="0" w:color="auto"/>
+              <w:right w:val="single" w:sz="4" w:space="0" w:color="auto"/>
+            </w:tcBorders>
+            <w:shd w:val="clear" w:color="auto" w:fill="BFBFBF" w:themeFill="background1" w:themeFillShade="BF"/>
+            <w:noWrap/>
+            <w:vAlign w:val="center"/>
+            <w:hideMark/>
+          </w:tcPr>
+          <w:p>
+            <w:pPr>
+              <w:spacing w:after="0" w:line="240" w:lineRule="auto"/>
+              <w:rPr>
+                <w:rFonts w:ascii="Calibri" w:eastAsia="Times New Roman" w:hAnsi="Calibri" w:cs="Calibri"/>
+                <w:b/>
+                <w:bCs/>
+                <w:color w:val="000000"/>
+              </w:rPr>
+            </w:pPr>
+            <w:r>
+              <w:rPr>
+                <w:rFonts w:ascii="Calibri" w:eastAsia="Times New Roman" w:hAnsi="Calibri" w:cs="Calibri"/>
+                <w:b/>
+                <w:bCs/>
+                <w:color w:val="000000"/>
+              </w:rPr>
+              <w:t>Business Value:</w:t>
+            </w:r>
+          </w:p>
+        </w:tc>
+        <w:tc>
+          <w:tcPr>
+            <w:tcW w:w="2551" w:type="dxa"/>
+            <w:tcBorders>
+              <w:top w:val="nil"/>
+              <w:left w:val="nil"/>
+              <w:bottom w:val="single" w:sz="4" w:space="0" w:color="auto"/>
+              <w:right w:val="single" w:sz="4" w:space="0" w:color="auto"/>
+            </w:tcBorders>
+            <w:shd w:val="clear" w:color="auto" w:fill="auto"/>
+            <w:noWrap/>
+            <w:vAlign w:val="center"/>
+            <w:hideMark/>
+          </w:tcPr>
+          <w:p>
+            <w:pPr>
+              <w:spacing w:after="0" w:line="240" w:lineRule="auto"/>
+              <w:rPr>
+                <w:rFonts w:ascii="Calibri" w:eastAsia="Times New Roman" w:hAnsi="Calibri" w:cs="Calibri"/>
+                <w:color w:val="000000"/>
+              </w:rPr>
+            </w:pPr>
+            <w:r>
+              <w:rPr>
+                <w:rFonts w:ascii="Calibri" w:eastAsia="Times New Roman" w:hAnsi="Calibri" w:cs="Calibri"/>
+                <w:color w:val="000000"/>
+              </w:rPr>
+              <w:t>3</w:t>
+            </w:r>
+          </w:p>
+        </w:tc>
+        <w:tc>
+          <w:tcPr>
+            <w:tcW w:w="2509" w:type="dxa"/>
+            <w:gridSpan w:val="2"/>
+            <w:vAlign w:val="center"/>
+          </w:tcPr>
+          <w:p>
+            <w:pPr>
+              <w:rPr>
+                <w:rFonts w:ascii="Calibri" w:eastAsia="Times New Roman" w:hAnsi="Calibri" w:cs="Calibri"/>
+                <w:color w:val="000000"/>
+              </w:rPr>
+            </w:pPr>
+            <w:r>
+              <w:rPr>
+                <w:rFonts w:ascii="Calibri" w:eastAsia="Times New Roman" w:hAnsi="Calibri" w:cs="Calibri"/>
+                <w:b/>
+                <w:bCs/>
+                <w:color w:val="000000"/>
+              </w:rPr>
+              <w:t>Story Points:</w:t>
+            </w:r>
+          </w:p>
+        </w:tc>
+        <w:tc>
+          <w:tcPr>
+            <w:tcW w:w="2509" w:type="dxa"/>
+            <w:gridSpan w:val="2"/>
+            <w:vAlign w:val="center"/>
+          </w:tcPr>
+          <w:p>
+            <w:pPr>
+              <w:rPr>
+                <w:rFonts w:ascii="Calibri" w:eastAsia="Times New Roman" w:hAnsi="Calibri" w:cs="Calibri"/>
+                <w:color w:val="000000"/>
+              </w:rPr>
+            </w:pPr>
+            <w:r>
+              <w:rPr>
+                <w:rFonts w:ascii="Calibri" w:eastAsia="Times New Roman" w:hAnsi="Calibri" w:cs="Calibri"/>
+                <w:color w:val="000000"/>
+              </w:rPr>
+              <w:t>3</w:t>
+            </w:r>
+          </w:p>
+        </w:tc>
+      </w:tr>
+      <w:tr>
+        <w:trPr>
+          <w:gridBefore w:val="1"/>
+          <w:gridAfter w:val="1"/>
+          <w:wBefore w:w="113" w:type="dxa"/>
+          <w:wAfter w:w="524" w:type="dxa"/>
+          <w:trHeight w:val="567"/>
+        </w:trPr>
+        <w:tc>
+          <w:tcPr>
+            <w:tcW w:w="9025" w:type="dxa"/>
+            <w:gridSpan w:val="5"/>
+            <w:tcBorders>
+              <w:top w:val="single" w:sz="4" w:space="0" w:color="auto"/>
+              <w:left w:val="single" w:sz="4" w:space="0" w:color="auto"/>
+              <w:bottom w:val="single" w:sz="4" w:space="0" w:color="auto"/>
+              <w:right w:val="single" w:sz="4" w:space="0" w:color="auto"/>
+            </w:tcBorders>
+            <w:shd w:val="clear" w:color="auto" w:fill="BFBFBF" w:themeFill="background1" w:themeFillShade="BF"/>
+            <w:noWrap/>
+            <w:vAlign w:val="center"/>
+            <w:hideMark/>
+          </w:tcPr>
+          <w:p>
+            <w:pPr>
+              <w:spacing w:after="0" w:line="240" w:lineRule="auto"/>
+              <w:rPr>
+                <w:rFonts w:ascii="Calibri" w:eastAsia="Times New Roman" w:hAnsi="Calibri" w:cs="Calibri"/>
+                <w:color w:val="000000"/>
+              </w:rPr>
+            </w:pPr>
+            <w:r>
+              <w:rPr>
+                <w:rFonts w:ascii="Calibri" w:eastAsia="Times New Roman" w:hAnsi="Calibri" w:cs="Calibri"/>
+                <w:b/>
+                <w:bCs/>
+                <w:color w:val="000000"/>
+              </w:rPr>
+              <w:t>Acceptatiecriteria</w:t>
+            </w:r>
+            <w:r>
+              <w:rPr>
+                <w:rFonts w:ascii="Calibri" w:eastAsia="Times New Roman" w:hAnsi="Calibri" w:cs="Calibri"/>
+                <w:color w:val="000000"/>
+              </w:rPr>
+              <w:t>:</w:t>
+            </w:r>
+          </w:p>
+        </w:tc>
+      </w:tr>
+      <w:tr>
+        <w:trPr>
+          <w:gridBefore w:val="1"/>
+          <w:gridAfter w:val="1"/>
+          <w:wBefore w:w="113" w:type="dxa"/>
+          <w:wAfter w:w="524" w:type="dxa"/>
+          <w:trHeight w:val="567"/>
+        </w:trPr>
+        <w:tc>
+          <w:tcPr>
+            <w:tcW w:w="9025" w:type="dxa"/>
+            <w:gridSpan w:val="5"/>
+            <w:tcBorders>
+              <w:top w:val="single" w:sz="4" w:space="0" w:color="auto"/>
+              <w:left w:val="single" w:sz="4" w:space="0" w:color="auto"/>
+              <w:bottom w:val="single" w:sz="4" w:space="0" w:color="auto"/>
+              <w:right w:val="single" w:sz="4" w:space="0" w:color="auto"/>
+            </w:tcBorders>
+            <w:shd w:val="clear" w:color="auto" w:fill="auto"/>
+            <w:noWrap/>
+            <w:vAlign w:val="center"/>
+            <w:hideMark/>
+          </w:tcPr>
+          <w:p>
+            <w:pPr>
+              <w:pStyle w:val="Lijstalinea"/>
               <w:numPr>
                 <w:ilvl w:val="0"/>
                 <w:numId w:val="31"/>
@@ -9341,12 +10031,12 @@
                 <w:rFonts w:ascii="Calibri" w:eastAsia="Times New Roman" w:hAnsi="Calibri" w:cs="Calibri"/>
                 <w:color w:val="000000"/>
               </w:rPr>
-              <w:t>Criteria 2…</w:t>
-            </w:r>
-          </w:p>
-          <w:p>
-            <w:pPr>
-              <w:pStyle w:val="ListParagraph"/>
+              <w:t>Speler kan niet damage nemen terwijl hij een shield heeft</w:t>
+            </w:r>
+          </w:p>
+          <w:p>
+            <w:pPr>
+              <w:pStyle w:val="Lijstalinea"/>
               <w:numPr>
                 <w:ilvl w:val="0"/>
                 <w:numId w:val="31"/>
@@ -9362,12 +10052,462 @@
                 <w:rFonts w:ascii="Calibri" w:eastAsia="Times New Roman" w:hAnsi="Calibri" w:cs="Calibri"/>
                 <w:color w:val="000000"/>
               </w:rPr>
-              <w:t>Criteria 3…</w:t>
-            </w:r>
-          </w:p>
-          <w:p>
-            <w:pPr>
-              <w:pStyle w:val="ListParagraph"/>
+              <w:t>Speler krijgt I-frames wanneer zijn shield weggaat</w:t>
+            </w:r>
+          </w:p>
+        </w:tc>
+      </w:tr>
+      <w:tr>
+        <w:trPr>
+          <w:gridAfter w:val="1"/>
+          <w:wAfter w:w="524" w:type="dxa"/>
+          <w:trHeight w:val="567"/>
+        </w:trPr>
+        <w:tc>
+          <w:tcPr>
+            <w:tcW w:w="2093" w:type="dxa"/>
+            <w:gridSpan w:val="2"/>
+            <w:tcBorders>
+              <w:top w:val="single" w:sz="4" w:space="0" w:color="auto"/>
+              <w:left w:val="single" w:sz="4" w:space="0" w:color="auto"/>
+              <w:bottom w:val="single" w:sz="4" w:space="0" w:color="auto"/>
+              <w:right w:val="single" w:sz="4" w:space="0" w:color="auto"/>
+            </w:tcBorders>
+            <w:shd w:val="clear" w:color="auto" w:fill="BFBFBF" w:themeFill="background1" w:themeFillShade="BF"/>
+            <w:noWrap/>
+            <w:vAlign w:val="center"/>
+          </w:tcPr>
+          <w:p>
+            <w:pPr>
+              <w:spacing w:after="0" w:line="240" w:lineRule="auto"/>
+              <w:rPr>
+                <w:rFonts w:ascii="Calibri" w:eastAsia="Times New Roman" w:hAnsi="Calibri" w:cs="Calibri"/>
+                <w:b/>
+                <w:bCs/>
+                <w:color w:val="000000"/>
+              </w:rPr>
+            </w:pPr>
+            <w:r>
+              <w:rPr>
+                <w:rFonts w:ascii="Calibri" w:eastAsia="Times New Roman" w:hAnsi="Calibri" w:cs="Calibri"/>
+                <w:b/>
+                <w:bCs/>
+                <w:color w:val="000000"/>
+              </w:rPr>
+              <w:lastRenderedPageBreak/>
+              <w:t>Naam student:</w:t>
+            </w:r>
+          </w:p>
+        </w:tc>
+        <w:tc>
+          <w:tcPr>
+            <w:tcW w:w="7045" w:type="dxa"/>
+            <w:gridSpan w:val="4"/>
+            <w:tcBorders>
+              <w:top w:val="single" w:sz="4" w:space="0" w:color="auto"/>
+              <w:left w:val="single" w:sz="4" w:space="0" w:color="auto"/>
+              <w:bottom w:val="single" w:sz="4" w:space="0" w:color="auto"/>
+              <w:right w:val="single" w:sz="4" w:space="0" w:color="auto"/>
+            </w:tcBorders>
+            <w:shd w:val="clear" w:color="auto" w:fill="auto"/>
+            <w:vAlign w:val="center"/>
+          </w:tcPr>
+          <w:p>
+            <w:pPr>
+              <w:spacing w:after="0" w:line="240" w:lineRule="auto"/>
+              <w:rPr>
+                <w:rFonts w:ascii="Calibri" w:eastAsia="Times New Roman" w:hAnsi="Calibri" w:cs="Calibri"/>
+                <w:color w:val="000000"/>
+              </w:rPr>
+            </w:pPr>
+            <w:r>
+              <w:rPr>
+                <w:rFonts w:ascii="Calibri" w:eastAsia="Times New Roman" w:hAnsi="Calibri" w:cs="Calibri"/>
+                <w:color w:val="000000"/>
+              </w:rPr>
+              <w:t>Jeroen Verboom</w:t>
+            </w:r>
+          </w:p>
+        </w:tc>
+      </w:tr>
+      <w:tr>
+        <w:trPr>
+          <w:gridAfter w:val="1"/>
+          <w:wAfter w:w="524" w:type="dxa"/>
+          <w:trHeight w:val="567"/>
+        </w:trPr>
+        <w:tc>
+          <w:tcPr>
+            <w:tcW w:w="2093" w:type="dxa"/>
+            <w:gridSpan w:val="2"/>
+            <w:tcBorders>
+              <w:top w:val="single" w:sz="4" w:space="0" w:color="auto"/>
+              <w:left w:val="single" w:sz="4" w:space="0" w:color="auto"/>
+              <w:bottom w:val="single" w:sz="4" w:space="0" w:color="auto"/>
+              <w:right w:val="single" w:sz="4" w:space="0" w:color="auto"/>
+            </w:tcBorders>
+            <w:shd w:val="clear" w:color="auto" w:fill="BFBFBF" w:themeFill="background1" w:themeFillShade="BF"/>
+            <w:noWrap/>
+            <w:vAlign w:val="center"/>
+            <w:hideMark/>
+          </w:tcPr>
+          <w:p>
+            <w:pPr>
+              <w:spacing w:after="0" w:line="240" w:lineRule="auto"/>
+              <w:rPr>
+                <w:rFonts w:ascii="Calibri" w:eastAsia="Times New Roman" w:hAnsi="Calibri" w:cs="Calibri"/>
+                <w:color w:val="000000"/>
+              </w:rPr>
+            </w:pPr>
+            <w:r>
+              <w:rPr>
+                <w:rFonts w:ascii="Calibri" w:eastAsia="Times New Roman" w:hAnsi="Calibri" w:cs="Calibri"/>
+                <w:b/>
+                <w:bCs/>
+                <w:color w:val="000000"/>
+              </w:rPr>
+              <w:t>Nummer &amp; Titel</w:t>
+            </w:r>
+            <w:r>
+              <w:rPr>
+                <w:rFonts w:ascii="Calibri" w:eastAsia="Times New Roman" w:hAnsi="Calibri" w:cs="Calibri"/>
+                <w:color w:val="000000"/>
+              </w:rPr>
+              <w:t>:</w:t>
+            </w:r>
+          </w:p>
+        </w:tc>
+        <w:tc>
+          <w:tcPr>
+            <w:tcW w:w="7045" w:type="dxa"/>
+            <w:gridSpan w:val="4"/>
+            <w:tcBorders>
+              <w:top w:val="single" w:sz="4" w:space="0" w:color="auto"/>
+              <w:left w:val="single" w:sz="4" w:space="0" w:color="auto"/>
+              <w:bottom w:val="single" w:sz="4" w:space="0" w:color="auto"/>
+              <w:right w:val="single" w:sz="4" w:space="0" w:color="auto"/>
+            </w:tcBorders>
+            <w:shd w:val="clear" w:color="auto" w:fill="auto"/>
+            <w:vAlign w:val="center"/>
+          </w:tcPr>
+          <w:p>
+            <w:pPr>
+              <w:spacing w:after="0" w:line="240" w:lineRule="auto"/>
+              <w:rPr>
+                <w:rFonts w:ascii="Calibri" w:eastAsia="Times New Roman" w:hAnsi="Calibri" w:cs="Calibri"/>
+                <w:color w:val="000000"/>
+              </w:rPr>
+            </w:pPr>
+            <w:r>
+              <w:rPr>
+                <w:rFonts w:ascii="Calibri" w:eastAsia="Times New Roman" w:hAnsi="Calibri" w:cs="Calibri"/>
+                <w:color w:val="000000"/>
+              </w:rPr>
+              <w:t>31. Health zichtbaar op leaderboard</w:t>
+            </w:r>
+          </w:p>
+        </w:tc>
+      </w:tr>
+      <w:tr>
+        <w:trPr>
+          <w:gridAfter w:val="1"/>
+          <w:wAfter w:w="524" w:type="dxa"/>
+          <w:trHeight w:val="567"/>
+        </w:trPr>
+        <w:tc>
+          <w:tcPr>
+            <w:tcW w:w="9138" w:type="dxa"/>
+            <w:gridSpan w:val="6"/>
+            <w:tcBorders>
+              <w:top w:val="single" w:sz="4" w:space="0" w:color="auto"/>
+              <w:left w:val="single" w:sz="4" w:space="0" w:color="auto"/>
+              <w:bottom w:val="single" w:sz="4" w:space="0" w:color="auto"/>
+              <w:right w:val="single" w:sz="4" w:space="0" w:color="auto"/>
+            </w:tcBorders>
+            <w:shd w:val="clear" w:color="auto" w:fill="BFBFBF" w:themeFill="background1" w:themeFillShade="BF"/>
+            <w:noWrap/>
+            <w:vAlign w:val="center"/>
+            <w:hideMark/>
+          </w:tcPr>
+          <w:p>
+            <w:pPr>
+              <w:spacing w:after="0" w:line="240" w:lineRule="auto"/>
+              <w:rPr>
+                <w:rFonts w:ascii="Calibri" w:eastAsia="Times New Roman" w:hAnsi="Calibri" w:cs="Calibri"/>
+                <w:color w:val="000000"/>
+              </w:rPr>
+            </w:pPr>
+            <w:r>
+              <w:rPr>
+                <w:rFonts w:ascii="Calibri" w:eastAsia="Times New Roman" w:hAnsi="Calibri" w:cs="Calibri"/>
+                <w:b/>
+                <w:bCs/>
+                <w:color w:val="000000"/>
+              </w:rPr>
+              <w:t>Omschrijving</w:t>
+            </w:r>
+            <w:r>
+              <w:rPr>
+                <w:rFonts w:ascii="Calibri" w:eastAsia="Times New Roman" w:hAnsi="Calibri" w:cs="Calibri"/>
+                <w:color w:val="000000"/>
+              </w:rPr>
+              <w:t>:</w:t>
+            </w:r>
+          </w:p>
+        </w:tc>
+      </w:tr>
+      <w:tr>
+        <w:trPr>
+          <w:gridAfter w:val="1"/>
+          <w:wAfter w:w="524" w:type="dxa"/>
+          <w:trHeight w:val="567"/>
+        </w:trPr>
+        <w:tc>
+          <w:tcPr>
+            <w:tcW w:w="9138" w:type="dxa"/>
+            <w:gridSpan w:val="6"/>
+            <w:tcBorders>
+              <w:top w:val="single" w:sz="4" w:space="0" w:color="auto"/>
+              <w:left w:val="single" w:sz="4" w:space="0" w:color="auto"/>
+              <w:bottom w:val="single" w:sz="4" w:space="0" w:color="auto"/>
+              <w:right w:val="single" w:sz="4" w:space="0" w:color="auto"/>
+            </w:tcBorders>
+            <w:shd w:val="clear" w:color="auto" w:fill="auto"/>
+            <w:noWrap/>
+            <w:vAlign w:val="center"/>
+            <w:hideMark/>
+          </w:tcPr>
+          <w:p>
+            <w:pPr>
+              <w:spacing w:after="0" w:line="240" w:lineRule="auto"/>
+              <w:rPr>
+                <w:rFonts w:ascii="Calibri" w:eastAsia="Times New Roman" w:hAnsi="Calibri" w:cs="Calibri"/>
+                <w:color w:val="000000"/>
+              </w:rPr>
+            </w:pPr>
+            <w:r>
+              <w:rPr>
+                <w:rFonts w:ascii="Calibri" w:eastAsia="Times New Roman" w:hAnsi="Calibri" w:cs="Calibri"/>
+                <w:color w:val="000000"/>
+              </w:rPr>
+              <w:t>Als speler wil ik mijn health kunnen zien op het leaderboard zodat ik weet hoeveel damage ik nog kan nemen voordat mijn auto kapot is.</w:t>
+            </w:r>
+          </w:p>
+        </w:tc>
+      </w:tr>
+      <w:tr>
+        <w:trPr>
+          <w:gridAfter w:val="1"/>
+          <w:wAfter w:w="524" w:type="dxa"/>
+          <w:trHeight w:val="567"/>
+        </w:trPr>
+        <w:tc>
+          <w:tcPr>
+            <w:tcW w:w="2093" w:type="dxa"/>
+            <w:gridSpan w:val="2"/>
+            <w:tcBorders>
+              <w:top w:val="single" w:sz="4" w:space="0" w:color="auto"/>
+              <w:left w:val="single" w:sz="4" w:space="0" w:color="auto"/>
+              <w:bottom w:val="single" w:sz="4" w:space="0" w:color="auto"/>
+              <w:right w:val="single" w:sz="4" w:space="0" w:color="auto"/>
+            </w:tcBorders>
+            <w:shd w:val="clear" w:color="auto" w:fill="BFBFBF" w:themeFill="background1" w:themeFillShade="BF"/>
+            <w:noWrap/>
+            <w:vAlign w:val="center"/>
+            <w:hideMark/>
+          </w:tcPr>
+          <w:p>
+            <w:pPr>
+              <w:spacing w:after="0" w:line="240" w:lineRule="auto"/>
+              <w:rPr>
+                <w:rFonts w:ascii="Calibri" w:eastAsia="Times New Roman" w:hAnsi="Calibri" w:cs="Calibri"/>
+                <w:b/>
+                <w:bCs/>
+                <w:color w:val="000000"/>
+              </w:rPr>
+            </w:pPr>
+            <w:r>
+              <w:rPr>
+                <w:rFonts w:ascii="Calibri" w:eastAsia="Times New Roman" w:hAnsi="Calibri" w:cs="Calibri"/>
+                <w:b/>
+                <w:bCs/>
+                <w:color w:val="000000"/>
+              </w:rPr>
+              <w:t>Business Value:</w:t>
+            </w:r>
+          </w:p>
+        </w:tc>
+        <w:tc>
+          <w:tcPr>
+            <w:tcW w:w="2551" w:type="dxa"/>
+            <w:tcBorders>
+              <w:top w:val="nil"/>
+              <w:left w:val="nil"/>
+              <w:bottom w:val="single" w:sz="4" w:space="0" w:color="auto"/>
+              <w:right w:val="single" w:sz="4" w:space="0" w:color="auto"/>
+            </w:tcBorders>
+            <w:shd w:val="clear" w:color="auto" w:fill="auto"/>
+            <w:noWrap/>
+            <w:vAlign w:val="center"/>
+            <w:hideMark/>
+          </w:tcPr>
+          <w:p>
+            <w:pPr>
+              <w:spacing w:after="0" w:line="240" w:lineRule="auto"/>
+              <w:rPr>
+                <w:rFonts w:ascii="Calibri" w:eastAsia="Times New Roman" w:hAnsi="Calibri" w:cs="Calibri"/>
+                <w:color w:val="000000"/>
+              </w:rPr>
+            </w:pPr>
+            <w:r>
+              <w:rPr>
+                <w:rFonts w:ascii="Calibri" w:eastAsia="Times New Roman" w:hAnsi="Calibri" w:cs="Calibri"/>
+                <w:color w:val="000000"/>
+              </w:rPr>
+              <w:t>4</w:t>
+            </w:r>
+          </w:p>
+        </w:tc>
+        <w:tc>
+          <w:tcPr>
+            <w:tcW w:w="1985" w:type="dxa"/>
+            <w:tcBorders>
+              <w:top w:val="nil"/>
+              <w:left w:val="nil"/>
+              <w:bottom w:val="single" w:sz="4" w:space="0" w:color="auto"/>
+              <w:right w:val="single" w:sz="4" w:space="0" w:color="auto"/>
+            </w:tcBorders>
+            <w:shd w:val="clear" w:color="auto" w:fill="BFBFBF" w:themeFill="background1" w:themeFillShade="BF"/>
+            <w:noWrap/>
+            <w:vAlign w:val="center"/>
+            <w:hideMark/>
+          </w:tcPr>
+          <w:p>
+            <w:pPr>
+              <w:spacing w:after="0" w:line="240" w:lineRule="auto"/>
+              <w:rPr>
+                <w:rFonts w:ascii="Calibri" w:eastAsia="Times New Roman" w:hAnsi="Calibri" w:cs="Calibri"/>
+                <w:b/>
+                <w:bCs/>
+                <w:color w:val="000000"/>
+              </w:rPr>
+            </w:pPr>
+            <w:r>
+              <w:rPr>
+                <w:rFonts w:ascii="Calibri" w:eastAsia="Times New Roman" w:hAnsi="Calibri" w:cs="Calibri"/>
+                <w:b/>
+                <w:bCs/>
+                <w:color w:val="000000"/>
+              </w:rPr>
+              <w:t>Story Points:</w:t>
+            </w:r>
+          </w:p>
+        </w:tc>
+        <w:tc>
+          <w:tcPr>
+            <w:tcW w:w="2509" w:type="dxa"/>
+            <w:gridSpan w:val="2"/>
+            <w:tcBorders>
+              <w:top w:val="nil"/>
+              <w:left w:val="nil"/>
+              <w:bottom w:val="single" w:sz="4" w:space="0" w:color="auto"/>
+              <w:right w:val="single" w:sz="4" w:space="0" w:color="auto"/>
+            </w:tcBorders>
+            <w:shd w:val="clear" w:color="auto" w:fill="auto"/>
+            <w:noWrap/>
+            <w:vAlign w:val="center"/>
+            <w:hideMark/>
+          </w:tcPr>
+          <w:p>
+            <w:pPr>
+              <w:spacing w:after="0" w:line="240" w:lineRule="auto"/>
+              <w:rPr>
+                <w:rFonts w:ascii="Calibri" w:eastAsia="Times New Roman" w:hAnsi="Calibri" w:cs="Calibri"/>
+                <w:color w:val="000000"/>
+              </w:rPr>
+            </w:pPr>
+            <w:r>
+              <w:rPr>
+                <w:rFonts w:ascii="Calibri" w:eastAsia="Times New Roman" w:hAnsi="Calibri" w:cs="Calibri"/>
+                <w:color w:val="000000"/>
+              </w:rPr>
+              <w:t>3</w:t>
+            </w:r>
+          </w:p>
+        </w:tc>
+      </w:tr>
+      <w:tr>
+        <w:trPr>
+          <w:gridAfter w:val="1"/>
+          <w:wAfter w:w="524" w:type="dxa"/>
+          <w:trHeight w:val="567"/>
+        </w:trPr>
+        <w:tc>
+          <w:tcPr>
+            <w:tcW w:w="9138" w:type="dxa"/>
+            <w:gridSpan w:val="6"/>
+            <w:tcBorders>
+              <w:top w:val="single" w:sz="4" w:space="0" w:color="auto"/>
+              <w:left w:val="single" w:sz="4" w:space="0" w:color="auto"/>
+              <w:bottom w:val="single" w:sz="4" w:space="0" w:color="auto"/>
+              <w:right w:val="single" w:sz="4" w:space="0" w:color="auto"/>
+            </w:tcBorders>
+            <w:shd w:val="clear" w:color="auto" w:fill="BFBFBF" w:themeFill="background1" w:themeFillShade="BF"/>
+            <w:noWrap/>
+            <w:vAlign w:val="center"/>
+            <w:hideMark/>
+          </w:tcPr>
+          <w:p>
+            <w:pPr>
+              <w:spacing w:after="0" w:line="240" w:lineRule="auto"/>
+              <w:rPr>
+                <w:rFonts w:ascii="Calibri" w:eastAsia="Times New Roman" w:hAnsi="Calibri" w:cs="Calibri"/>
+                <w:color w:val="000000"/>
+              </w:rPr>
+            </w:pPr>
+            <w:r>
+              <w:rPr>
+                <w:rFonts w:ascii="Calibri" w:eastAsia="Times New Roman" w:hAnsi="Calibri" w:cs="Calibri"/>
+                <w:b/>
+                <w:bCs/>
+                <w:color w:val="000000"/>
+              </w:rPr>
+              <w:t>Acceptatiecriteria</w:t>
+            </w:r>
+            <w:r>
+              <w:rPr>
+                <w:rFonts w:ascii="Calibri" w:eastAsia="Times New Roman" w:hAnsi="Calibri" w:cs="Calibri"/>
+                <w:color w:val="000000"/>
+              </w:rPr>
+              <w:t>:</w:t>
+            </w:r>
+          </w:p>
+        </w:tc>
+      </w:tr>
+      <w:tr>
+        <w:trPr>
+          <w:gridAfter w:val="1"/>
+          <w:wAfter w:w="524" w:type="dxa"/>
+          <w:trHeight w:val="567"/>
+        </w:trPr>
+        <w:tc>
+          <w:tcPr>
+            <w:tcW w:w="9138" w:type="dxa"/>
+            <w:gridSpan w:val="6"/>
+            <w:tcBorders>
+              <w:top w:val="single" w:sz="4" w:space="0" w:color="auto"/>
+              <w:left w:val="single" w:sz="4" w:space="0" w:color="auto"/>
+              <w:bottom w:val="single" w:sz="4" w:space="0" w:color="auto"/>
+              <w:right w:val="single" w:sz="4" w:space="0" w:color="auto"/>
+            </w:tcBorders>
+            <w:shd w:val="clear" w:color="auto" w:fill="auto"/>
+            <w:noWrap/>
+            <w:vAlign w:val="center"/>
+            <w:hideMark/>
+          </w:tcPr>
+          <w:p>
+            <w:pPr>
+              <w:pStyle w:val="Lijstalinea"/>
               <w:numPr>
                 <w:ilvl w:val="0"/>
                 <w:numId w:val="31"/>
@@ -9383,7 +10523,996 @@
                 <w:rFonts w:ascii="Calibri" w:eastAsia="Times New Roman" w:hAnsi="Calibri" w:cs="Calibri"/>
                 <w:color w:val="000000"/>
               </w:rPr>
-              <w:t>Etc.</w:t>
+              <w:t>Speler huidige health word laten zien op het leaderboard.</w:t>
+            </w:r>
+          </w:p>
+        </w:tc>
+      </w:tr>
+      <w:tr>
+        <w:trPr>
+          <w:gridAfter w:val="1"/>
+          <w:wAfter w:w="524" w:type="dxa"/>
+          <w:trHeight w:val="567"/>
+        </w:trPr>
+        <w:tc>
+          <w:tcPr>
+            <w:tcW w:w="2093" w:type="dxa"/>
+            <w:gridSpan w:val="2"/>
+            <w:tcBorders>
+              <w:top w:val="single" w:sz="4" w:space="0" w:color="auto"/>
+              <w:left w:val="single" w:sz="4" w:space="0" w:color="auto"/>
+              <w:bottom w:val="single" w:sz="4" w:space="0" w:color="auto"/>
+              <w:right w:val="single" w:sz="4" w:space="0" w:color="auto"/>
+            </w:tcBorders>
+            <w:shd w:val="clear" w:color="auto" w:fill="BFBFBF" w:themeFill="background1" w:themeFillShade="BF"/>
+            <w:noWrap/>
+            <w:vAlign w:val="center"/>
+          </w:tcPr>
+          <w:p>
+            <w:pPr>
+              <w:spacing w:after="0" w:line="240" w:lineRule="auto"/>
+              <w:rPr>
+                <w:rFonts w:ascii="Calibri" w:eastAsia="Times New Roman" w:hAnsi="Calibri" w:cs="Calibri"/>
+                <w:b/>
+                <w:bCs/>
+                <w:color w:val="000000"/>
+              </w:rPr>
+            </w:pPr>
+            <w:r>
+              <w:rPr>
+                <w:rFonts w:ascii="Calibri" w:eastAsia="Times New Roman" w:hAnsi="Calibri" w:cs="Calibri"/>
+                <w:b/>
+                <w:bCs/>
+                <w:color w:val="000000"/>
+              </w:rPr>
+              <w:t>Naam student:</w:t>
+            </w:r>
+          </w:p>
+        </w:tc>
+        <w:tc>
+          <w:tcPr>
+            <w:tcW w:w="7045" w:type="dxa"/>
+            <w:gridSpan w:val="4"/>
+            <w:tcBorders>
+              <w:top w:val="single" w:sz="4" w:space="0" w:color="auto"/>
+              <w:left w:val="single" w:sz="4" w:space="0" w:color="auto"/>
+              <w:bottom w:val="single" w:sz="4" w:space="0" w:color="auto"/>
+              <w:right w:val="single" w:sz="4" w:space="0" w:color="auto"/>
+            </w:tcBorders>
+            <w:shd w:val="clear" w:color="auto" w:fill="auto"/>
+            <w:vAlign w:val="center"/>
+          </w:tcPr>
+          <w:p>
+            <w:pPr>
+              <w:spacing w:after="0" w:line="240" w:lineRule="auto"/>
+              <w:rPr>
+                <w:rFonts w:ascii="Calibri" w:eastAsia="Times New Roman" w:hAnsi="Calibri" w:cs="Calibri"/>
+                <w:color w:val="000000"/>
+              </w:rPr>
+            </w:pPr>
+            <w:r>
+              <w:rPr>
+                <w:rFonts w:ascii="Calibri" w:eastAsia="Times New Roman" w:hAnsi="Calibri" w:cs="Calibri"/>
+                <w:color w:val="000000"/>
+              </w:rPr>
+              <w:t>J</w:t>
+            </w:r>
+            <w:r>
+              <w:rPr>
+                <w:rFonts w:ascii="Calibri" w:eastAsia="Times New Roman" w:hAnsi="Calibri" w:cs="Calibri"/>
+                <w:color w:val="000000"/>
+              </w:rPr>
+              <w:t>orick Wassink</w:t>
+            </w:r>
+          </w:p>
+        </w:tc>
+      </w:tr>
+      <w:tr>
+        <w:trPr>
+          <w:gridAfter w:val="1"/>
+          <w:wAfter w:w="524" w:type="dxa"/>
+          <w:trHeight w:val="567"/>
+        </w:trPr>
+        <w:tc>
+          <w:tcPr>
+            <w:tcW w:w="2093" w:type="dxa"/>
+            <w:gridSpan w:val="2"/>
+            <w:tcBorders>
+              <w:top w:val="single" w:sz="4" w:space="0" w:color="auto"/>
+              <w:left w:val="single" w:sz="4" w:space="0" w:color="auto"/>
+              <w:bottom w:val="single" w:sz="4" w:space="0" w:color="auto"/>
+              <w:right w:val="single" w:sz="4" w:space="0" w:color="auto"/>
+            </w:tcBorders>
+            <w:shd w:val="clear" w:color="auto" w:fill="BFBFBF" w:themeFill="background1" w:themeFillShade="BF"/>
+            <w:noWrap/>
+            <w:vAlign w:val="center"/>
+            <w:hideMark/>
+          </w:tcPr>
+          <w:p>
+            <w:pPr>
+              <w:spacing w:after="0" w:line="240" w:lineRule="auto"/>
+              <w:rPr>
+                <w:rFonts w:ascii="Calibri" w:eastAsia="Times New Roman" w:hAnsi="Calibri" w:cs="Calibri"/>
+                <w:color w:val="000000"/>
+              </w:rPr>
+            </w:pPr>
+            <w:r>
+              <w:rPr>
+                <w:rFonts w:ascii="Calibri" w:eastAsia="Times New Roman" w:hAnsi="Calibri" w:cs="Calibri"/>
+                <w:b/>
+                <w:bCs/>
+                <w:color w:val="000000"/>
+              </w:rPr>
+              <w:t>Nummer &amp; Titel</w:t>
+            </w:r>
+            <w:r>
+              <w:rPr>
+                <w:rFonts w:ascii="Calibri" w:eastAsia="Times New Roman" w:hAnsi="Calibri" w:cs="Calibri"/>
+                <w:color w:val="000000"/>
+              </w:rPr>
+              <w:t>:</w:t>
+            </w:r>
+          </w:p>
+        </w:tc>
+        <w:tc>
+          <w:tcPr>
+            <w:tcW w:w="7045" w:type="dxa"/>
+            <w:gridSpan w:val="4"/>
+            <w:tcBorders>
+              <w:top w:val="single" w:sz="4" w:space="0" w:color="auto"/>
+              <w:left w:val="single" w:sz="4" w:space="0" w:color="auto"/>
+              <w:bottom w:val="single" w:sz="4" w:space="0" w:color="auto"/>
+              <w:right w:val="single" w:sz="4" w:space="0" w:color="auto"/>
+            </w:tcBorders>
+            <w:shd w:val="clear" w:color="auto" w:fill="auto"/>
+            <w:vAlign w:val="center"/>
+          </w:tcPr>
+          <w:p>
+            <w:pPr>
+              <w:spacing w:after="0" w:line="240" w:lineRule="auto"/>
+              <w:rPr>
+                <w:rFonts w:ascii="Calibri" w:eastAsia="Times New Roman" w:hAnsi="Calibri" w:cs="Calibri"/>
+                <w:color w:val="000000"/>
+              </w:rPr>
+            </w:pPr>
+            <w:r>
+              <w:rPr>
+                <w:rFonts w:ascii="Calibri" w:eastAsia="Times New Roman" w:hAnsi="Calibri" w:cs="Calibri"/>
+                <w:color w:val="000000"/>
+              </w:rPr>
+              <w:t>32. debuffs uitdelen volgens leaderboard</w:t>
+            </w:r>
+          </w:p>
+        </w:tc>
+      </w:tr>
+      <w:tr>
+        <w:trPr>
+          <w:gridAfter w:val="1"/>
+          <w:wAfter w:w="524" w:type="dxa"/>
+          <w:trHeight w:val="567"/>
+        </w:trPr>
+        <w:tc>
+          <w:tcPr>
+            <w:tcW w:w="9138" w:type="dxa"/>
+            <w:gridSpan w:val="6"/>
+            <w:tcBorders>
+              <w:top w:val="single" w:sz="4" w:space="0" w:color="auto"/>
+              <w:left w:val="single" w:sz="4" w:space="0" w:color="auto"/>
+              <w:bottom w:val="single" w:sz="4" w:space="0" w:color="auto"/>
+              <w:right w:val="single" w:sz="4" w:space="0" w:color="auto"/>
+            </w:tcBorders>
+            <w:shd w:val="clear" w:color="auto" w:fill="BFBFBF" w:themeFill="background1" w:themeFillShade="BF"/>
+            <w:noWrap/>
+            <w:vAlign w:val="center"/>
+            <w:hideMark/>
+          </w:tcPr>
+          <w:p>
+            <w:pPr>
+              <w:spacing w:after="0" w:line="240" w:lineRule="auto"/>
+              <w:rPr>
+                <w:rFonts w:ascii="Calibri" w:eastAsia="Times New Roman" w:hAnsi="Calibri" w:cs="Calibri"/>
+                <w:color w:val="000000"/>
+              </w:rPr>
+            </w:pPr>
+            <w:r>
+              <w:rPr>
+                <w:rFonts w:ascii="Calibri" w:eastAsia="Times New Roman" w:hAnsi="Calibri" w:cs="Calibri"/>
+                <w:b/>
+                <w:bCs/>
+                <w:color w:val="000000"/>
+              </w:rPr>
+              <w:t>Omschrijving</w:t>
+            </w:r>
+            <w:r>
+              <w:rPr>
+                <w:rFonts w:ascii="Calibri" w:eastAsia="Times New Roman" w:hAnsi="Calibri" w:cs="Calibri"/>
+                <w:color w:val="000000"/>
+              </w:rPr>
+              <w:t>:</w:t>
+            </w:r>
+          </w:p>
+        </w:tc>
+      </w:tr>
+      <w:tr>
+        <w:trPr>
+          <w:gridAfter w:val="1"/>
+          <w:wAfter w:w="524" w:type="dxa"/>
+          <w:trHeight w:val="567"/>
+        </w:trPr>
+        <w:tc>
+          <w:tcPr>
+            <w:tcW w:w="9138" w:type="dxa"/>
+            <w:gridSpan w:val="6"/>
+            <w:tcBorders>
+              <w:top w:val="single" w:sz="4" w:space="0" w:color="auto"/>
+              <w:left w:val="single" w:sz="4" w:space="0" w:color="auto"/>
+              <w:bottom w:val="single" w:sz="4" w:space="0" w:color="auto"/>
+              <w:right w:val="single" w:sz="4" w:space="0" w:color="auto"/>
+            </w:tcBorders>
+            <w:shd w:val="clear" w:color="auto" w:fill="auto"/>
+            <w:noWrap/>
+            <w:vAlign w:val="center"/>
+            <w:hideMark/>
+          </w:tcPr>
+          <w:p>
+            <w:pPr>
+              <w:spacing w:after="0" w:line="240" w:lineRule="auto"/>
+              <w:rPr>
+                <w:rFonts w:ascii="Calibri" w:eastAsia="Times New Roman" w:hAnsi="Calibri" w:cs="Calibri"/>
+                <w:color w:val="000000"/>
+              </w:rPr>
+            </w:pPr>
+            <w:r>
+              <w:rPr>
+                <w:rFonts w:ascii="Calibri" w:eastAsia="Times New Roman" w:hAnsi="Calibri" w:cs="Calibri"/>
+                <w:color w:val="000000"/>
+              </w:rPr>
+              <w:t>Als speler wil ik debuffs uitdelen aan de mensen die boven mij staan op het leaderboard zodat ik beter kan winnen tegen mijn medespelers.</w:t>
+            </w:r>
+          </w:p>
+        </w:tc>
+      </w:tr>
+      <w:tr>
+        <w:trPr>
+          <w:gridAfter w:val="1"/>
+          <w:wAfter w:w="524" w:type="dxa"/>
+          <w:trHeight w:val="567"/>
+        </w:trPr>
+        <w:tc>
+          <w:tcPr>
+            <w:tcW w:w="2093" w:type="dxa"/>
+            <w:gridSpan w:val="2"/>
+            <w:tcBorders>
+              <w:top w:val="single" w:sz="4" w:space="0" w:color="auto"/>
+              <w:left w:val="single" w:sz="4" w:space="0" w:color="auto"/>
+              <w:bottom w:val="single" w:sz="4" w:space="0" w:color="auto"/>
+              <w:right w:val="single" w:sz="4" w:space="0" w:color="auto"/>
+            </w:tcBorders>
+            <w:shd w:val="clear" w:color="auto" w:fill="BFBFBF" w:themeFill="background1" w:themeFillShade="BF"/>
+            <w:noWrap/>
+            <w:vAlign w:val="center"/>
+            <w:hideMark/>
+          </w:tcPr>
+          <w:p>
+            <w:pPr>
+              <w:spacing w:after="0" w:line="240" w:lineRule="auto"/>
+              <w:rPr>
+                <w:rFonts w:ascii="Calibri" w:eastAsia="Times New Roman" w:hAnsi="Calibri" w:cs="Calibri"/>
+                <w:b/>
+                <w:bCs/>
+                <w:color w:val="000000"/>
+              </w:rPr>
+            </w:pPr>
+            <w:r>
+              <w:rPr>
+                <w:rFonts w:ascii="Calibri" w:eastAsia="Times New Roman" w:hAnsi="Calibri" w:cs="Calibri"/>
+                <w:b/>
+                <w:bCs/>
+                <w:color w:val="000000"/>
+              </w:rPr>
+              <w:t>Business Value:</w:t>
+            </w:r>
+          </w:p>
+        </w:tc>
+        <w:tc>
+          <w:tcPr>
+            <w:tcW w:w="2551" w:type="dxa"/>
+            <w:tcBorders>
+              <w:top w:val="nil"/>
+              <w:left w:val="nil"/>
+              <w:bottom w:val="single" w:sz="4" w:space="0" w:color="auto"/>
+              <w:right w:val="single" w:sz="4" w:space="0" w:color="auto"/>
+            </w:tcBorders>
+            <w:shd w:val="clear" w:color="auto" w:fill="auto"/>
+            <w:noWrap/>
+            <w:vAlign w:val="center"/>
+            <w:hideMark/>
+          </w:tcPr>
+          <w:p>
+            <w:pPr>
+              <w:spacing w:after="0" w:line="240" w:lineRule="auto"/>
+              <w:rPr>
+                <w:rFonts w:ascii="Calibri" w:eastAsia="Times New Roman" w:hAnsi="Calibri" w:cs="Calibri"/>
+                <w:color w:val="000000"/>
+              </w:rPr>
+            </w:pPr>
+            <w:r>
+              <w:rPr>
+                <w:rFonts w:ascii="Calibri" w:eastAsia="Times New Roman" w:hAnsi="Calibri" w:cs="Calibri"/>
+                <w:color w:val="000000"/>
+              </w:rPr>
+              <w:t>5</w:t>
+            </w:r>
+          </w:p>
+        </w:tc>
+        <w:tc>
+          <w:tcPr>
+            <w:tcW w:w="1985" w:type="dxa"/>
+            <w:tcBorders>
+              <w:top w:val="nil"/>
+              <w:left w:val="nil"/>
+              <w:bottom w:val="single" w:sz="4" w:space="0" w:color="auto"/>
+              <w:right w:val="single" w:sz="4" w:space="0" w:color="auto"/>
+            </w:tcBorders>
+            <w:shd w:val="clear" w:color="auto" w:fill="BFBFBF" w:themeFill="background1" w:themeFillShade="BF"/>
+            <w:noWrap/>
+            <w:vAlign w:val="center"/>
+            <w:hideMark/>
+          </w:tcPr>
+          <w:p>
+            <w:pPr>
+              <w:spacing w:after="0" w:line="240" w:lineRule="auto"/>
+              <w:rPr>
+                <w:rFonts w:ascii="Calibri" w:eastAsia="Times New Roman" w:hAnsi="Calibri" w:cs="Calibri"/>
+                <w:b/>
+                <w:bCs/>
+                <w:color w:val="000000"/>
+              </w:rPr>
+            </w:pPr>
+            <w:r>
+              <w:rPr>
+                <w:rFonts w:ascii="Calibri" w:eastAsia="Times New Roman" w:hAnsi="Calibri" w:cs="Calibri"/>
+                <w:b/>
+                <w:bCs/>
+                <w:color w:val="000000"/>
+              </w:rPr>
+              <w:t>Story Points:</w:t>
+            </w:r>
+          </w:p>
+        </w:tc>
+        <w:tc>
+          <w:tcPr>
+            <w:tcW w:w="2509" w:type="dxa"/>
+            <w:gridSpan w:val="2"/>
+            <w:tcBorders>
+              <w:top w:val="nil"/>
+              <w:left w:val="nil"/>
+              <w:bottom w:val="single" w:sz="4" w:space="0" w:color="auto"/>
+              <w:right w:val="single" w:sz="4" w:space="0" w:color="auto"/>
+            </w:tcBorders>
+            <w:shd w:val="clear" w:color="auto" w:fill="auto"/>
+            <w:noWrap/>
+            <w:vAlign w:val="center"/>
+            <w:hideMark/>
+          </w:tcPr>
+          <w:p>
+            <w:pPr>
+              <w:spacing w:after="0" w:line="240" w:lineRule="auto"/>
+              <w:rPr>
+                <w:rFonts w:ascii="Calibri" w:eastAsia="Times New Roman" w:hAnsi="Calibri" w:cs="Calibri"/>
+                <w:color w:val="000000"/>
+              </w:rPr>
+            </w:pPr>
+            <w:r>
+              <w:rPr>
+                <w:rFonts w:ascii="Calibri" w:eastAsia="Times New Roman" w:hAnsi="Calibri" w:cs="Calibri"/>
+                <w:color w:val="000000"/>
+              </w:rPr>
+              <w:t>8</w:t>
+            </w:r>
+          </w:p>
+        </w:tc>
+      </w:tr>
+      <w:tr>
+        <w:trPr>
+          <w:gridAfter w:val="1"/>
+          <w:wAfter w:w="524" w:type="dxa"/>
+          <w:trHeight w:val="567"/>
+        </w:trPr>
+        <w:tc>
+          <w:tcPr>
+            <w:tcW w:w="9138" w:type="dxa"/>
+            <w:gridSpan w:val="6"/>
+            <w:tcBorders>
+              <w:top w:val="single" w:sz="4" w:space="0" w:color="auto"/>
+              <w:left w:val="single" w:sz="4" w:space="0" w:color="auto"/>
+              <w:bottom w:val="single" w:sz="4" w:space="0" w:color="auto"/>
+              <w:right w:val="single" w:sz="4" w:space="0" w:color="auto"/>
+            </w:tcBorders>
+            <w:shd w:val="clear" w:color="auto" w:fill="BFBFBF" w:themeFill="background1" w:themeFillShade="BF"/>
+            <w:noWrap/>
+            <w:vAlign w:val="center"/>
+            <w:hideMark/>
+          </w:tcPr>
+          <w:p>
+            <w:pPr>
+              <w:spacing w:after="0" w:line="240" w:lineRule="auto"/>
+              <w:rPr>
+                <w:rFonts w:ascii="Calibri" w:eastAsia="Times New Roman" w:hAnsi="Calibri" w:cs="Calibri"/>
+                <w:color w:val="000000"/>
+              </w:rPr>
+            </w:pPr>
+            <w:r>
+              <w:rPr>
+                <w:rFonts w:ascii="Calibri" w:eastAsia="Times New Roman" w:hAnsi="Calibri" w:cs="Calibri"/>
+                <w:b/>
+                <w:bCs/>
+                <w:color w:val="000000"/>
+              </w:rPr>
+              <w:t>Acceptatiecriteria</w:t>
+            </w:r>
+            <w:r>
+              <w:rPr>
+                <w:rFonts w:ascii="Calibri" w:eastAsia="Times New Roman" w:hAnsi="Calibri" w:cs="Calibri"/>
+                <w:color w:val="000000"/>
+              </w:rPr>
+              <w:t>:</w:t>
+            </w:r>
+          </w:p>
+        </w:tc>
+      </w:tr>
+      <w:tr>
+        <w:trPr>
+          <w:gridAfter w:val="1"/>
+          <w:wAfter w:w="524" w:type="dxa"/>
+          <w:trHeight w:val="567"/>
+        </w:trPr>
+        <w:tc>
+          <w:tcPr>
+            <w:tcW w:w="9138" w:type="dxa"/>
+            <w:gridSpan w:val="6"/>
+            <w:tcBorders>
+              <w:top w:val="single" w:sz="4" w:space="0" w:color="auto"/>
+              <w:left w:val="single" w:sz="4" w:space="0" w:color="auto"/>
+              <w:bottom w:val="single" w:sz="4" w:space="0" w:color="auto"/>
+              <w:right w:val="single" w:sz="4" w:space="0" w:color="auto"/>
+            </w:tcBorders>
+            <w:shd w:val="clear" w:color="auto" w:fill="auto"/>
+            <w:noWrap/>
+            <w:vAlign w:val="center"/>
+            <w:hideMark/>
+          </w:tcPr>
+          <w:p>
+            <w:pPr>
+              <w:pStyle w:val="Lijstalinea"/>
+              <w:numPr>
+                <w:ilvl w:val="0"/>
+                <w:numId w:val="31"/>
+              </w:numPr>
+              <w:spacing w:before="240" w:line="240" w:lineRule="auto"/>
+              <w:rPr>
+                <w:rFonts w:ascii="Calibri" w:eastAsia="Times New Roman" w:hAnsi="Calibri" w:cs="Calibri"/>
+                <w:color w:val="000000"/>
+              </w:rPr>
+            </w:pPr>
+            <w:r>
+              <w:rPr>
+                <w:rFonts w:ascii="Calibri" w:eastAsia="Times New Roman" w:hAnsi="Calibri" w:cs="Calibri"/>
+                <w:color w:val="000000"/>
+              </w:rPr>
+              <w:t>Speler huidige health word laten zien op het leaderboard.</w:t>
+            </w:r>
+          </w:p>
+        </w:tc>
+      </w:tr>
+      <w:tr>
+        <w:trPr>
+          <w:gridAfter w:val="1"/>
+          <w:wAfter w:w="524" w:type="dxa"/>
+          <w:trHeight w:val="567"/>
+        </w:trPr>
+        <w:tc>
+          <w:tcPr>
+            <w:tcW w:w="2093" w:type="dxa"/>
+            <w:gridSpan w:val="2"/>
+            <w:tcBorders>
+              <w:top w:val="single" w:sz="4" w:space="0" w:color="auto"/>
+              <w:left w:val="single" w:sz="4" w:space="0" w:color="auto"/>
+              <w:bottom w:val="single" w:sz="4" w:space="0" w:color="auto"/>
+              <w:right w:val="single" w:sz="4" w:space="0" w:color="auto"/>
+            </w:tcBorders>
+            <w:shd w:val="clear" w:color="auto" w:fill="BFBFBF" w:themeFill="background1" w:themeFillShade="BF"/>
+            <w:noWrap/>
+            <w:vAlign w:val="center"/>
+          </w:tcPr>
+          <w:p>
+            <w:pPr>
+              <w:spacing w:after="0" w:line="240" w:lineRule="auto"/>
+              <w:rPr>
+                <w:rFonts w:ascii="Calibri" w:eastAsia="Times New Roman" w:hAnsi="Calibri" w:cs="Calibri"/>
+                <w:b/>
+                <w:bCs/>
+                <w:color w:val="000000"/>
+              </w:rPr>
+            </w:pPr>
+            <w:r>
+              <w:rPr>
+                <w:rFonts w:ascii="Calibri" w:eastAsia="Times New Roman" w:hAnsi="Calibri" w:cs="Calibri"/>
+                <w:b/>
+                <w:bCs/>
+                <w:color w:val="000000"/>
+              </w:rPr>
+              <w:t>Naam student:</w:t>
+            </w:r>
+          </w:p>
+        </w:tc>
+        <w:tc>
+          <w:tcPr>
+            <w:tcW w:w="7045" w:type="dxa"/>
+            <w:gridSpan w:val="4"/>
+            <w:tcBorders>
+              <w:top w:val="single" w:sz="4" w:space="0" w:color="auto"/>
+              <w:left w:val="single" w:sz="4" w:space="0" w:color="auto"/>
+              <w:bottom w:val="single" w:sz="4" w:space="0" w:color="auto"/>
+              <w:right w:val="single" w:sz="4" w:space="0" w:color="auto"/>
+            </w:tcBorders>
+            <w:shd w:val="clear" w:color="auto" w:fill="auto"/>
+            <w:vAlign w:val="center"/>
+          </w:tcPr>
+          <w:p>
+            <w:pPr>
+              <w:spacing w:after="0" w:line="240" w:lineRule="auto"/>
+              <w:rPr>
+                <w:rFonts w:ascii="Calibri" w:eastAsia="Times New Roman" w:hAnsi="Calibri" w:cs="Calibri"/>
+                <w:color w:val="000000"/>
+              </w:rPr>
+            </w:pPr>
+            <w:r>
+              <w:rPr>
+                <w:rFonts w:ascii="Calibri" w:eastAsia="Times New Roman" w:hAnsi="Calibri" w:cs="Calibri"/>
+                <w:color w:val="000000"/>
+              </w:rPr>
+              <w:t>Thom Hermelink</w:t>
+            </w:r>
+          </w:p>
+        </w:tc>
+      </w:tr>
+      <w:tr>
+        <w:trPr>
+          <w:gridAfter w:val="1"/>
+          <w:wAfter w:w="524" w:type="dxa"/>
+          <w:trHeight w:val="567"/>
+        </w:trPr>
+        <w:tc>
+          <w:tcPr>
+            <w:tcW w:w="2093" w:type="dxa"/>
+            <w:gridSpan w:val="2"/>
+            <w:tcBorders>
+              <w:top w:val="single" w:sz="4" w:space="0" w:color="auto"/>
+              <w:left w:val="single" w:sz="4" w:space="0" w:color="auto"/>
+              <w:bottom w:val="single" w:sz="4" w:space="0" w:color="auto"/>
+              <w:right w:val="single" w:sz="4" w:space="0" w:color="auto"/>
+            </w:tcBorders>
+            <w:shd w:val="clear" w:color="auto" w:fill="BFBFBF" w:themeFill="background1" w:themeFillShade="BF"/>
+            <w:noWrap/>
+            <w:vAlign w:val="center"/>
+            <w:hideMark/>
+          </w:tcPr>
+          <w:p>
+            <w:pPr>
+              <w:spacing w:after="0" w:line="240" w:lineRule="auto"/>
+              <w:rPr>
+                <w:rFonts w:ascii="Calibri" w:eastAsia="Times New Roman" w:hAnsi="Calibri" w:cs="Calibri"/>
+                <w:color w:val="000000"/>
+              </w:rPr>
+            </w:pPr>
+            <w:r>
+              <w:rPr>
+                <w:rFonts w:ascii="Calibri" w:eastAsia="Times New Roman" w:hAnsi="Calibri" w:cs="Calibri"/>
+                <w:b/>
+                <w:bCs/>
+                <w:color w:val="000000"/>
+              </w:rPr>
+              <w:t>Nummer &amp; Titel</w:t>
+            </w:r>
+            <w:r>
+              <w:rPr>
+                <w:rFonts w:ascii="Calibri" w:eastAsia="Times New Roman" w:hAnsi="Calibri" w:cs="Calibri"/>
+                <w:color w:val="000000"/>
+              </w:rPr>
+              <w:t>:</w:t>
+            </w:r>
+          </w:p>
+        </w:tc>
+        <w:tc>
+          <w:tcPr>
+            <w:tcW w:w="7045" w:type="dxa"/>
+            <w:gridSpan w:val="4"/>
+            <w:tcBorders>
+              <w:top w:val="single" w:sz="4" w:space="0" w:color="auto"/>
+              <w:left w:val="single" w:sz="4" w:space="0" w:color="auto"/>
+              <w:bottom w:val="single" w:sz="4" w:space="0" w:color="auto"/>
+              <w:right w:val="single" w:sz="4" w:space="0" w:color="auto"/>
+            </w:tcBorders>
+            <w:shd w:val="clear" w:color="auto" w:fill="auto"/>
+            <w:vAlign w:val="center"/>
+          </w:tcPr>
+          <w:p>
+            <w:pPr>
+              <w:spacing w:after="0" w:line="240" w:lineRule="auto"/>
+              <w:rPr>
+                <w:rFonts w:ascii="Calibri" w:eastAsia="Times New Roman" w:hAnsi="Calibri" w:cs="Calibri"/>
+                <w:color w:val="000000"/>
+              </w:rPr>
+            </w:pPr>
+            <w:r>
+              <w:rPr>
+                <w:rFonts w:ascii="Calibri" w:eastAsia="Times New Roman" w:hAnsi="Calibri" w:cs="Calibri"/>
+                <w:color w:val="000000"/>
+              </w:rPr>
+              <w:t>3</w:t>
+            </w:r>
+            <w:r>
+              <w:rPr>
+                <w:rFonts w:ascii="Calibri" w:eastAsia="Times New Roman" w:hAnsi="Calibri" w:cs="Calibri"/>
+                <w:color w:val="000000"/>
+              </w:rPr>
+              <w:t>3</w:t>
+            </w:r>
+            <w:r>
+              <w:rPr>
+                <w:rFonts w:ascii="Calibri" w:eastAsia="Times New Roman" w:hAnsi="Calibri" w:cs="Calibri"/>
+                <w:color w:val="000000"/>
+              </w:rPr>
+              <w:t xml:space="preserve">. </w:t>
+            </w:r>
+            <w:r>
+              <w:rPr>
+                <w:rFonts w:ascii="Calibri" w:eastAsia="Times New Roman" w:hAnsi="Calibri" w:cs="Calibri"/>
+                <w:color w:val="000000"/>
+              </w:rPr>
+              <w:t xml:space="preserve">Turrets draaien </w:t>
+            </w:r>
+          </w:p>
+        </w:tc>
+      </w:tr>
+      <w:tr>
+        <w:trPr>
+          <w:gridAfter w:val="1"/>
+          <w:wAfter w:w="524" w:type="dxa"/>
+          <w:trHeight w:val="567"/>
+        </w:trPr>
+        <w:tc>
+          <w:tcPr>
+            <w:tcW w:w="9138" w:type="dxa"/>
+            <w:gridSpan w:val="6"/>
+            <w:tcBorders>
+              <w:top w:val="single" w:sz="4" w:space="0" w:color="auto"/>
+              <w:left w:val="single" w:sz="4" w:space="0" w:color="auto"/>
+              <w:bottom w:val="single" w:sz="4" w:space="0" w:color="auto"/>
+              <w:right w:val="single" w:sz="4" w:space="0" w:color="auto"/>
+            </w:tcBorders>
+            <w:shd w:val="clear" w:color="auto" w:fill="BFBFBF" w:themeFill="background1" w:themeFillShade="BF"/>
+            <w:noWrap/>
+            <w:vAlign w:val="center"/>
+            <w:hideMark/>
+          </w:tcPr>
+          <w:p>
+            <w:pPr>
+              <w:spacing w:after="0" w:line="240" w:lineRule="auto"/>
+              <w:rPr>
+                <w:rFonts w:ascii="Calibri" w:eastAsia="Times New Roman" w:hAnsi="Calibri" w:cs="Calibri"/>
+                <w:color w:val="000000"/>
+              </w:rPr>
+            </w:pPr>
+            <w:r>
+              <w:rPr>
+                <w:rFonts w:ascii="Calibri" w:eastAsia="Times New Roman" w:hAnsi="Calibri" w:cs="Calibri"/>
+                <w:b/>
+                <w:bCs/>
+                <w:color w:val="000000"/>
+              </w:rPr>
+              <w:t>Omschrijving</w:t>
+            </w:r>
+            <w:r>
+              <w:rPr>
+                <w:rFonts w:ascii="Calibri" w:eastAsia="Times New Roman" w:hAnsi="Calibri" w:cs="Calibri"/>
+                <w:color w:val="000000"/>
+              </w:rPr>
+              <w:t>:</w:t>
+            </w:r>
+          </w:p>
+        </w:tc>
+      </w:tr>
+      <w:tr>
+        <w:trPr>
+          <w:gridAfter w:val="1"/>
+          <w:wAfter w:w="524" w:type="dxa"/>
+          <w:trHeight w:val="567"/>
+        </w:trPr>
+        <w:tc>
+          <w:tcPr>
+            <w:tcW w:w="9138" w:type="dxa"/>
+            <w:gridSpan w:val="6"/>
+            <w:tcBorders>
+              <w:top w:val="single" w:sz="4" w:space="0" w:color="auto"/>
+              <w:left w:val="single" w:sz="4" w:space="0" w:color="auto"/>
+              <w:bottom w:val="single" w:sz="4" w:space="0" w:color="auto"/>
+              <w:right w:val="single" w:sz="4" w:space="0" w:color="auto"/>
+            </w:tcBorders>
+            <w:shd w:val="clear" w:color="auto" w:fill="auto"/>
+            <w:noWrap/>
+            <w:vAlign w:val="center"/>
+            <w:hideMark/>
+          </w:tcPr>
+          <w:p>
+            <w:pPr>
+              <w:spacing w:after="0" w:line="240" w:lineRule="auto"/>
+              <w:rPr>
+                <w:rFonts w:ascii="Calibri" w:eastAsia="Times New Roman" w:hAnsi="Calibri" w:cs="Calibri"/>
+                <w:color w:val="000000"/>
+              </w:rPr>
+            </w:pPr>
+            <w:r>
+              <w:rPr>
+                <w:rFonts w:ascii="Calibri" w:eastAsia="Times New Roman" w:hAnsi="Calibri" w:cs="Calibri"/>
+                <w:color w:val="000000"/>
+              </w:rPr>
+              <w:t>Als speler wil ik aan de hand van de rotatie van de turret kunnen zien waar die heen gaat schieten zodat ik weet waar hij naar kijkt.</w:t>
+            </w:r>
+          </w:p>
+        </w:tc>
+      </w:tr>
+      <w:tr>
+        <w:trPr>
+          <w:gridAfter w:val="1"/>
+          <w:wAfter w:w="524" w:type="dxa"/>
+          <w:trHeight w:val="567"/>
+        </w:trPr>
+        <w:tc>
+          <w:tcPr>
+            <w:tcW w:w="2093" w:type="dxa"/>
+            <w:gridSpan w:val="2"/>
+            <w:tcBorders>
+              <w:top w:val="single" w:sz="4" w:space="0" w:color="auto"/>
+              <w:left w:val="single" w:sz="4" w:space="0" w:color="auto"/>
+              <w:bottom w:val="single" w:sz="4" w:space="0" w:color="auto"/>
+              <w:right w:val="single" w:sz="4" w:space="0" w:color="auto"/>
+            </w:tcBorders>
+            <w:shd w:val="clear" w:color="auto" w:fill="BFBFBF" w:themeFill="background1" w:themeFillShade="BF"/>
+            <w:noWrap/>
+            <w:vAlign w:val="center"/>
+            <w:hideMark/>
+          </w:tcPr>
+          <w:p>
+            <w:pPr>
+              <w:spacing w:after="0" w:line="240" w:lineRule="auto"/>
+              <w:rPr>
+                <w:rFonts w:ascii="Calibri" w:eastAsia="Times New Roman" w:hAnsi="Calibri" w:cs="Calibri"/>
+                <w:b/>
+                <w:bCs/>
+                <w:color w:val="000000"/>
+              </w:rPr>
+            </w:pPr>
+            <w:r>
+              <w:rPr>
+                <w:rFonts w:ascii="Calibri" w:eastAsia="Times New Roman" w:hAnsi="Calibri" w:cs="Calibri"/>
+                <w:b/>
+                <w:bCs/>
+                <w:color w:val="000000"/>
+              </w:rPr>
+              <w:t>Business Value:</w:t>
+            </w:r>
+          </w:p>
+        </w:tc>
+        <w:tc>
+          <w:tcPr>
+            <w:tcW w:w="2551" w:type="dxa"/>
+            <w:tcBorders>
+              <w:top w:val="nil"/>
+              <w:left w:val="nil"/>
+              <w:bottom w:val="single" w:sz="4" w:space="0" w:color="auto"/>
+              <w:right w:val="single" w:sz="4" w:space="0" w:color="auto"/>
+            </w:tcBorders>
+            <w:shd w:val="clear" w:color="auto" w:fill="auto"/>
+            <w:noWrap/>
+            <w:vAlign w:val="center"/>
+            <w:hideMark/>
+          </w:tcPr>
+          <w:p>
+            <w:pPr>
+              <w:spacing w:after="0" w:line="240" w:lineRule="auto"/>
+              <w:rPr>
+                <w:rFonts w:ascii="Calibri" w:eastAsia="Times New Roman" w:hAnsi="Calibri" w:cs="Calibri"/>
+                <w:color w:val="000000"/>
+              </w:rPr>
+            </w:pPr>
+            <w:r>
+              <w:rPr>
+                <w:rFonts w:ascii="Calibri" w:eastAsia="Times New Roman" w:hAnsi="Calibri" w:cs="Calibri"/>
+                <w:color w:val="000000"/>
+              </w:rPr>
+              <w:t>5</w:t>
+            </w:r>
+          </w:p>
+        </w:tc>
+        <w:tc>
+          <w:tcPr>
+            <w:tcW w:w="1985" w:type="dxa"/>
+            <w:tcBorders>
+              <w:top w:val="nil"/>
+              <w:left w:val="nil"/>
+              <w:bottom w:val="single" w:sz="4" w:space="0" w:color="auto"/>
+              <w:right w:val="single" w:sz="4" w:space="0" w:color="auto"/>
+            </w:tcBorders>
+            <w:shd w:val="clear" w:color="auto" w:fill="BFBFBF" w:themeFill="background1" w:themeFillShade="BF"/>
+            <w:noWrap/>
+            <w:vAlign w:val="center"/>
+            <w:hideMark/>
+          </w:tcPr>
+          <w:p>
+            <w:pPr>
+              <w:spacing w:after="0" w:line="240" w:lineRule="auto"/>
+              <w:rPr>
+                <w:rFonts w:ascii="Calibri" w:eastAsia="Times New Roman" w:hAnsi="Calibri" w:cs="Calibri"/>
+                <w:b/>
+                <w:bCs/>
+                <w:color w:val="000000"/>
+              </w:rPr>
+            </w:pPr>
+            <w:r>
+              <w:rPr>
+                <w:rFonts w:ascii="Calibri" w:eastAsia="Times New Roman" w:hAnsi="Calibri" w:cs="Calibri"/>
+                <w:b/>
+                <w:bCs/>
+                <w:color w:val="000000"/>
+              </w:rPr>
+              <w:t>Story Points:</w:t>
+            </w:r>
+          </w:p>
+        </w:tc>
+        <w:tc>
+          <w:tcPr>
+            <w:tcW w:w="2509" w:type="dxa"/>
+            <w:gridSpan w:val="2"/>
+            <w:tcBorders>
+              <w:top w:val="nil"/>
+              <w:left w:val="nil"/>
+              <w:bottom w:val="single" w:sz="4" w:space="0" w:color="auto"/>
+              <w:right w:val="single" w:sz="4" w:space="0" w:color="auto"/>
+            </w:tcBorders>
+            <w:shd w:val="clear" w:color="auto" w:fill="auto"/>
+            <w:noWrap/>
+            <w:vAlign w:val="center"/>
+            <w:hideMark/>
+          </w:tcPr>
+          <w:p>
+            <w:pPr>
+              <w:spacing w:after="0" w:line="240" w:lineRule="auto"/>
+              <w:rPr>
+                <w:rFonts w:ascii="Calibri" w:eastAsia="Times New Roman" w:hAnsi="Calibri" w:cs="Calibri"/>
+                <w:color w:val="000000"/>
+              </w:rPr>
+            </w:pPr>
+            <w:r>
+              <w:rPr>
+                <w:rFonts w:ascii="Calibri" w:eastAsia="Times New Roman" w:hAnsi="Calibri" w:cs="Calibri"/>
+                <w:color w:val="000000"/>
+              </w:rPr>
+              <w:t>5</w:t>
+            </w:r>
+          </w:p>
+        </w:tc>
+      </w:tr>
+      <w:tr>
+        <w:trPr>
+          <w:gridAfter w:val="1"/>
+          <w:wAfter w:w="524" w:type="dxa"/>
+          <w:trHeight w:val="567"/>
+        </w:trPr>
+        <w:tc>
+          <w:tcPr>
+            <w:tcW w:w="9138" w:type="dxa"/>
+            <w:gridSpan w:val="6"/>
+            <w:tcBorders>
+              <w:top w:val="single" w:sz="4" w:space="0" w:color="auto"/>
+              <w:left w:val="single" w:sz="4" w:space="0" w:color="auto"/>
+              <w:bottom w:val="single" w:sz="4" w:space="0" w:color="auto"/>
+              <w:right w:val="single" w:sz="4" w:space="0" w:color="auto"/>
+            </w:tcBorders>
+            <w:shd w:val="clear" w:color="auto" w:fill="BFBFBF" w:themeFill="background1" w:themeFillShade="BF"/>
+            <w:noWrap/>
+            <w:vAlign w:val="center"/>
+            <w:hideMark/>
+          </w:tcPr>
+          <w:p>
+            <w:pPr>
+              <w:spacing w:after="0" w:line="240" w:lineRule="auto"/>
+              <w:rPr>
+                <w:rFonts w:ascii="Calibri" w:eastAsia="Times New Roman" w:hAnsi="Calibri" w:cs="Calibri"/>
+                <w:color w:val="000000"/>
+              </w:rPr>
+            </w:pPr>
+            <w:r>
+              <w:rPr>
+                <w:rFonts w:ascii="Calibri" w:eastAsia="Times New Roman" w:hAnsi="Calibri" w:cs="Calibri"/>
+                <w:b/>
+                <w:bCs/>
+                <w:color w:val="000000"/>
+              </w:rPr>
+              <w:t>Acceptatiecriteria</w:t>
+            </w:r>
+            <w:r>
+              <w:rPr>
+                <w:rFonts w:ascii="Calibri" w:eastAsia="Times New Roman" w:hAnsi="Calibri" w:cs="Calibri"/>
+                <w:color w:val="000000"/>
+              </w:rPr>
+              <w:t>:</w:t>
+            </w:r>
+          </w:p>
+        </w:tc>
+      </w:tr>
+      <w:tr>
+        <w:trPr>
+          <w:gridAfter w:val="1"/>
+          <w:wAfter w:w="524" w:type="dxa"/>
+          <w:trHeight w:val="567"/>
+        </w:trPr>
+        <w:tc>
+          <w:tcPr>
+            <w:tcW w:w="9138" w:type="dxa"/>
+            <w:gridSpan w:val="6"/>
+            <w:tcBorders>
+              <w:top w:val="single" w:sz="4" w:space="0" w:color="auto"/>
+              <w:left w:val="single" w:sz="4" w:space="0" w:color="auto"/>
+              <w:bottom w:val="single" w:sz="4" w:space="0" w:color="auto"/>
+              <w:right w:val="single" w:sz="4" w:space="0" w:color="auto"/>
+            </w:tcBorders>
+            <w:shd w:val="clear" w:color="auto" w:fill="auto"/>
+            <w:noWrap/>
+            <w:vAlign w:val="center"/>
+            <w:hideMark/>
+          </w:tcPr>
+          <w:p>
+            <w:pPr>
+              <w:pStyle w:val="Lijstalinea"/>
+              <w:numPr>
+                <w:ilvl w:val="0"/>
+                <w:numId w:val="31"/>
+              </w:numPr>
+              <w:spacing w:before="240" w:line="240" w:lineRule="auto"/>
+              <w:rPr>
+                <w:rFonts w:ascii="Calibri" w:eastAsia="Times New Roman" w:hAnsi="Calibri" w:cs="Calibri"/>
+                <w:color w:val="000000"/>
+              </w:rPr>
+            </w:pPr>
+            <w:r>
+              <w:rPr>
+                <w:rFonts w:ascii="Calibri" w:eastAsia="Times New Roman" w:hAnsi="Calibri" w:cs="Calibri"/>
+                <w:color w:val="000000"/>
+              </w:rPr>
+              <w:t>Turrets draaien richting waar ze mikken</w:t>
+            </w:r>
+          </w:p>
+          <w:p>
+            <w:pPr>
+              <w:pStyle w:val="Lijstalinea"/>
+              <w:numPr>
+                <w:ilvl w:val="0"/>
+                <w:numId w:val="31"/>
+              </w:numPr>
+              <w:spacing w:before="240" w:line="240" w:lineRule="auto"/>
+              <w:rPr>
+                <w:rFonts w:ascii="Calibri" w:eastAsia="Times New Roman" w:hAnsi="Calibri" w:cs="Calibri"/>
+                <w:color w:val="000000"/>
+              </w:rPr>
+            </w:pPr>
+            <w:r>
+              <w:rPr>
+                <w:rFonts w:ascii="Calibri" w:eastAsia="Times New Roman" w:hAnsi="Calibri" w:cs="Calibri"/>
+                <w:color w:val="000000"/>
+              </w:rPr>
+              <w:t>Thom breekt niet github</w:t>
             </w:r>
           </w:p>
         </w:tc>
@@ -9391,9 +11520,9 @@
     </w:tbl>
     <w:p/>
     <w:sectPr>
-      <w:footerReference w:type="default" r:id="rId18"/>
-      <w:headerReference w:type="first" r:id="rId19"/>
-      <w:footerReference w:type="first" r:id="rId20"/>
+      <w:footerReference w:type="default" r:id="rId19"/>
+      <w:headerReference w:type="first" r:id="rId20"/>
+      <w:footerReference w:type="first" r:id="rId21"/>
       <w:pgSz w:w="11906" w:h="16838"/>
       <w:pgMar w:top="1417" w:right="1417" w:bottom="1417" w:left="1417" w:header="708" w:footer="708" w:gutter="0"/>
       <w:cols w:space="708"/>
@@ -9748,7 +11877,7 @@
 <w:hdr xmlns:wpc="http://schemas.microsoft.com/office/word/2010/wordprocessingCanvas" xmlns:cx="http://schemas.microsoft.com/office/drawing/2014/chartex" xmlns:cx1="http://schemas.microsoft.com/office/drawing/2015/9/8/chartex" xmlns:cx2="http://schemas.microsoft.com/office/drawing/2015/10/21/chartex" xmlns:cx3="http://schemas.microsoft.com/office/drawing/2016/5/9/chartex" xmlns:cx4="http://schemas.microsoft.com/office/drawing/2016/5/10/chartex" xmlns:cx5="http://schemas.microsoft.com/office/drawing/2016/5/11/chartex" xmlns:cx6="http://schemas.microsoft.com/office/drawing/2016/5/12/chartex" xmlns:cx7="http://schemas.microsoft.com/office/drawing/2016/5/13/chartex" xmlns:cx8="http://schemas.microsoft.com/office/drawing/2016/5/14/chartex" xmlns:mc="http://schemas.openxmlformats.org/markup-compatibility/2006" xmlns:aink="http://schemas.microsoft.com/office/drawing/2016/ink" xmlns:am3d="http://schemas.microsoft.com/office/drawing/2017/model3d" xmlns:o="urn:schemas-microsoft-com:office:office" xmlns:oel="http://schemas.microsoft.com/office/2019/extlst" xmlns:r="http://schemas.openxmlformats.org/officeDocument/2006/relationships" xmlns:m="http://schemas.openxmlformats.org/officeDocument/2006/math" xmlns:v="urn:schemas-microsoft-com:vml" xmlns:wp14="http://schemas.microsoft.com/office/word/2010/wordprocessingDrawing" xmlns:wp="http://schemas.openxmlformats.org/drawingml/2006/wordprocessingDrawing" xmlns:w10="urn:schemas-microsoft-com:office:word" xmlns:w="http://schemas.openxmlformats.org/wordprocessingml/2006/main" xmlns:w14="http://schemas.microsoft.com/office/word/2010/wordml" xmlns:w15="http://schemas.microsoft.com/office/word/2012/wordml" xmlns:w16cex="http://schemas.microsoft.com/office/word/2018/wordml/cex" xmlns:w16cid="http://schemas.microsoft.com/office/word/2016/wordml/cid" xmlns:w16="http://schemas.microsoft.com/office/word/2018/wordml" xmlns:w16du="http://schemas.microsoft.com/office/word/2023/wordml/word16du" xmlns:w16sdtdh="http://schemas.microsoft.com/office/word/2020/wordml/sdtdatahash" xmlns:w16sdtfl="http://schemas.microsoft.com/office/word/2024/wordml/sdtformatlock" xmlns:w16se="http://schemas.microsoft.com/office/word/2015/wordml/symex" xmlns:wpg="http://schemas.microsoft.com/office/word/2010/wordprocessingGroup" xmlns:wpi="http://schemas.microsoft.com/office/word/2010/wordprocessingInk" xmlns:wne="http://schemas.microsoft.com/office/word/2006/wordml" xmlns:wps="http://schemas.microsoft.com/office/word/2010/wordprocessingShape" mc:Ignorable="w14 w15 w16se w16cid w16 w16cex w16sdtdh w16sdtfl w16du wp14">
   <w:p>
     <w:pPr>
-      <w:pStyle w:val="Header"/>
+      <w:pStyle w:val="Koptekst"/>
       <w:jc w:val="center"/>
     </w:pPr>
     <w:r>
@@ -9807,7 +11936,7 @@
   </w:p>
   <w:p>
     <w:pPr>
-      <w:pStyle w:val="Header"/>
+      <w:pStyle w:val="Koptekst"/>
     </w:pPr>
   </w:p>
 </w:hdr>
@@ -13236,16 +15365,16 @@
     <w:lsdException w:name="Unresolved Mention" w:semiHidden="1" w:unhideWhenUsed="1"/>
     <w:lsdException w:name="Smart Link" w:semiHidden="1" w:unhideWhenUsed="1"/>
   </w:latentStyles>
-  <w:style w:type="paragraph" w:default="1" w:styleId="Normal">
+  <w:style w:type="paragraph" w:default="1" w:styleId="Standaard">
     <w:name w:val="Normal"/>
     <w:qFormat/>
     <w:rsid w:val="00B44264"/>
   </w:style>
-  <w:style w:type="paragraph" w:styleId="Heading1">
+  <w:style w:type="paragraph" w:styleId="Kop1">
     <w:name w:val="heading 1"/>
-    <w:basedOn w:val="Normal"/>
-    <w:next w:val="Normal"/>
-    <w:link w:val="Heading1Char"/>
+    <w:basedOn w:val="Standaard"/>
+    <w:next w:val="Standaard"/>
+    <w:link w:val="Kop1Char"/>
     <w:uiPriority w:val="9"/>
     <w:qFormat/>
     <w:rsid w:val="00B44264"/>
@@ -13263,11 +15392,11 @@
       <w:szCs w:val="32"/>
     </w:rPr>
   </w:style>
-  <w:style w:type="paragraph" w:styleId="Heading2">
+  <w:style w:type="paragraph" w:styleId="Kop2">
     <w:name w:val="heading 2"/>
-    <w:basedOn w:val="Normal"/>
-    <w:next w:val="Normal"/>
-    <w:link w:val="Heading2Char"/>
+    <w:basedOn w:val="Standaard"/>
+    <w:next w:val="Standaard"/>
+    <w:link w:val="Kop2Char"/>
     <w:uiPriority w:val="9"/>
     <w:unhideWhenUsed/>
     <w:qFormat/>
@@ -13284,11 +15413,11 @@
       <w:sz w:val="32"/>
     </w:rPr>
   </w:style>
-  <w:style w:type="paragraph" w:styleId="Heading3">
+  <w:style w:type="paragraph" w:styleId="Kop3">
     <w:name w:val="heading 3"/>
-    <w:basedOn w:val="Normal"/>
-    <w:next w:val="Normal"/>
-    <w:link w:val="Heading3Char"/>
+    <w:basedOn w:val="Standaard"/>
+    <w:next w:val="Standaard"/>
+    <w:link w:val="Kop3Char"/>
     <w:uiPriority w:val="9"/>
     <w:unhideWhenUsed/>
     <w:qFormat/>
@@ -13308,11 +15437,11 @@
       <w:szCs w:val="24"/>
     </w:rPr>
   </w:style>
-  <w:style w:type="paragraph" w:styleId="Heading4">
+  <w:style w:type="paragraph" w:styleId="Kop4">
     <w:name w:val="heading 4"/>
-    <w:basedOn w:val="Normal"/>
-    <w:next w:val="Normal"/>
-    <w:link w:val="Heading4Char"/>
+    <w:basedOn w:val="Standaard"/>
+    <w:next w:val="Standaard"/>
+    <w:link w:val="Kop4Char"/>
     <w:uiPriority w:val="9"/>
     <w:semiHidden/>
     <w:unhideWhenUsed/>
@@ -13331,11 +15460,11 @@
       <w:color w:val="000000" w:themeColor="text1"/>
     </w:rPr>
   </w:style>
-  <w:style w:type="paragraph" w:styleId="Heading6">
+  <w:style w:type="paragraph" w:styleId="Kop6">
     <w:name w:val="heading 6"/>
-    <w:basedOn w:val="Normal"/>
-    <w:next w:val="Normal"/>
-    <w:link w:val="Heading6Char"/>
+    <w:basedOn w:val="Standaard"/>
+    <w:next w:val="Standaard"/>
+    <w:link w:val="Kop6Char"/>
     <w:uiPriority w:val="9"/>
     <w:semiHidden/>
     <w:unhideWhenUsed/>
@@ -13352,13 +15481,12 @@
       <w:color w:val="1F4D78" w:themeColor="accent1" w:themeShade="7F"/>
     </w:rPr>
   </w:style>
-  <w:style w:type="character" w:default="1" w:styleId="DefaultParagraphFont">
+  <w:style w:type="character" w:default="1" w:styleId="Standaardalinea-lettertype">
     <w:name w:val="Default Paragraph Font"/>
     <w:uiPriority w:val="1"/>
-    <w:semiHidden/>
     <w:unhideWhenUsed/>
   </w:style>
-  <w:style w:type="table" w:default="1" w:styleId="TableNormal">
+  <w:style w:type="table" w:default="1" w:styleId="Standaardtabel">
     <w:name w:val="Normal Table"/>
     <w:uiPriority w:val="99"/>
     <w:semiHidden/>
@@ -13373,16 +15501,16 @@
       </w:tblCellMar>
     </w:tblPr>
   </w:style>
-  <w:style w:type="numbering" w:default="1" w:styleId="NoList">
+  <w:style w:type="numbering" w:default="1" w:styleId="Geenlijst">
     <w:name w:val="No List"/>
     <w:uiPriority w:val="99"/>
     <w:semiHidden/>
     <w:unhideWhenUsed/>
   </w:style>
-  <w:style w:type="paragraph" w:styleId="Header">
+  <w:style w:type="paragraph" w:styleId="Koptekst">
     <w:name w:val="header"/>
-    <w:basedOn w:val="Normal"/>
-    <w:link w:val="HeaderChar"/>
+    <w:basedOn w:val="Standaard"/>
+    <w:link w:val="KoptekstChar"/>
     <w:uiPriority w:val="99"/>
     <w:unhideWhenUsed/>
     <w:rsid w:val="003D0CAD"/>
@@ -13394,17 +15522,17 @@
       <w:spacing w:after="0" w:line="240" w:lineRule="auto"/>
     </w:pPr>
   </w:style>
-  <w:style w:type="character" w:customStyle="1" w:styleId="HeaderChar">
-    <w:name w:val="Header Char"/>
-    <w:basedOn w:val="DefaultParagraphFont"/>
-    <w:link w:val="Header"/>
+  <w:style w:type="character" w:customStyle="1" w:styleId="KoptekstChar">
+    <w:name w:val="Koptekst Char"/>
+    <w:basedOn w:val="Standaardalinea-lettertype"/>
+    <w:link w:val="Koptekst"/>
     <w:uiPriority w:val="99"/>
     <w:rsid w:val="003D0CAD"/>
   </w:style>
-  <w:style w:type="paragraph" w:styleId="Footer">
+  <w:style w:type="paragraph" w:styleId="Voettekst">
     <w:name w:val="footer"/>
-    <w:basedOn w:val="Normal"/>
-    <w:link w:val="FooterChar"/>
+    <w:basedOn w:val="Standaard"/>
+    <w:link w:val="VoettekstChar"/>
     <w:uiPriority w:val="99"/>
     <w:unhideWhenUsed/>
     <w:rsid w:val="003D0CAD"/>
@@ -13416,16 +15544,16 @@
       <w:spacing w:after="0" w:line="240" w:lineRule="auto"/>
     </w:pPr>
   </w:style>
-  <w:style w:type="character" w:customStyle="1" w:styleId="FooterChar">
-    <w:name w:val="Footer Char"/>
-    <w:basedOn w:val="DefaultParagraphFont"/>
-    <w:link w:val="Footer"/>
+  <w:style w:type="character" w:customStyle="1" w:styleId="VoettekstChar">
+    <w:name w:val="Voettekst Char"/>
+    <w:basedOn w:val="Standaardalinea-lettertype"/>
+    <w:link w:val="Voettekst"/>
     <w:uiPriority w:val="99"/>
     <w:rsid w:val="003D0CAD"/>
   </w:style>
-  <w:style w:type="table" w:styleId="TableGrid">
+  <w:style w:type="table" w:styleId="Tabelraster">
     <w:name w:val="Table Grid"/>
-    <w:basedOn w:val="TableNormal"/>
+    <w:basedOn w:val="Standaardtabel"/>
     <w:uiPriority w:val="59"/>
     <w:rsid w:val="003D0CAD"/>
     <w:pPr>
@@ -13442,9 +15570,9 @@
       </w:tblBorders>
     </w:tblPr>
   </w:style>
-  <w:style w:type="paragraph" w:styleId="ListParagraph">
+  <w:style w:type="paragraph" w:styleId="Lijstalinea">
     <w:name w:val="List Paragraph"/>
-    <w:basedOn w:val="Normal"/>
+    <w:basedOn w:val="Standaard"/>
     <w:uiPriority w:val="34"/>
     <w:qFormat/>
     <w:rsid w:val="00716F2B"/>
@@ -13453,10 +15581,10 @@
       <w:contextualSpacing/>
     </w:pPr>
   </w:style>
-  <w:style w:type="character" w:customStyle="1" w:styleId="Heading1Char">
-    <w:name w:val="Heading 1 Char"/>
-    <w:basedOn w:val="DefaultParagraphFont"/>
-    <w:link w:val="Heading1"/>
+  <w:style w:type="character" w:customStyle="1" w:styleId="Kop1Char">
+    <w:name w:val="Kop 1 Char"/>
+    <w:basedOn w:val="Standaardalinea-lettertype"/>
+    <w:link w:val="Kop1"/>
     <w:uiPriority w:val="9"/>
     <w:rsid w:val="00B44264"/>
     <w:rPr>
@@ -13466,10 +15594,10 @@
       <w:szCs w:val="32"/>
     </w:rPr>
   </w:style>
-  <w:style w:type="character" w:customStyle="1" w:styleId="Heading2Char">
-    <w:name w:val="Heading 2 Char"/>
-    <w:basedOn w:val="DefaultParagraphFont"/>
-    <w:link w:val="Heading2"/>
+  <w:style w:type="character" w:customStyle="1" w:styleId="Kop2Char">
+    <w:name w:val="Kop 2 Char"/>
+    <w:basedOn w:val="Standaardalinea-lettertype"/>
+    <w:link w:val="Kop2"/>
     <w:uiPriority w:val="9"/>
     <w:rsid w:val="00AE7D59"/>
     <w:rPr>
@@ -13478,10 +15606,10 @@
       <w:sz w:val="32"/>
     </w:rPr>
   </w:style>
-  <w:style w:type="character" w:customStyle="1" w:styleId="Heading3Char">
-    <w:name w:val="Heading 3 Char"/>
-    <w:basedOn w:val="DefaultParagraphFont"/>
-    <w:link w:val="Heading3"/>
+  <w:style w:type="character" w:customStyle="1" w:styleId="Kop3Char">
+    <w:name w:val="Kop 3 Char"/>
+    <w:basedOn w:val="Standaardalinea-lettertype"/>
+    <w:link w:val="Kop3"/>
     <w:uiPriority w:val="9"/>
     <w:rsid w:val="00AE7D59"/>
     <w:rPr>
@@ -13493,10 +15621,10 @@
       <w:szCs w:val="24"/>
     </w:rPr>
   </w:style>
-  <w:style w:type="character" w:customStyle="1" w:styleId="Heading4Char">
-    <w:name w:val="Heading 4 Char"/>
-    <w:basedOn w:val="DefaultParagraphFont"/>
-    <w:link w:val="Heading4"/>
+  <w:style w:type="character" w:customStyle="1" w:styleId="Kop4Char">
+    <w:name w:val="Kop 4 Char"/>
+    <w:basedOn w:val="Standaardalinea-lettertype"/>
+    <w:link w:val="Kop4"/>
     <w:uiPriority w:val="9"/>
     <w:semiHidden/>
     <w:rsid w:val="00B44264"/>
@@ -13507,10 +15635,10 @@
       <w:color w:val="000000" w:themeColor="text1"/>
     </w:rPr>
   </w:style>
-  <w:style w:type="paragraph" w:styleId="BalloonText">
+  <w:style w:type="paragraph" w:styleId="Ballontekst">
     <w:name w:val="Balloon Text"/>
-    <w:basedOn w:val="Normal"/>
-    <w:link w:val="BalloonTextChar"/>
+    <w:basedOn w:val="Standaard"/>
+    <w:link w:val="BallontekstChar"/>
     <w:uiPriority w:val="99"/>
     <w:semiHidden/>
     <w:unhideWhenUsed/>
@@ -13524,10 +15652,10 @@
       <w:szCs w:val="16"/>
     </w:rPr>
   </w:style>
-  <w:style w:type="character" w:customStyle="1" w:styleId="BalloonTextChar">
-    <w:name w:val="Balloon Text Char"/>
-    <w:basedOn w:val="DefaultParagraphFont"/>
-    <w:link w:val="BalloonText"/>
+  <w:style w:type="character" w:customStyle="1" w:styleId="BallontekstChar">
+    <w:name w:val="Ballontekst Char"/>
+    <w:basedOn w:val="Standaardalinea-lettertype"/>
+    <w:link w:val="Ballontekst"/>
     <w:uiPriority w:val="99"/>
     <w:semiHidden/>
     <w:rsid w:val="00756DEF"/>
@@ -13537,10 +15665,10 @@
       <w:szCs w:val="16"/>
     </w:rPr>
   </w:style>
-  <w:style w:type="paragraph" w:styleId="TOCHeading">
+  <w:style w:type="paragraph" w:styleId="Kopvaninhoudsopgave">
     <w:name w:val="TOC Heading"/>
-    <w:basedOn w:val="Heading1"/>
-    <w:next w:val="Normal"/>
+    <w:basedOn w:val="Kop1"/>
+    <w:next w:val="Standaard"/>
     <w:uiPriority w:val="39"/>
     <w:unhideWhenUsed/>
     <w:qFormat/>
@@ -13560,10 +15688,10 @@
       <w:lang w:eastAsia="nl-NL"/>
     </w:rPr>
   </w:style>
-  <w:style w:type="paragraph" w:styleId="TOC1">
+  <w:style w:type="paragraph" w:styleId="Inhopg1">
     <w:name w:val="toc 1"/>
-    <w:basedOn w:val="Normal"/>
-    <w:next w:val="Normal"/>
+    <w:basedOn w:val="Standaard"/>
+    <w:next w:val="Standaard"/>
     <w:autoRedefine/>
     <w:uiPriority w:val="39"/>
     <w:unhideWhenUsed/>
@@ -13577,7 +15705,7 @@
   </w:style>
   <w:style w:type="character" w:styleId="Hyperlink">
     <w:name w:val="Hyperlink"/>
-    <w:basedOn w:val="DefaultParagraphFont"/>
+    <w:basedOn w:val="Standaardalinea-lettertype"/>
     <w:uiPriority w:val="99"/>
     <w:unhideWhenUsed/>
     <w:rsid w:val="00DD7202"/>
@@ -13586,11 +15714,11 @@
       <w:u w:val="single"/>
     </w:rPr>
   </w:style>
-  <w:style w:type="paragraph" w:styleId="Title">
+  <w:style w:type="paragraph" w:styleId="Titel">
     <w:name w:val="Title"/>
-    <w:basedOn w:val="Normal"/>
-    <w:next w:val="Normal"/>
-    <w:link w:val="TitleChar"/>
+    <w:basedOn w:val="Standaard"/>
+    <w:next w:val="Standaard"/>
+    <w:link w:val="TitelChar"/>
     <w:uiPriority w:val="10"/>
     <w:qFormat/>
     <w:rsid w:val="00DD7202"/>
@@ -13610,10 +15738,10 @@
       <w:szCs w:val="52"/>
     </w:rPr>
   </w:style>
-  <w:style w:type="character" w:customStyle="1" w:styleId="TitleChar">
-    <w:name w:val="Title Char"/>
-    <w:basedOn w:val="DefaultParagraphFont"/>
-    <w:link w:val="Title"/>
+  <w:style w:type="character" w:customStyle="1" w:styleId="TitelChar">
+    <w:name w:val="Titel Char"/>
+    <w:basedOn w:val="Standaardalinea-lettertype"/>
+    <w:link w:val="Titel"/>
     <w:uiPriority w:val="10"/>
     <w:rsid w:val="00DD7202"/>
     <w:rPr>
@@ -13625,11 +15753,11 @@
       <w:szCs w:val="52"/>
     </w:rPr>
   </w:style>
-  <w:style w:type="paragraph" w:styleId="Subtitle">
+  <w:style w:type="paragraph" w:styleId="Ondertitel">
     <w:name w:val="Subtitle"/>
-    <w:basedOn w:val="Normal"/>
-    <w:next w:val="Normal"/>
-    <w:link w:val="SubtitleChar"/>
+    <w:basedOn w:val="Standaard"/>
+    <w:next w:val="Standaard"/>
+    <w:link w:val="OndertitelChar"/>
     <w:uiPriority w:val="11"/>
     <w:qFormat/>
     <w:rsid w:val="00DD7202"/>
@@ -13648,10 +15776,10 @@
       <w:szCs w:val="24"/>
     </w:rPr>
   </w:style>
-  <w:style w:type="character" w:customStyle="1" w:styleId="SubtitleChar">
-    <w:name w:val="Subtitle Char"/>
-    <w:basedOn w:val="DefaultParagraphFont"/>
-    <w:link w:val="Subtitle"/>
+  <w:style w:type="character" w:customStyle="1" w:styleId="OndertitelChar">
+    <w:name w:val="Ondertitel Char"/>
+    <w:basedOn w:val="Standaardalinea-lettertype"/>
+    <w:link w:val="Ondertitel"/>
     <w:uiPriority w:val="11"/>
     <w:rsid w:val="00DD7202"/>
     <w:rPr>
@@ -13664,9 +15792,9 @@
       <w:szCs w:val="24"/>
     </w:rPr>
   </w:style>
-  <w:style w:type="character" w:styleId="CommentReference">
+  <w:style w:type="character" w:styleId="Verwijzingopmerking">
     <w:name w:val="annotation reference"/>
-    <w:basedOn w:val="DefaultParagraphFont"/>
+    <w:basedOn w:val="Standaardalinea-lettertype"/>
     <w:uiPriority w:val="99"/>
     <w:semiHidden/>
     <w:unhideWhenUsed/>
@@ -13676,10 +15804,10 @@
       <w:szCs w:val="18"/>
     </w:rPr>
   </w:style>
-  <w:style w:type="paragraph" w:styleId="CommentText">
+  <w:style w:type="paragraph" w:styleId="Tekstopmerking">
     <w:name w:val="annotation text"/>
-    <w:basedOn w:val="Normal"/>
-    <w:link w:val="CommentTextChar"/>
+    <w:basedOn w:val="Standaard"/>
+    <w:link w:val="TekstopmerkingChar"/>
     <w:uiPriority w:val="99"/>
     <w:semiHidden/>
     <w:unhideWhenUsed/>
@@ -13692,10 +15820,10 @@
       <w:szCs w:val="24"/>
     </w:rPr>
   </w:style>
-  <w:style w:type="character" w:customStyle="1" w:styleId="CommentTextChar">
-    <w:name w:val="Comment Text Char"/>
-    <w:basedOn w:val="DefaultParagraphFont"/>
-    <w:link w:val="CommentText"/>
+  <w:style w:type="character" w:customStyle="1" w:styleId="TekstopmerkingChar">
+    <w:name w:val="Tekst opmerking Char"/>
+    <w:basedOn w:val="Standaardalinea-lettertype"/>
+    <w:link w:val="Tekstopmerking"/>
     <w:uiPriority w:val="99"/>
     <w:semiHidden/>
     <w:rsid w:val="001F68CA"/>
@@ -13704,11 +15832,11 @@
       <w:szCs w:val="24"/>
     </w:rPr>
   </w:style>
-  <w:style w:type="paragraph" w:styleId="CommentSubject">
+  <w:style w:type="paragraph" w:styleId="Onderwerpvanopmerking">
     <w:name w:val="annotation subject"/>
-    <w:basedOn w:val="CommentText"/>
-    <w:next w:val="CommentText"/>
-    <w:link w:val="CommentSubjectChar"/>
+    <w:basedOn w:val="Tekstopmerking"/>
+    <w:next w:val="Tekstopmerking"/>
+    <w:link w:val="OnderwerpvanopmerkingChar"/>
     <w:uiPriority w:val="99"/>
     <w:semiHidden/>
     <w:unhideWhenUsed/>
@@ -13720,10 +15848,10 @@
       <w:szCs w:val="20"/>
     </w:rPr>
   </w:style>
-  <w:style w:type="character" w:customStyle="1" w:styleId="CommentSubjectChar">
-    <w:name w:val="Comment Subject Char"/>
-    <w:basedOn w:val="CommentTextChar"/>
-    <w:link w:val="CommentSubject"/>
+  <w:style w:type="character" w:customStyle="1" w:styleId="OnderwerpvanopmerkingChar">
+    <w:name w:val="Onderwerp van opmerking Char"/>
+    <w:basedOn w:val="TekstopmerkingChar"/>
+    <w:link w:val="Onderwerpvanopmerking"/>
     <w:uiPriority w:val="99"/>
     <w:semiHidden/>
     <w:rsid w:val="001F68CA"/>
@@ -13736,12 +15864,12 @@
   </w:style>
   <w:style w:type="character" w:customStyle="1" w:styleId="lewnzc">
     <w:name w:val="lewnzc"/>
-    <w:basedOn w:val="DefaultParagraphFont"/>
+    <w:basedOn w:val="Standaardalinea-lettertype"/>
     <w:rsid w:val="003A1469"/>
   </w:style>
-  <w:style w:type="character" w:styleId="Emphasis">
+  <w:style w:type="character" w:styleId="Nadruk">
     <w:name w:val="Emphasis"/>
-    <w:basedOn w:val="DefaultParagraphFont"/>
+    <w:basedOn w:val="Standaardalinea-lettertype"/>
     <w:uiPriority w:val="20"/>
     <w:qFormat/>
     <w:rsid w:val="003A1469"/>
@@ -13752,10 +15880,10 @@
   </w:style>
   <w:style w:type="character" w:customStyle="1" w:styleId="tlssbb">
     <w:name w:val="tlssbb"/>
-    <w:basedOn w:val="DefaultParagraphFont"/>
+    <w:basedOn w:val="Standaardalinea-lettertype"/>
     <w:rsid w:val="00B2286A"/>
   </w:style>
-  <w:style w:type="paragraph" w:styleId="NoSpacing">
+  <w:style w:type="paragraph" w:styleId="Geenafstand">
     <w:name w:val="No Spacing"/>
     <w:uiPriority w:val="1"/>
     <w:qFormat/>
@@ -13764,10 +15892,10 @@
       <w:spacing w:after="0" w:line="240" w:lineRule="auto"/>
     </w:pPr>
   </w:style>
-  <w:style w:type="character" w:customStyle="1" w:styleId="Heading6Char">
-    <w:name w:val="Heading 6 Char"/>
-    <w:basedOn w:val="DefaultParagraphFont"/>
-    <w:link w:val="Heading6"/>
+  <w:style w:type="character" w:customStyle="1" w:styleId="Kop6Char">
+    <w:name w:val="Kop 6 Char"/>
+    <w:basedOn w:val="Standaardalinea-lettertype"/>
+    <w:link w:val="Kop6"/>
     <w:uiPriority w:val="9"/>
     <w:semiHidden/>
     <w:rsid w:val="00710649"/>
@@ -13776,10 +15904,10 @@
       <w:color w:val="1F4D78" w:themeColor="accent1" w:themeShade="7F"/>
     </w:rPr>
   </w:style>
-  <w:style w:type="paragraph" w:styleId="TOC3">
+  <w:style w:type="paragraph" w:styleId="Inhopg3">
     <w:name w:val="toc 3"/>
-    <w:basedOn w:val="Normal"/>
-    <w:next w:val="Normal"/>
+    <w:basedOn w:val="Standaard"/>
+    <w:next w:val="Standaard"/>
     <w:autoRedefine/>
     <w:uiPriority w:val="39"/>
     <w:unhideWhenUsed/>
@@ -13789,10 +15917,10 @@
       <w:ind w:left="440"/>
     </w:pPr>
   </w:style>
-  <w:style w:type="paragraph" w:styleId="TOC2">
+  <w:style w:type="paragraph" w:styleId="Inhopg2">
     <w:name w:val="toc 2"/>
-    <w:basedOn w:val="Normal"/>
-    <w:next w:val="Normal"/>
+    <w:basedOn w:val="Standaard"/>
+    <w:next w:val="Standaard"/>
     <w:autoRedefine/>
     <w:uiPriority w:val="39"/>
     <w:unhideWhenUsed/>
@@ -14067,10 +16195,6 @@
 </file>
 
 <file path=customXml/item1.xml><?xml version="1.0" encoding="utf-8"?>
-<b:Sources xmlns:b="http://schemas.openxmlformats.org/officeDocument/2006/bibliography" xmlns="http://schemas.openxmlformats.org/officeDocument/2006/bibliography" SelectedStyle="\APASixthEditionOfficeOnline.xsl" StyleName="APA" Version="6"/>
-</file>
-
-<file path=customXml/item2.xml><?xml version="1.0" encoding="utf-8"?>
 <p:properties xmlns:p="http://schemas.microsoft.com/office/2006/metadata/properties" xmlns:xsi="http://www.w3.org/2001/XMLSchema-instance" xmlns:pc="http://schemas.microsoft.com/office/infopath/2007/PartnerControls">
   <documentManagement>
     <TaxCatchAll xmlns="32dd6115-ce5d-46b4-b638-9e7d5ca6cbee" xsi:nil="true"/>
@@ -14081,7 +16205,20 @@
 </p:properties>
 </file>
 
+<file path=customXml/item2.xml><?xml version="1.0" encoding="utf-8"?>
+<b:Sources xmlns:b="http://schemas.openxmlformats.org/officeDocument/2006/bibliography" xmlns="http://schemas.openxmlformats.org/officeDocument/2006/bibliography" SelectedStyle="\APASixthEditionOfficeOnline.xsl" StyleName="APA" Version="6"/>
+</file>
+
 <file path=customXml/item3.xml><?xml version="1.0" encoding="utf-8"?>
+<?mso-contentType ?>
+<FormTemplates xmlns="http://schemas.microsoft.com/sharepoint/v3/contenttype/forms">
+  <Display>DocumentLibraryForm</Display>
+  <Edit>DocumentLibraryForm</Edit>
+  <New>DocumentLibraryForm</New>
+</FormTemplates>
+</file>
+
+<file path=customXml/item4.xml><?xml version="1.0" encoding="utf-8"?>
 <ct:contentTypeSchema xmlns:ct="http://schemas.microsoft.com/office/2006/metadata/contentType" xmlns:ma="http://schemas.microsoft.com/office/2006/metadata/properties/metaAttributes" ct:_="" ma:_="" ma:contentTypeName="Document" ma:contentTypeID="0x010100D5188FA4F7421B4A93E65E307A769E27" ma:contentTypeVersion="15" ma:contentTypeDescription="Een nieuw document maken." ma:contentTypeScope="" ma:versionID="9bfd002f47f5f7e7b2724518f3fad1a5">
   <xsd:schema xmlns:xsd="http://www.w3.org/2001/XMLSchema" xmlns:xs="http://www.w3.org/2001/XMLSchema" xmlns:p="http://schemas.microsoft.com/office/2006/metadata/properties" xmlns:ns2="094ecc41-7a37-40c9-8390-f18431712098" xmlns:ns3="32dd6115-ce5d-46b4-b638-9e7d5ca6cbee" targetNamespace="http://schemas.microsoft.com/office/2006/metadata/properties" ma:root="true" ma:fieldsID="e2c1118370456e9a6d2939e9bd0f2e89" ns2:_="" ns3:_="">
     <xsd:import namespace="094ecc41-7a37-40c9-8390-f18431712098"/>
@@ -14316,24 +16453,7 @@
 </ct:contentTypeSchema>
 </file>
 
-<file path=customXml/item4.xml><?xml version="1.0" encoding="utf-8"?>
-<?mso-contentType ?>
-<FormTemplates xmlns="http://schemas.microsoft.com/sharepoint/v3/contenttype/forms">
-  <Display>DocumentLibraryForm</Display>
-  <Edit>DocumentLibraryForm</Edit>
-  <New>DocumentLibraryForm</New>
-</FormTemplates>
-</file>
-
 <file path=customXml/itemProps1.xml><?xml version="1.0" encoding="utf-8"?>
-<ds:datastoreItem xmlns:ds="http://schemas.openxmlformats.org/officeDocument/2006/customXml" ds:itemID="{72B7D650-2FAA-4D72-B587-235E59E6AC26}">
-  <ds:schemaRefs>
-    <ds:schemaRef ds:uri="http://schemas.openxmlformats.org/officeDocument/2006/bibliography"/>
-  </ds:schemaRefs>
-</ds:datastoreItem>
-</file>
-
-<file path=customXml/itemProps2.xml><?xml version="1.0" encoding="utf-8"?>
 <ds:datastoreItem xmlns:ds="http://schemas.openxmlformats.org/officeDocument/2006/customXml" ds:itemID="{846B1C81-E993-40E7-BCC5-DA63F0CD945C}">
   <ds:schemaRefs>
     <ds:schemaRef ds:uri="http://schemas.microsoft.com/office/2006/metadata/properties"/>
@@ -14344,7 +16464,23 @@
 </ds:datastoreItem>
 </file>
 
+<file path=customXml/itemProps2.xml><?xml version="1.0" encoding="utf-8"?>
+<ds:datastoreItem xmlns:ds="http://schemas.openxmlformats.org/officeDocument/2006/customXml" ds:itemID="{72B7D650-2FAA-4D72-B587-235E59E6AC26}">
+  <ds:schemaRefs>
+    <ds:schemaRef ds:uri="http://schemas.openxmlformats.org/officeDocument/2006/bibliography"/>
+  </ds:schemaRefs>
+</ds:datastoreItem>
+</file>
+
 <file path=customXml/itemProps3.xml><?xml version="1.0" encoding="utf-8"?>
+<ds:datastoreItem xmlns:ds="http://schemas.openxmlformats.org/officeDocument/2006/customXml" ds:itemID="{C6916C6B-E06E-47CD-A094-BBBE44C5EA8C}">
+  <ds:schemaRefs>
+    <ds:schemaRef ds:uri="http://schemas.microsoft.com/sharepoint/v3/contenttype/forms"/>
+  </ds:schemaRefs>
+</ds:datastoreItem>
+</file>
+
+<file path=customXml/itemProps4.xml><?xml version="1.0" encoding="utf-8"?>
 <ds:datastoreItem xmlns:ds="http://schemas.openxmlformats.org/officeDocument/2006/customXml" ds:itemID="{6D953465-DEAC-453F-952B-2BF171A6BD1D}">
   <ds:schemaRefs>
     <ds:schemaRef ds:uri="http://schemas.microsoft.com/office/2006/metadata/contentType"/>
@@ -14361,12 +16497,4 @@
     <ds:schemaRef ds:uri="http://schemas.microsoft.com/internal/obd"/>
   </ds:schemaRefs>
 </ds:datastoreItem>
-</file>
-
-<file path=customXml/itemProps4.xml><?xml version="1.0" encoding="utf-8"?>
-<ds:datastoreItem xmlns:ds="http://schemas.openxmlformats.org/officeDocument/2006/customXml" ds:itemID="{C6916C6B-E06E-47CD-A094-BBBE44C5EA8C}">
-  <ds:schemaRefs>
-    <ds:schemaRef ds:uri="http://schemas.microsoft.com/sharepoint/v3/contenttype/forms"/>
-  </ds:schemaRefs>
-</ds:datastoreItem>
 </file>
</xml_diff>

<commit_message>
feat: added testscene for testing invisible objects
added a testscene to test if invisible obstacles bug is still active
small change to verbetervoorstel due to a small mistake
</commit_message>
<xml_diff>
--- a/Templates/ingevulde documentatie/J2P3_CrashNDash_Verbetervoorstel01.docx
+++ b/Templates/ingevulde documentatie/J2P3_CrashNDash_Verbetervoorstel01.docx
@@ -355,7 +355,7 @@
       <w:sdtContent>
         <w:p>
           <w:pPr>
-            <w:pStyle w:val="Kopvaninhoudsopgave"/>
+            <w:pStyle w:val="TOCHeading"/>
           </w:pPr>
           <w:r>
             <w:t>Inhoud</w:t>
@@ -363,7 +363,7 @@
         </w:p>
         <w:p>
           <w:pPr>
-            <w:pStyle w:val="Inhopg1"/>
+            <w:pStyle w:val="TOC1"/>
             <w:rPr>
               <w:rFonts w:eastAsiaTheme="minorEastAsia"/>
               <w:noProof/>
@@ -443,7 +443,7 @@
         </w:p>
         <w:p>
           <w:pPr>
-            <w:pStyle w:val="Inhopg1"/>
+            <w:pStyle w:val="TOC1"/>
             <w:rPr>
               <w:rFonts w:eastAsiaTheme="minorEastAsia"/>
               <w:noProof/>
@@ -514,7 +514,7 @@
         </w:p>
         <w:p>
           <w:pPr>
-            <w:pStyle w:val="Inhopg2"/>
+            <w:pStyle w:val="TOC2"/>
             <w:tabs>
               <w:tab w:val="right" w:leader="dot" w:pos="9062"/>
             </w:tabs>
@@ -588,7 +588,7 @@
         </w:p>
         <w:p>
           <w:pPr>
-            <w:pStyle w:val="Inhopg2"/>
+            <w:pStyle w:val="TOC2"/>
             <w:tabs>
               <w:tab w:val="right" w:leader="dot" w:pos="9062"/>
             </w:tabs>
@@ -662,7 +662,7 @@
         </w:p>
         <w:p>
           <w:pPr>
-            <w:pStyle w:val="Inhopg2"/>
+            <w:pStyle w:val="TOC2"/>
             <w:tabs>
               <w:tab w:val="right" w:leader="dot" w:pos="9062"/>
             </w:tabs>
@@ -736,7 +736,7 @@
         </w:p>
         <w:p>
           <w:pPr>
-            <w:pStyle w:val="Inhopg2"/>
+            <w:pStyle w:val="TOC2"/>
             <w:tabs>
               <w:tab w:val="right" w:leader="dot" w:pos="9062"/>
             </w:tabs>
@@ -810,7 +810,7 @@
         </w:p>
         <w:p>
           <w:pPr>
-            <w:pStyle w:val="Inhopg2"/>
+            <w:pStyle w:val="TOC2"/>
             <w:tabs>
               <w:tab w:val="right" w:leader="dot" w:pos="9062"/>
             </w:tabs>
@@ -884,7 +884,7 @@
         </w:p>
         <w:p>
           <w:pPr>
-            <w:pStyle w:val="Inhopg2"/>
+            <w:pStyle w:val="TOC2"/>
             <w:tabs>
               <w:tab w:val="right" w:leader="dot" w:pos="9062"/>
             </w:tabs>
@@ -958,7 +958,7 @@
         </w:p>
         <w:p>
           <w:pPr>
-            <w:pStyle w:val="Inhopg1"/>
+            <w:pStyle w:val="TOC1"/>
             <w:rPr>
               <w:rFonts w:eastAsiaTheme="minorEastAsia"/>
               <w:noProof/>
@@ -1029,7 +1029,7 @@
         </w:p>
         <w:p>
           <w:pPr>
-            <w:pStyle w:val="Inhopg2"/>
+            <w:pStyle w:val="TOC2"/>
             <w:tabs>
               <w:tab w:val="right" w:leader="dot" w:pos="9062"/>
             </w:tabs>
@@ -1103,7 +1103,7 @@
         </w:p>
         <w:p>
           <w:pPr>
-            <w:pStyle w:val="Inhopg2"/>
+            <w:pStyle w:val="TOC2"/>
             <w:tabs>
               <w:tab w:val="right" w:leader="dot" w:pos="9062"/>
             </w:tabs>
@@ -1177,7 +1177,7 @@
         </w:p>
         <w:p>
           <w:pPr>
-            <w:pStyle w:val="Inhopg2"/>
+            <w:pStyle w:val="TOC2"/>
             <w:tabs>
               <w:tab w:val="right" w:leader="dot" w:pos="9062"/>
             </w:tabs>
@@ -1251,7 +1251,7 @@
         </w:p>
         <w:p>
           <w:pPr>
-            <w:pStyle w:val="Inhopg2"/>
+            <w:pStyle w:val="TOC2"/>
             <w:tabs>
               <w:tab w:val="right" w:leader="dot" w:pos="9062"/>
             </w:tabs>
@@ -1325,7 +1325,7 @@
         </w:p>
         <w:p>
           <w:pPr>
-            <w:pStyle w:val="Inhopg2"/>
+            <w:pStyle w:val="TOC2"/>
             <w:tabs>
               <w:tab w:val="right" w:leader="dot" w:pos="9062"/>
             </w:tabs>
@@ -1399,7 +1399,7 @@
         </w:p>
         <w:p>
           <w:pPr>
-            <w:pStyle w:val="Inhopg2"/>
+            <w:pStyle w:val="TOC2"/>
             <w:tabs>
               <w:tab w:val="right" w:leader="dot" w:pos="9062"/>
             </w:tabs>
@@ -1473,7 +1473,7 @@
         </w:p>
         <w:p>
           <w:pPr>
-            <w:pStyle w:val="Inhopg1"/>
+            <w:pStyle w:val="TOC1"/>
             <w:rPr>
               <w:rFonts w:eastAsiaTheme="minorEastAsia"/>
               <w:noProof/>
@@ -1544,7 +1544,7 @@
         </w:p>
         <w:p>
           <w:pPr>
-            <w:pStyle w:val="Inhopg2"/>
+            <w:pStyle w:val="TOC2"/>
             <w:tabs>
               <w:tab w:val="right" w:leader="dot" w:pos="9062"/>
             </w:tabs>
@@ -1618,7 +1618,7 @@
         </w:p>
         <w:p>
           <w:pPr>
-            <w:pStyle w:val="Inhopg2"/>
+            <w:pStyle w:val="TOC2"/>
             <w:tabs>
               <w:tab w:val="right" w:leader="dot" w:pos="9062"/>
             </w:tabs>
@@ -1692,7 +1692,7 @@
         </w:p>
         <w:p>
           <w:pPr>
-            <w:pStyle w:val="Inhopg2"/>
+            <w:pStyle w:val="TOC2"/>
             <w:tabs>
               <w:tab w:val="right" w:leader="dot" w:pos="9062"/>
             </w:tabs>
@@ -1766,7 +1766,7 @@
         </w:p>
         <w:p>
           <w:pPr>
-            <w:pStyle w:val="Inhopg2"/>
+            <w:pStyle w:val="TOC2"/>
             <w:tabs>
               <w:tab w:val="right" w:leader="dot" w:pos="9062"/>
             </w:tabs>
@@ -1840,7 +1840,7 @@
         </w:p>
         <w:p>
           <w:pPr>
-            <w:pStyle w:val="Inhopg2"/>
+            <w:pStyle w:val="TOC2"/>
             <w:tabs>
               <w:tab w:val="right" w:leader="dot" w:pos="9062"/>
             </w:tabs>
@@ -1914,7 +1914,7 @@
         </w:p>
         <w:p>
           <w:pPr>
-            <w:pStyle w:val="Inhopg2"/>
+            <w:pStyle w:val="TOC2"/>
             <w:tabs>
               <w:tab w:val="right" w:leader="dot" w:pos="9062"/>
             </w:tabs>
@@ -1988,7 +1988,7 @@
         </w:p>
         <w:p>
           <w:pPr>
-            <w:pStyle w:val="Inhopg1"/>
+            <w:pStyle w:val="TOC1"/>
             <w:rPr>
               <w:rFonts w:eastAsiaTheme="minorEastAsia"/>
               <w:noProof/>
@@ -2059,7 +2059,7 @@
         </w:p>
         <w:p>
           <w:pPr>
-            <w:pStyle w:val="Inhopg2"/>
+            <w:pStyle w:val="TOC2"/>
             <w:tabs>
               <w:tab w:val="right" w:leader="dot" w:pos="9062"/>
             </w:tabs>
@@ -2133,7 +2133,7 @@
         </w:p>
         <w:p>
           <w:pPr>
-            <w:pStyle w:val="Inhopg2"/>
+            <w:pStyle w:val="TOC2"/>
             <w:tabs>
               <w:tab w:val="right" w:leader="dot" w:pos="9062"/>
             </w:tabs>
@@ -2207,7 +2207,7 @@
         </w:p>
         <w:p>
           <w:pPr>
-            <w:pStyle w:val="Inhopg2"/>
+            <w:pStyle w:val="TOC2"/>
             <w:tabs>
               <w:tab w:val="right" w:leader="dot" w:pos="9062"/>
             </w:tabs>
@@ -2281,7 +2281,7 @@
         </w:p>
         <w:p>
           <w:pPr>
-            <w:pStyle w:val="Inhopg2"/>
+            <w:pStyle w:val="TOC2"/>
             <w:tabs>
               <w:tab w:val="right" w:leader="dot" w:pos="9062"/>
             </w:tabs>
@@ -2355,7 +2355,7 @@
         </w:p>
         <w:p>
           <w:pPr>
-            <w:pStyle w:val="Inhopg2"/>
+            <w:pStyle w:val="TOC2"/>
             <w:tabs>
               <w:tab w:val="right" w:leader="dot" w:pos="9062"/>
             </w:tabs>
@@ -2429,7 +2429,7 @@
         </w:p>
         <w:p>
           <w:pPr>
-            <w:pStyle w:val="Inhopg2"/>
+            <w:pStyle w:val="TOC2"/>
             <w:tabs>
               <w:tab w:val="right" w:leader="dot" w:pos="9062"/>
             </w:tabs>
@@ -2527,7 +2527,7 @@
     </w:p>
     <w:p>
       <w:pPr>
-        <w:pStyle w:val="Kop1"/>
+        <w:pStyle w:val="Heading1"/>
         <w:jc w:val="left"/>
       </w:pPr>
       <w:bookmarkStart w:id="0" w:name="_Toc183594785"/>
@@ -2685,7 +2685,7 @@
     </w:p>
     <w:p>
       <w:pPr>
-        <w:pStyle w:val="Lijstalinea"/>
+        <w:pStyle w:val="ListParagraph"/>
         <w:numPr>
           <w:ilvl w:val="0"/>
           <w:numId w:val="29"/>
@@ -2713,7 +2713,7 @@
     </w:p>
     <w:p>
       <w:pPr>
-        <w:pStyle w:val="Lijstalinea"/>
+        <w:pStyle w:val="ListParagraph"/>
         <w:numPr>
           <w:ilvl w:val="0"/>
           <w:numId w:val="29"/>
@@ -2748,7 +2748,7 @@
     </w:p>
     <w:p>
       <w:pPr>
-        <w:pStyle w:val="Lijstalinea"/>
+        <w:pStyle w:val="ListParagraph"/>
         <w:numPr>
           <w:ilvl w:val="0"/>
           <w:numId w:val="29"/>
@@ -2776,7 +2776,7 @@
     </w:p>
     <w:p>
       <w:pPr>
-        <w:pStyle w:val="Lijstalinea"/>
+        <w:pStyle w:val="ListParagraph"/>
         <w:numPr>
           <w:ilvl w:val="0"/>
           <w:numId w:val="29"/>
@@ -2804,7 +2804,7 @@
     </w:p>
     <w:p>
       <w:pPr>
-        <w:pStyle w:val="Lijstalinea"/>
+        <w:pStyle w:val="ListParagraph"/>
         <w:numPr>
           <w:ilvl w:val="0"/>
           <w:numId w:val="29"/>
@@ -2839,7 +2839,7 @@
     </w:p>
     <w:p>
       <w:pPr>
-        <w:pStyle w:val="Lijstalinea"/>
+        <w:pStyle w:val="ListParagraph"/>
         <w:numPr>
           <w:ilvl w:val="0"/>
           <w:numId w:val="29"/>
@@ -2867,7 +2867,7 @@
     </w:p>
     <w:p>
       <w:pPr>
-        <w:pStyle w:val="Lijstalinea"/>
+        <w:pStyle w:val="ListParagraph"/>
         <w:numPr>
           <w:ilvl w:val="1"/>
           <w:numId w:val="29"/>
@@ -2895,7 +2895,7 @@
     </w:p>
     <w:p>
       <w:pPr>
-        <w:pStyle w:val="Lijstalinea"/>
+        <w:pStyle w:val="ListParagraph"/>
         <w:numPr>
           <w:ilvl w:val="1"/>
           <w:numId w:val="29"/>
@@ -2944,7 +2944,7 @@
     </w:p>
     <w:p>
       <w:pPr>
-        <w:pStyle w:val="Lijstalinea"/>
+        <w:pStyle w:val="ListParagraph"/>
         <w:numPr>
           <w:ilvl w:val="1"/>
           <w:numId w:val="29"/>
@@ -3005,7 +3005,7 @@
     </w:p>
     <w:p>
       <w:pPr>
-        <w:pStyle w:val="Kop1"/>
+        <w:pStyle w:val="Heading1"/>
         <w:jc w:val="left"/>
       </w:pPr>
       <w:bookmarkStart w:id="1" w:name="_Toc183594786"/>
@@ -3017,7 +3017,7 @@
     </w:p>
     <w:p>
       <w:pPr>
-        <w:pStyle w:val="Kop2"/>
+        <w:pStyle w:val="Heading2"/>
         <w:rPr>
           <w:i/>
           <w:iCs/>
@@ -3059,7 +3059,7 @@
     </w:p>
     <w:p>
       <w:pPr>
-        <w:pStyle w:val="Kop2"/>
+        <w:pStyle w:val="Heading2"/>
       </w:pPr>
       <w:bookmarkStart w:id="3" w:name="_Toc183594788"/>
       <w:r>
@@ -3083,7 +3083,7 @@
     </w:p>
     <w:p>
       <w:pPr>
-        <w:pStyle w:val="Kop2"/>
+        <w:pStyle w:val="Heading2"/>
       </w:pPr>
       <w:bookmarkStart w:id="4" w:name="_Toc183594789"/>
       <w:r>
@@ -3107,7 +3107,7 @@
     </w:p>
     <w:p>
       <w:pPr>
-        <w:pStyle w:val="Kop2"/>
+        <w:pStyle w:val="Heading2"/>
       </w:pPr>
       <w:bookmarkStart w:id="5" w:name="_Toc183594790"/>
       <w:r>
@@ -3131,7 +3131,7 @@
     </w:p>
     <w:p>
       <w:pPr>
-        <w:pStyle w:val="Kop2"/>
+        <w:pStyle w:val="Heading2"/>
       </w:pPr>
       <w:bookmarkStart w:id="6" w:name="_Toc183594791"/>
       <w:r>
@@ -3156,7 +3156,7 @@
     <w:p/>
     <w:p>
       <w:pPr>
-        <w:pStyle w:val="Kop2"/>
+        <w:pStyle w:val="Heading2"/>
       </w:pPr>
       <w:bookmarkStart w:id="7" w:name="_Toc183594792"/>
       <w:r>
@@ -3605,7 +3605,7 @@
           </w:tcPr>
           <w:p>
             <w:pPr>
-              <w:pStyle w:val="Lijstalinea"/>
+              <w:pStyle w:val="ListParagraph"/>
               <w:numPr>
                 <w:ilvl w:val="0"/>
                 <w:numId w:val="31"/>
@@ -3626,7 +3626,7 @@
           </w:p>
           <w:p>
             <w:pPr>
-              <w:pStyle w:val="Lijstalinea"/>
+              <w:pStyle w:val="ListParagraph"/>
               <w:numPr>
                 <w:ilvl w:val="0"/>
                 <w:numId w:val="31"/>
@@ -3647,7 +3647,7 @@
           </w:p>
           <w:p>
             <w:pPr>
-              <w:pStyle w:val="Lijstalinea"/>
+              <w:pStyle w:val="ListParagraph"/>
               <w:numPr>
                 <w:ilvl w:val="0"/>
                 <w:numId w:val="31"/>
@@ -3668,7 +3668,7 @@
           </w:p>
           <w:p>
             <w:pPr>
-              <w:pStyle w:val="Lijstalinea"/>
+              <w:pStyle w:val="ListParagraph"/>
               <w:numPr>
                 <w:ilvl w:val="0"/>
                 <w:numId w:val="31"/>
@@ -4127,7 +4127,7 @@
           </w:tcPr>
           <w:p>
             <w:pPr>
-              <w:pStyle w:val="Lijstalinea"/>
+              <w:pStyle w:val="ListParagraph"/>
               <w:numPr>
                 <w:ilvl w:val="0"/>
                 <w:numId w:val="31"/>
@@ -4148,7 +4148,7 @@
           </w:p>
           <w:p>
             <w:pPr>
-              <w:pStyle w:val="Lijstalinea"/>
+              <w:pStyle w:val="ListParagraph"/>
               <w:numPr>
                 <w:ilvl w:val="0"/>
                 <w:numId w:val="31"/>
@@ -4169,7 +4169,7 @@
           </w:p>
           <w:p>
             <w:pPr>
-              <w:pStyle w:val="Lijstalinea"/>
+              <w:pStyle w:val="ListParagraph"/>
               <w:numPr>
                 <w:ilvl w:val="0"/>
                 <w:numId w:val="31"/>
@@ -4190,7 +4190,7 @@
           </w:p>
           <w:p>
             <w:pPr>
-              <w:pStyle w:val="Lijstalinea"/>
+              <w:pStyle w:val="ListParagraph"/>
               <w:numPr>
                 <w:ilvl w:val="0"/>
                 <w:numId w:val="31"/>
@@ -4220,7 +4220,7 @@
     </w:p>
     <w:p>
       <w:pPr>
-        <w:pStyle w:val="Kop1"/>
+        <w:pStyle w:val="Heading1"/>
         <w:jc w:val="left"/>
       </w:pPr>
       <w:bookmarkStart w:id="8" w:name="_Toc183594793"/>
@@ -4232,7 +4232,7 @@
     </w:p>
     <w:p>
       <w:pPr>
-        <w:pStyle w:val="Kop2"/>
+        <w:pStyle w:val="Heading2"/>
         <w:rPr>
           <w:i/>
           <w:iCs/>
@@ -4271,7 +4271,7 @@
     </w:p>
     <w:p>
       <w:pPr>
-        <w:pStyle w:val="Kop2"/>
+        <w:pStyle w:val="Heading2"/>
       </w:pPr>
       <w:bookmarkStart w:id="10" w:name="_Toc183594795"/>
       <w:r>
@@ -4369,7 +4369,7 @@
     </w:p>
     <w:p>
       <w:pPr>
-        <w:pStyle w:val="Kop2"/>
+        <w:pStyle w:val="Heading2"/>
       </w:pPr>
       <w:bookmarkStart w:id="11" w:name="_Toc183594796"/>
       <w:r>
@@ -4398,7 +4398,7 @@
     </w:p>
     <w:p>
       <w:pPr>
-        <w:pStyle w:val="Kop2"/>
+        <w:pStyle w:val="Heading2"/>
       </w:pPr>
       <w:bookmarkStart w:id="12" w:name="_Toc183594797"/>
       <w:r>
@@ -4416,7 +4416,7 @@
     </w:p>
     <w:p>
       <w:pPr>
-        <w:pStyle w:val="Lijstalinea"/>
+        <w:pStyle w:val="ListParagraph"/>
         <w:rPr>
           <w:rFonts w:cstheme="minorHAnsi"/>
         </w:rPr>
@@ -4474,7 +4474,7 @@
     </w:p>
     <w:p>
       <w:pPr>
-        <w:pStyle w:val="Geenafstand"/>
+        <w:pStyle w:val="NoSpacing"/>
         <w:spacing w:before="120" w:after="120"/>
         <w:ind w:firstLine="708"/>
         <w:rPr>
@@ -4501,7 +4501,7 @@
     </w:p>
     <w:p>
       <w:pPr>
-        <w:pStyle w:val="Geenafstand"/>
+        <w:pStyle w:val="NoSpacing"/>
         <w:spacing w:before="120" w:after="120"/>
         <w:ind w:firstLine="708"/>
         <w:rPr>
@@ -4529,7 +4529,7 @@
     </w:p>
     <w:p>
       <w:pPr>
-        <w:pStyle w:val="Kop2"/>
+        <w:pStyle w:val="Heading2"/>
       </w:pPr>
       <w:bookmarkStart w:id="13" w:name="_Toc183594798"/>
       <w:r>
@@ -5075,7 +5075,7 @@
           </w:tcPr>
           <w:p>
             <w:pPr>
-              <w:pStyle w:val="Lijstalinea"/>
+              <w:pStyle w:val="ListParagraph"/>
               <w:numPr>
                 <w:ilvl w:val="0"/>
                 <w:numId w:val="31"/>
@@ -5096,7 +5096,7 @@
           </w:p>
           <w:p>
             <w:pPr>
-              <w:pStyle w:val="Lijstalinea"/>
+              <w:pStyle w:val="ListParagraph"/>
               <w:spacing w:before="240" w:line="240" w:lineRule="auto"/>
               <w:rPr>
                 <w:rFonts w:ascii="Calibri" w:eastAsia="Times New Roman" w:hAnsi="Calibri" w:cs="Calibri"/>
@@ -5557,7 +5557,7 @@
           </w:tcPr>
           <w:p>
             <w:pPr>
-              <w:pStyle w:val="Lijstalinea"/>
+              <w:pStyle w:val="ListParagraph"/>
               <w:numPr>
                 <w:ilvl w:val="0"/>
                 <w:numId w:val="31"/>
@@ -5578,7 +5578,7 @@
           </w:p>
           <w:p>
             <w:pPr>
-              <w:pStyle w:val="Lijstalinea"/>
+              <w:pStyle w:val="ListParagraph"/>
               <w:numPr>
                 <w:ilvl w:val="0"/>
                 <w:numId w:val="31"/>
@@ -5599,7 +5599,7 @@
           </w:p>
           <w:p>
             <w:pPr>
-              <w:pStyle w:val="Lijstalinea"/>
+              <w:pStyle w:val="ListParagraph"/>
               <w:numPr>
                 <w:ilvl w:val="0"/>
                 <w:numId w:val="31"/>
@@ -5620,7 +5620,7 @@
           </w:p>
           <w:p>
             <w:pPr>
-              <w:pStyle w:val="Lijstalinea"/>
+              <w:pStyle w:val="ListParagraph"/>
               <w:numPr>
                 <w:ilvl w:val="0"/>
                 <w:numId w:val="31"/>
@@ -5641,7 +5641,7 @@
           </w:p>
           <w:p>
             <w:pPr>
-              <w:pStyle w:val="Lijstalinea"/>
+              <w:pStyle w:val="ListParagraph"/>
               <w:numPr>
                 <w:ilvl w:val="0"/>
                 <w:numId w:val="31"/>
@@ -6167,7 +6167,7 @@
           </w:tcPr>
           <w:p>
             <w:pPr>
-              <w:pStyle w:val="Lijstalinea"/>
+              <w:pStyle w:val="ListParagraph"/>
               <w:numPr>
                 <w:ilvl w:val="0"/>
                 <w:numId w:val="31"/>
@@ -6188,7 +6188,7 @@
           </w:p>
           <w:p>
             <w:pPr>
-              <w:pStyle w:val="Lijstalinea"/>
+              <w:pStyle w:val="ListParagraph"/>
               <w:numPr>
                 <w:ilvl w:val="0"/>
                 <w:numId w:val="31"/>
@@ -6233,7 +6233,7 @@
     </w:p>
     <w:p>
       <w:pPr>
-        <w:pStyle w:val="Kop1"/>
+        <w:pStyle w:val="Heading1"/>
         <w:jc w:val="left"/>
       </w:pPr>
       <w:bookmarkStart w:id="17" w:name="_Toc183594800"/>
@@ -6245,7 +6245,7 @@
     </w:p>
     <w:p>
       <w:pPr>
-        <w:pStyle w:val="Kop2"/>
+        <w:pStyle w:val="Heading2"/>
         <w:rPr>
           <w:i/>
           <w:iCs/>
@@ -6284,7 +6284,7 @@
     </w:p>
     <w:p>
       <w:pPr>
-        <w:pStyle w:val="Kop2"/>
+        <w:pStyle w:val="Heading2"/>
       </w:pPr>
       <w:bookmarkStart w:id="19" w:name="_Toc183594802"/>
       <w:r>
@@ -6475,7 +6475,7 @@
     <w:p/>
     <w:p>
       <w:pPr>
-        <w:pStyle w:val="Kop2"/>
+        <w:pStyle w:val="Heading2"/>
       </w:pPr>
       <w:bookmarkStart w:id="20" w:name="_Toc183594803"/>
       <w:r>
@@ -6494,7 +6494,7 @@
     </w:p>
     <w:p>
       <w:pPr>
-        <w:pStyle w:val="Kop2"/>
+        <w:pStyle w:val="Heading2"/>
       </w:pPr>
       <w:bookmarkStart w:id="21" w:name="_Toc183594804"/>
       <w:r>
@@ -6539,7 +6539,7 @@
     </w:p>
     <w:p>
       <w:pPr>
-        <w:pStyle w:val="Kop2"/>
+        <w:pStyle w:val="Heading2"/>
       </w:pPr>
       <w:bookmarkStart w:id="22" w:name="_Toc183594805"/>
       <w:r>
@@ -6675,7 +6675,7 @@
     <w:p/>
     <w:p>
       <w:pPr>
-        <w:pStyle w:val="Kop2"/>
+        <w:pStyle w:val="Heading2"/>
       </w:pPr>
       <w:bookmarkStart w:id="23" w:name="_Toc183594806"/>
       <w:r>
@@ -7161,7 +7161,7 @@
           </w:tcPr>
           <w:p>
             <w:pPr>
-              <w:pStyle w:val="Lijstalinea"/>
+              <w:pStyle w:val="ListParagraph"/>
               <w:numPr>
                 <w:ilvl w:val="0"/>
                 <w:numId w:val="31"/>
@@ -7203,7 +7203,7 @@
           </w:p>
           <w:p>
             <w:pPr>
-              <w:pStyle w:val="Lijstalinea"/>
+              <w:pStyle w:val="ListParagraph"/>
               <w:numPr>
                 <w:ilvl w:val="0"/>
                 <w:numId w:val="31"/>
@@ -7697,7 +7697,7 @@
           </w:tcPr>
           <w:p>
             <w:pPr>
-              <w:pStyle w:val="Lijstalinea"/>
+              <w:pStyle w:val="ListParagraph"/>
               <w:numPr>
                 <w:ilvl w:val="0"/>
                 <w:numId w:val="31"/>
@@ -7718,7 +7718,7 @@
           </w:p>
           <w:p>
             <w:pPr>
-              <w:pStyle w:val="Lijstalinea"/>
+              <w:pStyle w:val="ListParagraph"/>
               <w:numPr>
                 <w:ilvl w:val="0"/>
                 <w:numId w:val="31"/>
@@ -8195,7 +8195,7 @@
           </w:tcPr>
           <w:p>
             <w:pPr>
-              <w:pStyle w:val="Lijstalinea"/>
+              <w:pStyle w:val="ListParagraph"/>
               <w:numPr>
                 <w:ilvl w:val="0"/>
                 <w:numId w:val="31"/>
@@ -8232,7 +8232,7 @@
     <w:p/>
     <w:p>
       <w:pPr>
-        <w:pStyle w:val="Kop1"/>
+        <w:pStyle w:val="Heading1"/>
         <w:jc w:val="left"/>
       </w:pPr>
       <w:bookmarkStart w:id="24" w:name="_Toc183594807"/>
@@ -8243,7 +8243,7 @@
     </w:p>
     <w:p>
       <w:pPr>
-        <w:pStyle w:val="Kop2"/>
+        <w:pStyle w:val="Heading2"/>
         <w:rPr>
           <w:i/>
           <w:iCs/>
@@ -8300,7 +8300,7 @@
     </w:p>
     <w:p>
       <w:pPr>
-        <w:pStyle w:val="Kop2"/>
+        <w:pStyle w:val="Heading2"/>
       </w:pPr>
       <w:bookmarkStart w:id="26" w:name="_Toc183594809"/>
       <w:r>
@@ -8310,9 +8310,12 @@
     </w:p>
     <w:p>
       <w:pPr>
-        <w:pStyle w:val="Kop2"/>
-      </w:pPr>
-      <w:r>
+        <w:pStyle w:val="Heading2"/>
+      </w:pPr>
+      <w:r>
+        <w:rPr>
+          <w:noProof/>
+        </w:rPr>
         <w:drawing>
           <wp:inline distT="0" distB="0" distL="0" distR="0" wp14:anchorId="0E9B5529" wp14:editId="4F71A8EF">
             <wp:extent cx="5760720" cy="4948555"/>
@@ -8363,7 +8366,7 @@
     <w:p/>
     <w:p>
       <w:pPr>
-        <w:pStyle w:val="Kop2"/>
+        <w:pStyle w:val="Heading2"/>
       </w:pPr>
       <w:bookmarkStart w:id="27" w:name="_Toc183594810"/>
       <w:r>
@@ -8382,7 +8385,7 @@
     </w:p>
     <w:p>
       <w:pPr>
-        <w:pStyle w:val="Kop2"/>
+        <w:pStyle w:val="Heading2"/>
       </w:pPr>
       <w:bookmarkStart w:id="28" w:name="_Toc183594811"/>
       <w:r>
@@ -8404,7 +8407,7 @@
     </w:p>
     <w:p>
       <w:pPr>
-        <w:pStyle w:val="Kop2"/>
+        <w:pStyle w:val="Heading2"/>
       </w:pPr>
       <w:bookmarkStart w:id="29" w:name="_Toc183594812"/>
       <w:r>
@@ -8459,13 +8462,7 @@
     </w:p>
     <w:p>
       <w:r>
-        <w:t xml:space="preserve">Deze sprint was wat onoverzichtelijker voor mij, dit kwam doordat de sprint </w:t>
-      </w:r>
-      <w:r>
-        <w:t>halverwege</w:t>
-      </w:r>
-      <w:r>
-        <w:t xml:space="preserve"> werd onderbroken door vakantie.</w:t>
+        <w:t>Deze sprint was wat onoverzichtelijker voor mij, dit kwam doordat de sprint halverwege werd onderbroken door vakantie.</w:t>
       </w:r>
       <w:r>
         <w:br/>
@@ -8473,13 +8470,7 @@
       </w:r>
       <w:r>
         <w:br/>
-        <w:t xml:space="preserve">los van dit ben ik deze sprint verder gegaan met de </w:t>
-      </w:r>
-      <w:r>
-        <w:t>obstakels</w:t>
-      </w:r>
-      <w:r>
-        <w:t xml:space="preserve"> en bugfixes daarvan, ook heb ik een begin gemaakt aan de map selection screen, maar deze moet anders worden opgebouwd worden.</w:t>
+        <w:t>los van dit ben ik deze sprint verder gegaan met de obstakels en bugfixes daarvan, ook heb ik een begin gemaakt aan de map selection screen, maar deze moet anders worden opgebouwd worden.</w:t>
       </w:r>
     </w:p>
     <w:p>
@@ -8499,19 +8490,7 @@
     </w:p>
     <w:p>
       <w:r>
-        <w:t xml:space="preserve">ik ben wel tevreden met de vooruitgang dat we deze sprint hebben gemaakt, met de movement rework, obstakels, debuffs en leaderboard. ookal hadden we meer af kunnen krijgen deze sprint als we eerder het draad op hadden gepakt na de </w:t>
-      </w:r>
-      <w:r>
-        <w:t>vakantie</w:t>
-      </w:r>
-      <w:r>
-        <w:t xml:space="preserve">. ik </w:t>
-      </w:r>
-      <w:r>
-        <w:t>vond</w:t>
-      </w:r>
-      <w:r>
-        <w:t xml:space="preserve"> dat ik harder had kunnen doorwerken aan de presentatie zodat ik die ook optijd kon ge</w:t>
+        <w:t>ik ben wel tevreden met de vooruitgang dat we deze sprint hebben gemaakt, met de movement rework, obstakels, debuffs en leaderboard. ookal hadden we meer af kunnen krijgen deze sprint als we eerder het draad op hadden gepakt na de vakantie. ik vond dat ik harder had kunnen doorwerken aan de presentatie zodat ik die ook optijd kon ge</w:t>
       </w:r>
       <w:r>
         <w:t>v</w:t>
@@ -8526,7 +8505,7 @@
     <w:p/>
     <w:p>
       <w:pPr>
-        <w:pStyle w:val="Kop2"/>
+        <w:pStyle w:val="Heading2"/>
       </w:pPr>
       <w:bookmarkStart w:id="30" w:name="_Toc183594813"/>
       <w:r>
@@ -9032,7 +9011,7 @@
           </w:tcPr>
           <w:p>
             <w:pPr>
-              <w:pStyle w:val="Lijstalinea"/>
+              <w:pStyle w:val="ListParagraph"/>
               <w:numPr>
                 <w:ilvl w:val="0"/>
                 <w:numId w:val="31"/>
@@ -9053,7 +9032,7 @@
           </w:p>
           <w:p>
             <w:pPr>
-              <w:pStyle w:val="Lijstalinea"/>
+              <w:pStyle w:val="ListParagraph"/>
               <w:spacing w:before="240" w:line="240" w:lineRule="auto"/>
               <w:rPr>
                 <w:rFonts w:ascii="Calibri" w:eastAsia="Times New Roman" w:hAnsi="Calibri" w:cs="Calibri"/>
@@ -9529,7 +9508,7 @@
           </w:tcPr>
           <w:p>
             <w:pPr>
-              <w:pStyle w:val="Lijstalinea"/>
+              <w:pStyle w:val="ListParagraph"/>
               <w:numPr>
                 <w:ilvl w:val="0"/>
                 <w:numId w:val="31"/>
@@ -9550,7 +9529,7 @@
           </w:p>
           <w:p>
             <w:pPr>
-              <w:pStyle w:val="Lijstalinea"/>
+              <w:pStyle w:val="ListParagraph"/>
               <w:spacing w:before="240" w:line="240" w:lineRule="auto"/>
               <w:rPr>
                 <w:rFonts w:ascii="Calibri" w:eastAsia="Times New Roman" w:hAnsi="Calibri" w:cs="Calibri"/>
@@ -10015,7 +9994,7 @@
           </w:tcPr>
           <w:p>
             <w:pPr>
-              <w:pStyle w:val="Lijstalinea"/>
+              <w:pStyle w:val="ListParagraph"/>
               <w:numPr>
                 <w:ilvl w:val="0"/>
                 <w:numId w:val="31"/>
@@ -10036,7 +10015,7 @@
           </w:p>
           <w:p>
             <w:pPr>
-              <w:pStyle w:val="Lijstalinea"/>
+              <w:pStyle w:val="ListParagraph"/>
               <w:numPr>
                 <w:ilvl w:val="0"/>
                 <w:numId w:val="31"/>
@@ -10507,7 +10486,7 @@
           </w:tcPr>
           <w:p>
             <w:pPr>
-              <w:pStyle w:val="Lijstalinea"/>
+              <w:pStyle w:val="ListParagraph"/>
               <w:numPr>
                 <w:ilvl w:val="0"/>
                 <w:numId w:val="31"/>
@@ -10595,14 +10574,7 @@
                 <w:rFonts w:ascii="Calibri" w:eastAsia="Times New Roman" w:hAnsi="Calibri" w:cs="Calibri"/>
                 <w:color w:val="000000"/>
               </w:rPr>
-              <w:t>J</w:t>
-            </w:r>
-            <w:r>
-              <w:rPr>
-                <w:rFonts w:ascii="Calibri" w:eastAsia="Times New Roman" w:hAnsi="Calibri" w:cs="Calibri"/>
-                <w:color w:val="000000"/>
-              </w:rPr>
-              <w:t>orick Wassink</w:t>
+              <w:t>Jorick Wassink</w:t>
             </w:r>
           </w:p>
         </w:tc>
@@ -10984,7 +10956,7 @@
           </w:tcPr>
           <w:p>
             <w:pPr>
-              <w:pStyle w:val="Lijstalinea"/>
+              <w:pStyle w:val="ListParagraph"/>
               <w:numPr>
                 <w:ilvl w:val="0"/>
                 <w:numId w:val="31"/>
@@ -11000,7 +10972,7 @@
                 <w:rFonts w:ascii="Calibri" w:eastAsia="Times New Roman" w:hAnsi="Calibri" w:cs="Calibri"/>
                 <w:color w:val="000000"/>
               </w:rPr>
-              <w:t>Speler huidige health word laten zien op het leaderboard.</w:t>
+              <w:t xml:space="preserve">Debuffs worden gegeven aan de spelers die hoger staan dan de spelers die onder de “winnende” spelers staan </w:t>
             </w:r>
           </w:p>
         </w:tc>
@@ -11150,28 +11122,7 @@
                 <w:rFonts w:ascii="Calibri" w:eastAsia="Times New Roman" w:hAnsi="Calibri" w:cs="Calibri"/>
                 <w:color w:val="000000"/>
               </w:rPr>
-              <w:t>3</w:t>
-            </w:r>
-            <w:r>
-              <w:rPr>
-                <w:rFonts w:ascii="Calibri" w:eastAsia="Times New Roman" w:hAnsi="Calibri" w:cs="Calibri"/>
-                <w:color w:val="000000"/>
-              </w:rPr>
-              <w:t>3</w:t>
-            </w:r>
-            <w:r>
-              <w:rPr>
-                <w:rFonts w:ascii="Calibri" w:eastAsia="Times New Roman" w:hAnsi="Calibri" w:cs="Calibri"/>
-                <w:color w:val="000000"/>
-              </w:rPr>
-              <w:t xml:space="preserve">. </w:t>
-            </w:r>
-            <w:r>
-              <w:rPr>
-                <w:rFonts w:ascii="Calibri" w:eastAsia="Times New Roman" w:hAnsi="Calibri" w:cs="Calibri"/>
-                <w:color w:val="000000"/>
-              </w:rPr>
-              <w:t xml:space="preserve">Turrets draaien </w:t>
+              <w:t xml:space="preserve">33. Turrets draaien </w:t>
             </w:r>
           </w:p>
         </w:tc>
@@ -11475,7 +11426,7 @@
           </w:tcPr>
           <w:p>
             <w:pPr>
-              <w:pStyle w:val="Lijstalinea"/>
+              <w:pStyle w:val="ListParagraph"/>
               <w:numPr>
                 <w:ilvl w:val="0"/>
                 <w:numId w:val="31"/>
@@ -11496,7 +11447,7 @@
           </w:p>
           <w:p>
             <w:pPr>
-              <w:pStyle w:val="Lijstalinea"/>
+              <w:pStyle w:val="ListParagraph"/>
               <w:numPr>
                 <w:ilvl w:val="0"/>
                 <w:numId w:val="31"/>
@@ -11877,7 +11828,7 @@
 <w:hdr xmlns:wpc="http://schemas.microsoft.com/office/word/2010/wordprocessingCanvas" xmlns:cx="http://schemas.microsoft.com/office/drawing/2014/chartex" xmlns:cx1="http://schemas.microsoft.com/office/drawing/2015/9/8/chartex" xmlns:cx2="http://schemas.microsoft.com/office/drawing/2015/10/21/chartex" xmlns:cx3="http://schemas.microsoft.com/office/drawing/2016/5/9/chartex" xmlns:cx4="http://schemas.microsoft.com/office/drawing/2016/5/10/chartex" xmlns:cx5="http://schemas.microsoft.com/office/drawing/2016/5/11/chartex" xmlns:cx6="http://schemas.microsoft.com/office/drawing/2016/5/12/chartex" xmlns:cx7="http://schemas.microsoft.com/office/drawing/2016/5/13/chartex" xmlns:cx8="http://schemas.microsoft.com/office/drawing/2016/5/14/chartex" xmlns:mc="http://schemas.openxmlformats.org/markup-compatibility/2006" xmlns:aink="http://schemas.microsoft.com/office/drawing/2016/ink" xmlns:am3d="http://schemas.microsoft.com/office/drawing/2017/model3d" xmlns:o="urn:schemas-microsoft-com:office:office" xmlns:oel="http://schemas.microsoft.com/office/2019/extlst" xmlns:r="http://schemas.openxmlformats.org/officeDocument/2006/relationships" xmlns:m="http://schemas.openxmlformats.org/officeDocument/2006/math" xmlns:v="urn:schemas-microsoft-com:vml" xmlns:wp14="http://schemas.microsoft.com/office/word/2010/wordprocessingDrawing" xmlns:wp="http://schemas.openxmlformats.org/drawingml/2006/wordprocessingDrawing" xmlns:w10="urn:schemas-microsoft-com:office:word" xmlns:w="http://schemas.openxmlformats.org/wordprocessingml/2006/main" xmlns:w14="http://schemas.microsoft.com/office/word/2010/wordml" xmlns:w15="http://schemas.microsoft.com/office/word/2012/wordml" xmlns:w16cex="http://schemas.microsoft.com/office/word/2018/wordml/cex" xmlns:w16cid="http://schemas.microsoft.com/office/word/2016/wordml/cid" xmlns:w16="http://schemas.microsoft.com/office/word/2018/wordml" xmlns:w16du="http://schemas.microsoft.com/office/word/2023/wordml/word16du" xmlns:w16sdtdh="http://schemas.microsoft.com/office/word/2020/wordml/sdtdatahash" xmlns:w16sdtfl="http://schemas.microsoft.com/office/word/2024/wordml/sdtformatlock" xmlns:w16se="http://schemas.microsoft.com/office/word/2015/wordml/symex" xmlns:wpg="http://schemas.microsoft.com/office/word/2010/wordprocessingGroup" xmlns:wpi="http://schemas.microsoft.com/office/word/2010/wordprocessingInk" xmlns:wne="http://schemas.microsoft.com/office/word/2006/wordml" xmlns:wps="http://schemas.microsoft.com/office/word/2010/wordprocessingShape" mc:Ignorable="w14 w15 w16se w16cid w16 w16cex w16sdtdh w16sdtfl w16du wp14">
   <w:p>
     <w:pPr>
-      <w:pStyle w:val="Koptekst"/>
+      <w:pStyle w:val="Header"/>
       <w:jc w:val="center"/>
     </w:pPr>
     <w:r>
@@ -11936,7 +11887,7 @@
   </w:p>
   <w:p>
     <w:pPr>
-      <w:pStyle w:val="Koptekst"/>
+      <w:pStyle w:val="Header"/>
     </w:pPr>
   </w:p>
 </w:hdr>
@@ -15365,16 +15316,16 @@
     <w:lsdException w:name="Unresolved Mention" w:semiHidden="1" w:unhideWhenUsed="1"/>
     <w:lsdException w:name="Smart Link" w:semiHidden="1" w:unhideWhenUsed="1"/>
   </w:latentStyles>
-  <w:style w:type="paragraph" w:default="1" w:styleId="Standaard">
+  <w:style w:type="paragraph" w:default="1" w:styleId="Normal">
     <w:name w:val="Normal"/>
     <w:qFormat/>
     <w:rsid w:val="00B44264"/>
   </w:style>
-  <w:style w:type="paragraph" w:styleId="Kop1">
+  <w:style w:type="paragraph" w:styleId="Heading1">
     <w:name w:val="heading 1"/>
-    <w:basedOn w:val="Standaard"/>
-    <w:next w:val="Standaard"/>
-    <w:link w:val="Kop1Char"/>
+    <w:basedOn w:val="Normal"/>
+    <w:next w:val="Normal"/>
+    <w:link w:val="Heading1Char"/>
     <w:uiPriority w:val="9"/>
     <w:qFormat/>
     <w:rsid w:val="00B44264"/>
@@ -15392,11 +15343,11 @@
       <w:szCs w:val="32"/>
     </w:rPr>
   </w:style>
-  <w:style w:type="paragraph" w:styleId="Kop2">
+  <w:style w:type="paragraph" w:styleId="Heading2">
     <w:name w:val="heading 2"/>
-    <w:basedOn w:val="Standaard"/>
-    <w:next w:val="Standaard"/>
-    <w:link w:val="Kop2Char"/>
+    <w:basedOn w:val="Normal"/>
+    <w:next w:val="Normal"/>
+    <w:link w:val="Heading2Char"/>
     <w:uiPriority w:val="9"/>
     <w:unhideWhenUsed/>
     <w:qFormat/>
@@ -15413,11 +15364,11 @@
       <w:sz w:val="32"/>
     </w:rPr>
   </w:style>
-  <w:style w:type="paragraph" w:styleId="Kop3">
+  <w:style w:type="paragraph" w:styleId="Heading3">
     <w:name w:val="heading 3"/>
-    <w:basedOn w:val="Standaard"/>
-    <w:next w:val="Standaard"/>
-    <w:link w:val="Kop3Char"/>
+    <w:basedOn w:val="Normal"/>
+    <w:next w:val="Normal"/>
+    <w:link w:val="Heading3Char"/>
     <w:uiPriority w:val="9"/>
     <w:unhideWhenUsed/>
     <w:qFormat/>
@@ -15437,11 +15388,11 @@
       <w:szCs w:val="24"/>
     </w:rPr>
   </w:style>
-  <w:style w:type="paragraph" w:styleId="Kop4">
+  <w:style w:type="paragraph" w:styleId="Heading4">
     <w:name w:val="heading 4"/>
-    <w:basedOn w:val="Standaard"/>
-    <w:next w:val="Standaard"/>
-    <w:link w:val="Kop4Char"/>
+    <w:basedOn w:val="Normal"/>
+    <w:next w:val="Normal"/>
+    <w:link w:val="Heading4Char"/>
     <w:uiPriority w:val="9"/>
     <w:semiHidden/>
     <w:unhideWhenUsed/>
@@ -15460,11 +15411,11 @@
       <w:color w:val="000000" w:themeColor="text1"/>
     </w:rPr>
   </w:style>
-  <w:style w:type="paragraph" w:styleId="Kop6">
+  <w:style w:type="paragraph" w:styleId="Heading6">
     <w:name w:val="heading 6"/>
-    <w:basedOn w:val="Standaard"/>
-    <w:next w:val="Standaard"/>
-    <w:link w:val="Kop6Char"/>
+    <w:basedOn w:val="Normal"/>
+    <w:next w:val="Normal"/>
+    <w:link w:val="Heading6Char"/>
     <w:uiPriority w:val="9"/>
     <w:semiHidden/>
     <w:unhideWhenUsed/>
@@ -15481,12 +15432,13 @@
       <w:color w:val="1F4D78" w:themeColor="accent1" w:themeShade="7F"/>
     </w:rPr>
   </w:style>
-  <w:style w:type="character" w:default="1" w:styleId="Standaardalinea-lettertype">
+  <w:style w:type="character" w:default="1" w:styleId="DefaultParagraphFont">
     <w:name w:val="Default Paragraph Font"/>
     <w:uiPriority w:val="1"/>
+    <w:semiHidden/>
     <w:unhideWhenUsed/>
   </w:style>
-  <w:style w:type="table" w:default="1" w:styleId="Standaardtabel">
+  <w:style w:type="table" w:default="1" w:styleId="TableNormal">
     <w:name w:val="Normal Table"/>
     <w:uiPriority w:val="99"/>
     <w:semiHidden/>
@@ -15501,16 +15453,16 @@
       </w:tblCellMar>
     </w:tblPr>
   </w:style>
-  <w:style w:type="numbering" w:default="1" w:styleId="Geenlijst">
+  <w:style w:type="numbering" w:default="1" w:styleId="NoList">
     <w:name w:val="No List"/>
     <w:uiPriority w:val="99"/>
     <w:semiHidden/>
     <w:unhideWhenUsed/>
   </w:style>
-  <w:style w:type="paragraph" w:styleId="Koptekst">
+  <w:style w:type="paragraph" w:styleId="Header">
     <w:name w:val="header"/>
-    <w:basedOn w:val="Standaard"/>
-    <w:link w:val="KoptekstChar"/>
+    <w:basedOn w:val="Normal"/>
+    <w:link w:val="HeaderChar"/>
     <w:uiPriority w:val="99"/>
     <w:unhideWhenUsed/>
     <w:rsid w:val="003D0CAD"/>
@@ -15522,17 +15474,17 @@
       <w:spacing w:after="0" w:line="240" w:lineRule="auto"/>
     </w:pPr>
   </w:style>
-  <w:style w:type="character" w:customStyle="1" w:styleId="KoptekstChar">
-    <w:name w:val="Koptekst Char"/>
-    <w:basedOn w:val="Standaardalinea-lettertype"/>
-    <w:link w:val="Koptekst"/>
+  <w:style w:type="character" w:customStyle="1" w:styleId="HeaderChar">
+    <w:name w:val="Header Char"/>
+    <w:basedOn w:val="DefaultParagraphFont"/>
+    <w:link w:val="Header"/>
     <w:uiPriority w:val="99"/>
     <w:rsid w:val="003D0CAD"/>
   </w:style>
-  <w:style w:type="paragraph" w:styleId="Voettekst">
+  <w:style w:type="paragraph" w:styleId="Footer">
     <w:name w:val="footer"/>
-    <w:basedOn w:val="Standaard"/>
-    <w:link w:val="VoettekstChar"/>
+    <w:basedOn w:val="Normal"/>
+    <w:link w:val="FooterChar"/>
     <w:uiPriority w:val="99"/>
     <w:unhideWhenUsed/>
     <w:rsid w:val="003D0CAD"/>
@@ -15544,16 +15496,16 @@
       <w:spacing w:after="0" w:line="240" w:lineRule="auto"/>
     </w:pPr>
   </w:style>
-  <w:style w:type="character" w:customStyle="1" w:styleId="VoettekstChar">
-    <w:name w:val="Voettekst Char"/>
-    <w:basedOn w:val="Standaardalinea-lettertype"/>
-    <w:link w:val="Voettekst"/>
+  <w:style w:type="character" w:customStyle="1" w:styleId="FooterChar">
+    <w:name w:val="Footer Char"/>
+    <w:basedOn w:val="DefaultParagraphFont"/>
+    <w:link w:val="Footer"/>
     <w:uiPriority w:val="99"/>
     <w:rsid w:val="003D0CAD"/>
   </w:style>
-  <w:style w:type="table" w:styleId="Tabelraster">
+  <w:style w:type="table" w:styleId="TableGrid">
     <w:name w:val="Table Grid"/>
-    <w:basedOn w:val="Standaardtabel"/>
+    <w:basedOn w:val="TableNormal"/>
     <w:uiPriority w:val="59"/>
     <w:rsid w:val="003D0CAD"/>
     <w:pPr>
@@ -15570,9 +15522,9 @@
       </w:tblBorders>
     </w:tblPr>
   </w:style>
-  <w:style w:type="paragraph" w:styleId="Lijstalinea">
+  <w:style w:type="paragraph" w:styleId="ListParagraph">
     <w:name w:val="List Paragraph"/>
-    <w:basedOn w:val="Standaard"/>
+    <w:basedOn w:val="Normal"/>
     <w:uiPriority w:val="34"/>
     <w:qFormat/>
     <w:rsid w:val="00716F2B"/>
@@ -15581,10 +15533,10 @@
       <w:contextualSpacing/>
     </w:pPr>
   </w:style>
-  <w:style w:type="character" w:customStyle="1" w:styleId="Kop1Char">
-    <w:name w:val="Kop 1 Char"/>
-    <w:basedOn w:val="Standaardalinea-lettertype"/>
-    <w:link w:val="Kop1"/>
+  <w:style w:type="character" w:customStyle="1" w:styleId="Heading1Char">
+    <w:name w:val="Heading 1 Char"/>
+    <w:basedOn w:val="DefaultParagraphFont"/>
+    <w:link w:val="Heading1"/>
     <w:uiPriority w:val="9"/>
     <w:rsid w:val="00B44264"/>
     <w:rPr>
@@ -15594,10 +15546,10 @@
       <w:szCs w:val="32"/>
     </w:rPr>
   </w:style>
-  <w:style w:type="character" w:customStyle="1" w:styleId="Kop2Char">
-    <w:name w:val="Kop 2 Char"/>
-    <w:basedOn w:val="Standaardalinea-lettertype"/>
-    <w:link w:val="Kop2"/>
+  <w:style w:type="character" w:customStyle="1" w:styleId="Heading2Char">
+    <w:name w:val="Heading 2 Char"/>
+    <w:basedOn w:val="DefaultParagraphFont"/>
+    <w:link w:val="Heading2"/>
     <w:uiPriority w:val="9"/>
     <w:rsid w:val="00AE7D59"/>
     <w:rPr>
@@ -15606,10 +15558,10 @@
       <w:sz w:val="32"/>
     </w:rPr>
   </w:style>
-  <w:style w:type="character" w:customStyle="1" w:styleId="Kop3Char">
-    <w:name w:val="Kop 3 Char"/>
-    <w:basedOn w:val="Standaardalinea-lettertype"/>
-    <w:link w:val="Kop3"/>
+  <w:style w:type="character" w:customStyle="1" w:styleId="Heading3Char">
+    <w:name w:val="Heading 3 Char"/>
+    <w:basedOn w:val="DefaultParagraphFont"/>
+    <w:link w:val="Heading3"/>
     <w:uiPriority w:val="9"/>
     <w:rsid w:val="00AE7D59"/>
     <w:rPr>
@@ -15621,10 +15573,10 @@
       <w:szCs w:val="24"/>
     </w:rPr>
   </w:style>
-  <w:style w:type="character" w:customStyle="1" w:styleId="Kop4Char">
-    <w:name w:val="Kop 4 Char"/>
-    <w:basedOn w:val="Standaardalinea-lettertype"/>
-    <w:link w:val="Kop4"/>
+  <w:style w:type="character" w:customStyle="1" w:styleId="Heading4Char">
+    <w:name w:val="Heading 4 Char"/>
+    <w:basedOn w:val="DefaultParagraphFont"/>
+    <w:link w:val="Heading4"/>
     <w:uiPriority w:val="9"/>
     <w:semiHidden/>
     <w:rsid w:val="00B44264"/>
@@ -15635,10 +15587,10 @@
       <w:color w:val="000000" w:themeColor="text1"/>
     </w:rPr>
   </w:style>
-  <w:style w:type="paragraph" w:styleId="Ballontekst">
+  <w:style w:type="paragraph" w:styleId="BalloonText">
     <w:name w:val="Balloon Text"/>
-    <w:basedOn w:val="Standaard"/>
-    <w:link w:val="BallontekstChar"/>
+    <w:basedOn w:val="Normal"/>
+    <w:link w:val="BalloonTextChar"/>
     <w:uiPriority w:val="99"/>
     <w:semiHidden/>
     <w:unhideWhenUsed/>
@@ -15652,10 +15604,10 @@
       <w:szCs w:val="16"/>
     </w:rPr>
   </w:style>
-  <w:style w:type="character" w:customStyle="1" w:styleId="BallontekstChar">
-    <w:name w:val="Ballontekst Char"/>
-    <w:basedOn w:val="Standaardalinea-lettertype"/>
-    <w:link w:val="Ballontekst"/>
+  <w:style w:type="character" w:customStyle="1" w:styleId="BalloonTextChar">
+    <w:name w:val="Balloon Text Char"/>
+    <w:basedOn w:val="DefaultParagraphFont"/>
+    <w:link w:val="BalloonText"/>
     <w:uiPriority w:val="99"/>
     <w:semiHidden/>
     <w:rsid w:val="00756DEF"/>
@@ -15665,10 +15617,10 @@
       <w:szCs w:val="16"/>
     </w:rPr>
   </w:style>
-  <w:style w:type="paragraph" w:styleId="Kopvaninhoudsopgave">
+  <w:style w:type="paragraph" w:styleId="TOCHeading">
     <w:name w:val="TOC Heading"/>
-    <w:basedOn w:val="Kop1"/>
-    <w:next w:val="Standaard"/>
+    <w:basedOn w:val="Heading1"/>
+    <w:next w:val="Normal"/>
     <w:uiPriority w:val="39"/>
     <w:unhideWhenUsed/>
     <w:qFormat/>
@@ -15688,10 +15640,10 @@
       <w:lang w:eastAsia="nl-NL"/>
     </w:rPr>
   </w:style>
-  <w:style w:type="paragraph" w:styleId="Inhopg1">
+  <w:style w:type="paragraph" w:styleId="TOC1">
     <w:name w:val="toc 1"/>
-    <w:basedOn w:val="Standaard"/>
-    <w:next w:val="Standaard"/>
+    <w:basedOn w:val="Normal"/>
+    <w:next w:val="Normal"/>
     <w:autoRedefine/>
     <w:uiPriority w:val="39"/>
     <w:unhideWhenUsed/>
@@ -15705,7 +15657,7 @@
   </w:style>
   <w:style w:type="character" w:styleId="Hyperlink">
     <w:name w:val="Hyperlink"/>
-    <w:basedOn w:val="Standaardalinea-lettertype"/>
+    <w:basedOn w:val="DefaultParagraphFont"/>
     <w:uiPriority w:val="99"/>
     <w:unhideWhenUsed/>
     <w:rsid w:val="00DD7202"/>
@@ -15714,11 +15666,11 @@
       <w:u w:val="single"/>
     </w:rPr>
   </w:style>
-  <w:style w:type="paragraph" w:styleId="Titel">
+  <w:style w:type="paragraph" w:styleId="Title">
     <w:name w:val="Title"/>
-    <w:basedOn w:val="Standaard"/>
-    <w:next w:val="Standaard"/>
-    <w:link w:val="TitelChar"/>
+    <w:basedOn w:val="Normal"/>
+    <w:next w:val="Normal"/>
+    <w:link w:val="TitleChar"/>
     <w:uiPriority w:val="10"/>
     <w:qFormat/>
     <w:rsid w:val="00DD7202"/>
@@ -15738,10 +15690,10 @@
       <w:szCs w:val="52"/>
     </w:rPr>
   </w:style>
-  <w:style w:type="character" w:customStyle="1" w:styleId="TitelChar">
-    <w:name w:val="Titel Char"/>
-    <w:basedOn w:val="Standaardalinea-lettertype"/>
-    <w:link w:val="Titel"/>
+  <w:style w:type="character" w:customStyle="1" w:styleId="TitleChar">
+    <w:name w:val="Title Char"/>
+    <w:basedOn w:val="DefaultParagraphFont"/>
+    <w:link w:val="Title"/>
     <w:uiPriority w:val="10"/>
     <w:rsid w:val="00DD7202"/>
     <w:rPr>
@@ -15753,11 +15705,11 @@
       <w:szCs w:val="52"/>
     </w:rPr>
   </w:style>
-  <w:style w:type="paragraph" w:styleId="Ondertitel">
+  <w:style w:type="paragraph" w:styleId="Subtitle">
     <w:name w:val="Subtitle"/>
-    <w:basedOn w:val="Standaard"/>
-    <w:next w:val="Standaard"/>
-    <w:link w:val="OndertitelChar"/>
+    <w:basedOn w:val="Normal"/>
+    <w:next w:val="Normal"/>
+    <w:link w:val="SubtitleChar"/>
     <w:uiPriority w:val="11"/>
     <w:qFormat/>
     <w:rsid w:val="00DD7202"/>
@@ -15776,10 +15728,10 @@
       <w:szCs w:val="24"/>
     </w:rPr>
   </w:style>
-  <w:style w:type="character" w:customStyle="1" w:styleId="OndertitelChar">
-    <w:name w:val="Ondertitel Char"/>
-    <w:basedOn w:val="Standaardalinea-lettertype"/>
-    <w:link w:val="Ondertitel"/>
+  <w:style w:type="character" w:customStyle="1" w:styleId="SubtitleChar">
+    <w:name w:val="Subtitle Char"/>
+    <w:basedOn w:val="DefaultParagraphFont"/>
+    <w:link w:val="Subtitle"/>
     <w:uiPriority w:val="11"/>
     <w:rsid w:val="00DD7202"/>
     <w:rPr>
@@ -15792,9 +15744,9 @@
       <w:szCs w:val="24"/>
     </w:rPr>
   </w:style>
-  <w:style w:type="character" w:styleId="Verwijzingopmerking">
+  <w:style w:type="character" w:styleId="CommentReference">
     <w:name w:val="annotation reference"/>
-    <w:basedOn w:val="Standaardalinea-lettertype"/>
+    <w:basedOn w:val="DefaultParagraphFont"/>
     <w:uiPriority w:val="99"/>
     <w:semiHidden/>
     <w:unhideWhenUsed/>
@@ -15804,10 +15756,10 @@
       <w:szCs w:val="18"/>
     </w:rPr>
   </w:style>
-  <w:style w:type="paragraph" w:styleId="Tekstopmerking">
+  <w:style w:type="paragraph" w:styleId="CommentText">
     <w:name w:val="annotation text"/>
-    <w:basedOn w:val="Standaard"/>
-    <w:link w:val="TekstopmerkingChar"/>
+    <w:basedOn w:val="Normal"/>
+    <w:link w:val="CommentTextChar"/>
     <w:uiPriority w:val="99"/>
     <w:semiHidden/>
     <w:unhideWhenUsed/>
@@ -15820,10 +15772,10 @@
       <w:szCs w:val="24"/>
     </w:rPr>
   </w:style>
-  <w:style w:type="character" w:customStyle="1" w:styleId="TekstopmerkingChar">
-    <w:name w:val="Tekst opmerking Char"/>
-    <w:basedOn w:val="Standaardalinea-lettertype"/>
-    <w:link w:val="Tekstopmerking"/>
+  <w:style w:type="character" w:customStyle="1" w:styleId="CommentTextChar">
+    <w:name w:val="Comment Text Char"/>
+    <w:basedOn w:val="DefaultParagraphFont"/>
+    <w:link w:val="CommentText"/>
     <w:uiPriority w:val="99"/>
     <w:semiHidden/>
     <w:rsid w:val="001F68CA"/>
@@ -15832,11 +15784,11 @@
       <w:szCs w:val="24"/>
     </w:rPr>
   </w:style>
-  <w:style w:type="paragraph" w:styleId="Onderwerpvanopmerking">
+  <w:style w:type="paragraph" w:styleId="CommentSubject">
     <w:name w:val="annotation subject"/>
-    <w:basedOn w:val="Tekstopmerking"/>
-    <w:next w:val="Tekstopmerking"/>
-    <w:link w:val="OnderwerpvanopmerkingChar"/>
+    <w:basedOn w:val="CommentText"/>
+    <w:next w:val="CommentText"/>
+    <w:link w:val="CommentSubjectChar"/>
     <w:uiPriority w:val="99"/>
     <w:semiHidden/>
     <w:unhideWhenUsed/>
@@ -15848,10 +15800,10 @@
       <w:szCs w:val="20"/>
     </w:rPr>
   </w:style>
-  <w:style w:type="character" w:customStyle="1" w:styleId="OnderwerpvanopmerkingChar">
-    <w:name w:val="Onderwerp van opmerking Char"/>
-    <w:basedOn w:val="TekstopmerkingChar"/>
-    <w:link w:val="Onderwerpvanopmerking"/>
+  <w:style w:type="character" w:customStyle="1" w:styleId="CommentSubjectChar">
+    <w:name w:val="Comment Subject Char"/>
+    <w:basedOn w:val="CommentTextChar"/>
+    <w:link w:val="CommentSubject"/>
     <w:uiPriority w:val="99"/>
     <w:semiHidden/>
     <w:rsid w:val="001F68CA"/>
@@ -15864,12 +15816,12 @@
   </w:style>
   <w:style w:type="character" w:customStyle="1" w:styleId="lewnzc">
     <w:name w:val="lewnzc"/>
-    <w:basedOn w:val="Standaardalinea-lettertype"/>
+    <w:basedOn w:val="DefaultParagraphFont"/>
     <w:rsid w:val="003A1469"/>
   </w:style>
-  <w:style w:type="character" w:styleId="Nadruk">
+  <w:style w:type="character" w:styleId="Emphasis">
     <w:name w:val="Emphasis"/>
-    <w:basedOn w:val="Standaardalinea-lettertype"/>
+    <w:basedOn w:val="DefaultParagraphFont"/>
     <w:uiPriority w:val="20"/>
     <w:qFormat/>
     <w:rsid w:val="003A1469"/>
@@ -15880,10 +15832,10 @@
   </w:style>
   <w:style w:type="character" w:customStyle="1" w:styleId="tlssbb">
     <w:name w:val="tlssbb"/>
-    <w:basedOn w:val="Standaardalinea-lettertype"/>
+    <w:basedOn w:val="DefaultParagraphFont"/>
     <w:rsid w:val="00B2286A"/>
   </w:style>
-  <w:style w:type="paragraph" w:styleId="Geenafstand">
+  <w:style w:type="paragraph" w:styleId="NoSpacing">
     <w:name w:val="No Spacing"/>
     <w:uiPriority w:val="1"/>
     <w:qFormat/>
@@ -15892,10 +15844,10 @@
       <w:spacing w:after="0" w:line="240" w:lineRule="auto"/>
     </w:pPr>
   </w:style>
-  <w:style w:type="character" w:customStyle="1" w:styleId="Kop6Char">
-    <w:name w:val="Kop 6 Char"/>
-    <w:basedOn w:val="Standaardalinea-lettertype"/>
-    <w:link w:val="Kop6"/>
+  <w:style w:type="character" w:customStyle="1" w:styleId="Heading6Char">
+    <w:name w:val="Heading 6 Char"/>
+    <w:basedOn w:val="DefaultParagraphFont"/>
+    <w:link w:val="Heading6"/>
     <w:uiPriority w:val="9"/>
     <w:semiHidden/>
     <w:rsid w:val="00710649"/>
@@ -15904,10 +15856,10 @@
       <w:color w:val="1F4D78" w:themeColor="accent1" w:themeShade="7F"/>
     </w:rPr>
   </w:style>
-  <w:style w:type="paragraph" w:styleId="Inhopg3">
+  <w:style w:type="paragraph" w:styleId="TOC3">
     <w:name w:val="toc 3"/>
-    <w:basedOn w:val="Standaard"/>
-    <w:next w:val="Standaard"/>
+    <w:basedOn w:val="Normal"/>
+    <w:next w:val="Normal"/>
     <w:autoRedefine/>
     <w:uiPriority w:val="39"/>
     <w:unhideWhenUsed/>
@@ -15917,10 +15869,10 @@
       <w:ind w:left="440"/>
     </w:pPr>
   </w:style>
-  <w:style w:type="paragraph" w:styleId="Inhopg2">
+  <w:style w:type="paragraph" w:styleId="TOC2">
     <w:name w:val="toc 2"/>
-    <w:basedOn w:val="Standaard"/>
-    <w:next w:val="Standaard"/>
+    <w:basedOn w:val="Normal"/>
+    <w:next w:val="Normal"/>
     <w:autoRedefine/>
     <w:uiPriority w:val="39"/>
     <w:unhideWhenUsed/>
@@ -16195,30 +16147,6 @@
 </file>
 
 <file path=customXml/item1.xml><?xml version="1.0" encoding="utf-8"?>
-<p:properties xmlns:p="http://schemas.microsoft.com/office/2006/metadata/properties" xmlns:xsi="http://www.w3.org/2001/XMLSchema-instance" xmlns:pc="http://schemas.microsoft.com/office/infopath/2007/PartnerControls">
-  <documentManagement>
-    <TaxCatchAll xmlns="32dd6115-ce5d-46b4-b638-9e7d5ca6cbee" xsi:nil="true"/>
-    <lcf76f155ced4ddcb4097134ff3c332f xmlns="094ecc41-7a37-40c9-8390-f18431712098">
-      <Terms xmlns="http://schemas.microsoft.com/office/infopath/2007/PartnerControls"/>
-    </lcf76f155ced4ddcb4097134ff3c332f>
-  </documentManagement>
-</p:properties>
-</file>
-
-<file path=customXml/item2.xml><?xml version="1.0" encoding="utf-8"?>
-<b:Sources xmlns:b="http://schemas.openxmlformats.org/officeDocument/2006/bibliography" xmlns="http://schemas.openxmlformats.org/officeDocument/2006/bibliography" SelectedStyle="\APASixthEditionOfficeOnline.xsl" StyleName="APA" Version="6"/>
-</file>
-
-<file path=customXml/item3.xml><?xml version="1.0" encoding="utf-8"?>
-<?mso-contentType ?>
-<FormTemplates xmlns="http://schemas.microsoft.com/sharepoint/v3/contenttype/forms">
-  <Display>DocumentLibraryForm</Display>
-  <Edit>DocumentLibraryForm</Edit>
-  <New>DocumentLibraryForm</New>
-</FormTemplates>
-</file>
-
-<file path=customXml/item4.xml><?xml version="1.0" encoding="utf-8"?>
 <ct:contentTypeSchema xmlns:ct="http://schemas.microsoft.com/office/2006/metadata/contentType" xmlns:ma="http://schemas.microsoft.com/office/2006/metadata/properties/metaAttributes" ct:_="" ma:_="" ma:contentTypeName="Document" ma:contentTypeID="0x010100D5188FA4F7421B4A93E65E307A769E27" ma:contentTypeVersion="15" ma:contentTypeDescription="Een nieuw document maken." ma:contentTypeScope="" ma:versionID="9bfd002f47f5f7e7b2724518f3fad1a5">
   <xsd:schema xmlns:xsd="http://www.w3.org/2001/XMLSchema" xmlns:xs="http://www.w3.org/2001/XMLSchema" xmlns:p="http://schemas.microsoft.com/office/2006/metadata/properties" xmlns:ns2="094ecc41-7a37-40c9-8390-f18431712098" xmlns:ns3="32dd6115-ce5d-46b4-b638-9e7d5ca6cbee" targetNamespace="http://schemas.microsoft.com/office/2006/metadata/properties" ma:root="true" ma:fieldsID="e2c1118370456e9a6d2939e9bd0f2e89" ns2:_="" ns3:_="">
     <xsd:import namespace="094ecc41-7a37-40c9-8390-f18431712098"/>
@@ -16453,34 +16381,31 @@
 </ct:contentTypeSchema>
 </file>
 
-<file path=customXml/itemProps1.xml><?xml version="1.0" encoding="utf-8"?>
-<ds:datastoreItem xmlns:ds="http://schemas.openxmlformats.org/officeDocument/2006/customXml" ds:itemID="{846B1C81-E993-40E7-BCC5-DA63F0CD945C}">
-  <ds:schemaRefs>
-    <ds:schemaRef ds:uri="http://schemas.microsoft.com/office/2006/metadata/properties"/>
-    <ds:schemaRef ds:uri="http://schemas.microsoft.com/office/infopath/2007/PartnerControls"/>
-    <ds:schemaRef ds:uri="32dd6115-ce5d-46b4-b638-9e7d5ca6cbee"/>
-    <ds:schemaRef ds:uri="094ecc41-7a37-40c9-8390-f18431712098"/>
-  </ds:schemaRefs>
-</ds:datastoreItem>
+<file path=customXml/item2.xml><?xml version="1.0" encoding="utf-8"?>
+<?mso-contentType ?>
+<FormTemplates xmlns="http://schemas.microsoft.com/sharepoint/v3/contenttype/forms">
+  <Display>DocumentLibraryForm</Display>
+  <Edit>DocumentLibraryForm</Edit>
+  <New>DocumentLibraryForm</New>
+</FormTemplates>
 </file>
 
-<file path=customXml/itemProps2.xml><?xml version="1.0" encoding="utf-8"?>
-<ds:datastoreItem xmlns:ds="http://schemas.openxmlformats.org/officeDocument/2006/customXml" ds:itemID="{72B7D650-2FAA-4D72-B587-235E59E6AC26}">
-  <ds:schemaRefs>
-    <ds:schemaRef ds:uri="http://schemas.openxmlformats.org/officeDocument/2006/bibliography"/>
-  </ds:schemaRefs>
-</ds:datastoreItem>
+<file path=customXml/item3.xml><?xml version="1.0" encoding="utf-8"?>
+<b:Sources xmlns:b="http://schemas.openxmlformats.org/officeDocument/2006/bibliography" xmlns="http://schemas.openxmlformats.org/officeDocument/2006/bibliography" SelectedStyle="\APASixthEditionOfficeOnline.xsl" StyleName="APA" Version="6"/>
 </file>
 
-<file path=customXml/itemProps3.xml><?xml version="1.0" encoding="utf-8"?>
-<ds:datastoreItem xmlns:ds="http://schemas.openxmlformats.org/officeDocument/2006/customXml" ds:itemID="{C6916C6B-E06E-47CD-A094-BBBE44C5EA8C}">
-  <ds:schemaRefs>
-    <ds:schemaRef ds:uri="http://schemas.microsoft.com/sharepoint/v3/contenttype/forms"/>
-  </ds:schemaRefs>
-</ds:datastoreItem>
+<file path=customXml/item4.xml><?xml version="1.0" encoding="utf-8"?>
+<p:properties xmlns:p="http://schemas.microsoft.com/office/2006/metadata/properties" xmlns:xsi="http://www.w3.org/2001/XMLSchema-instance" xmlns:pc="http://schemas.microsoft.com/office/infopath/2007/PartnerControls">
+  <documentManagement>
+    <TaxCatchAll xmlns="32dd6115-ce5d-46b4-b638-9e7d5ca6cbee" xsi:nil="true"/>
+    <lcf76f155ced4ddcb4097134ff3c332f xmlns="094ecc41-7a37-40c9-8390-f18431712098">
+      <Terms xmlns="http://schemas.microsoft.com/office/infopath/2007/PartnerControls"/>
+    </lcf76f155ced4ddcb4097134ff3c332f>
+  </documentManagement>
+</p:properties>
 </file>
 
-<file path=customXml/itemProps4.xml><?xml version="1.0" encoding="utf-8"?>
+<file path=customXml/itemProps1.xml><?xml version="1.0" encoding="utf-8"?>
 <ds:datastoreItem xmlns:ds="http://schemas.openxmlformats.org/officeDocument/2006/customXml" ds:itemID="{6D953465-DEAC-453F-952B-2BF171A6BD1D}">
   <ds:schemaRefs>
     <ds:schemaRef ds:uri="http://schemas.microsoft.com/office/2006/metadata/contentType"/>
@@ -16497,4 +16422,31 @@
     <ds:schemaRef ds:uri="http://schemas.microsoft.com/internal/obd"/>
   </ds:schemaRefs>
 </ds:datastoreItem>
+</file>
+
+<file path=customXml/itemProps2.xml><?xml version="1.0" encoding="utf-8"?>
+<ds:datastoreItem xmlns:ds="http://schemas.openxmlformats.org/officeDocument/2006/customXml" ds:itemID="{C6916C6B-E06E-47CD-A094-BBBE44C5EA8C}">
+  <ds:schemaRefs>
+    <ds:schemaRef ds:uri="http://schemas.microsoft.com/sharepoint/v3/contenttype/forms"/>
+  </ds:schemaRefs>
+</ds:datastoreItem>
+</file>
+
+<file path=customXml/itemProps3.xml><?xml version="1.0" encoding="utf-8"?>
+<ds:datastoreItem xmlns:ds="http://schemas.openxmlformats.org/officeDocument/2006/customXml" ds:itemID="{72B7D650-2FAA-4D72-B587-235E59E6AC26}">
+  <ds:schemaRefs>
+    <ds:schemaRef ds:uri="http://schemas.openxmlformats.org/officeDocument/2006/bibliography"/>
+  </ds:schemaRefs>
+</ds:datastoreItem>
+</file>
+
+<file path=customXml/itemProps4.xml><?xml version="1.0" encoding="utf-8"?>
+<ds:datastoreItem xmlns:ds="http://schemas.openxmlformats.org/officeDocument/2006/customXml" ds:itemID="{846B1C81-E993-40E7-BCC5-DA63F0CD945C}">
+  <ds:schemaRefs>
+    <ds:schemaRef ds:uri="http://schemas.microsoft.com/office/2006/metadata/properties"/>
+    <ds:schemaRef ds:uri="http://schemas.microsoft.com/office/infopath/2007/PartnerControls"/>
+    <ds:schemaRef ds:uri="32dd6115-ce5d-46b4-b638-9e7d5ca6cbee"/>
+    <ds:schemaRef ds:uri="094ecc41-7a37-40c9-8390-f18431712098"/>
+  </ds:schemaRefs>
+</ds:datastoreItem>
 </file>
</xml_diff>